<commit_message>
Add Results, Discussion, and Conclusion sections to final paper
Co-Authored-By: Claude Sonnet 4.6 <noreply@anthropic.com>
</commit_message>
<xml_diff>
--- a/Ed_Tech_Project_Paper_bjagadish3.docx
+++ b/Ed_Tech_Project_Paper_bjagadish3.docx
@@ -1783,39 +1783,7 @@
           <w14:numForm w14:val="lining"/>
           <w14:numSpacing w14:val="tabular"/>
         </w:rPr>
-        <w:t>4</w:t>
-      </w:r>
-      <w:r>
-        <w:rPr>
-          <w:rFonts w:ascii="Palatino Linotype" w:hAnsi="Palatino Linotype" w:cs="Times New Roman (Headings CS)"/>
-          <w:b/>
-          <w:caps/>
-          <w:color w:val="auto"/>
-          <w:spacing w:val="13"/>
-          <w:kern w:val="16"/>
-          <w:sz w:val="22"/>
-          <w:szCs w:val="48"/>
-          <w:lang w:eastAsia="en-US"/>
-          <w14:numForm w14:val="lining"/>
-          <w14:numSpacing w14:val="tabular"/>
-        </w:rPr>
-        <w:t xml:space="preserve"> </w:t>
-      </w:r>
-      <w:r>
-        <w:rPr>
-          <w:rFonts w:ascii="Palatino Linotype" w:hAnsi="Palatino Linotype" w:cs="Times New Roman (Headings CS)"/>
-          <w:b/>
-          <w:caps/>
-          <w:color w:val="auto"/>
-          <w:spacing w:val="13"/>
-          <w:kern w:val="16"/>
-          <w:sz w:val="22"/>
-          <w:szCs w:val="48"/>
-          <w:lang w:eastAsia="en-US"/>
-          <w14:numForm w14:val="lining"/>
-          <w14:numSpacing w14:val="tabular"/>
-        </w:rPr>
-        <w:t>EVALUATION METHODOLOGY</w:t>
+        <w:t>4 EVALUATION METHODOLOGY</w:t>
       </w:r>
     </w:p>
     <w:p>
@@ -1853,37 +1821,7 @@
           <w14:numForm w14:val="oldStyle"/>
           <w14:numSpacing w14:val="proportional"/>
         </w:rPr>
-        <w:t>4</w:t>
-      </w:r>
-      <w:r>
-        <w:rPr>
-          <w:rFonts w:ascii="Palatino Linotype" w:hAnsi="Palatino Linotype" w:cs="Times New Roman (Headings CS)"/>
-          <w:b/>
-          <w:color w:val="000000"/>
-          <w:spacing w:val="2"/>
-          <w:kern w:val="16"/>
-          <w:sz w:val="22"/>
-          <w:szCs w:val="22"/>
-          <w:lang w:eastAsia="en-US"/>
-          <w14:numForm w14:val="oldStyle"/>
-          <w14:numSpacing w14:val="proportional"/>
-        </w:rPr>
-        <w:t xml:space="preserve">.1 </w:t>
-      </w:r>
-      <w:r>
-        <w:rPr>
-          <w:rFonts w:ascii="Palatino Linotype" w:hAnsi="Palatino Linotype" w:cs="Times New Roman (Headings CS)"/>
-          <w:b/>
-          <w:color w:val="000000"/>
-          <w:spacing w:val="2"/>
-          <w:kern w:val="16"/>
-          <w:sz w:val="22"/>
-          <w:szCs w:val="22"/>
-          <w:lang w:eastAsia="en-US"/>
-          <w14:numForm w14:val="oldStyle"/>
-          <w14:numSpacing w14:val="proportional"/>
-        </w:rPr>
-        <w:t>Study Design and Participants</w:t>
+        <w:t>4.1 Study Design and Participants</w:t>
       </w:r>
     </w:p>
     <w:p>
@@ -2078,52 +2016,7 @@
           <w14:numSpacing w14:val="proportional"/>
         </w:rPr>
         <w:lastRenderedPageBreak/>
-        <w:t>4.</w:t>
-      </w:r>
-      <w:r>
-        <w:rPr>
-          <w:rFonts w:ascii="Palatino Linotype" w:hAnsi="Palatino Linotype" w:cs="Times New Roman (Headings CS)"/>
-          <w:b/>
-          <w:color w:val="000000"/>
-          <w:spacing w:val="2"/>
-          <w:kern w:val="16"/>
-          <w:sz w:val="22"/>
-          <w:szCs w:val="22"/>
-          <w:lang w:eastAsia="en-US"/>
-          <w14:numForm w14:val="oldStyle"/>
-          <w14:numSpacing w14:val="proportional"/>
-        </w:rPr>
-        <w:t>2</w:t>
-      </w:r>
-      <w:r>
-        <w:rPr>
-          <w:rFonts w:ascii="Palatino Linotype" w:hAnsi="Palatino Linotype" w:cs="Times New Roman (Headings CS)"/>
-          <w:b/>
-          <w:color w:val="000000"/>
-          <w:spacing w:val="2"/>
-          <w:kern w:val="16"/>
-          <w:sz w:val="22"/>
-          <w:szCs w:val="22"/>
-          <w:lang w:eastAsia="en-US"/>
-          <w14:numForm w14:val="oldStyle"/>
-          <w14:numSpacing w14:val="proportional"/>
-        </w:rPr>
-        <w:t xml:space="preserve"> </w:t>
-      </w:r>
-      <w:r>
-        <w:rPr>
-          <w:rFonts w:ascii="Palatino Linotype" w:hAnsi="Palatino Linotype" w:cs="Times New Roman (Headings CS)"/>
-          <w:b/>
-          <w:color w:val="000000"/>
-          <w:spacing w:val="2"/>
-          <w:kern w:val="16"/>
-          <w:sz w:val="22"/>
-          <w:szCs w:val="22"/>
-          <w:lang w:eastAsia="en-US"/>
-          <w14:numForm w14:val="oldStyle"/>
-          <w14:numSpacing w14:val="proportional"/>
-        </w:rPr>
-        <w:t>Instruments</w:t>
+        <w:t>4.2 Instruments</w:t>
       </w:r>
     </w:p>
     <w:p>
@@ -2152,20 +2045,7 @@
           <w14:numForm w14:val="oldStyle"/>
           <w14:numSpacing w14:val="proportional"/>
         </w:rPr>
-        <w:t>T</w:t>
-      </w:r>
-      <w:r>
-        <w:rPr>
-          <w:rFonts w:ascii="Palatino Linotype" w:eastAsia="Times New Roman" w:hAnsi="Palatino Linotype" w:cs="Times New Roman"/>
-          <w:spacing w:val="2"/>
-          <w:kern w:val="16"/>
-          <w:sz w:val="22"/>
-          <w:szCs w:val="22"/>
-          <w:lang w:eastAsia="en-US"/>
-          <w14:numForm w14:val="oldStyle"/>
-          <w14:numSpacing w14:val="proportional"/>
-        </w:rPr>
-        <w:t xml:space="preserve">one perception was assessed using a two-form matched test delivered through the companion web application. Form A served as the pre-test and Form B as the post-test. </w:t>
+        <w:t xml:space="preserve">Tone perception was assessed using a two-form matched test delivered through the companion web application. Form A served as the pre-test and Form B as the post-test. </w:t>
       </w:r>
       <w:r>
         <w:rPr>
@@ -2273,12 +2153,168 @@
           <w14:numForm w14:val="oldStyle"/>
           <w14:numSpacing w14:val="proportional"/>
         </w:rPr>
-        <w:t>4.</w:t>
-      </w:r>
-      <w:r>
+        <w:t>4.3 Procedure and Analysis</w:t>
+      </w:r>
+    </w:p>
+    <w:p>
+      <w:pPr>
+        <w:spacing w:after="170" w:line="340" w:lineRule="exact"/>
+        <w:jc w:val="both"/>
+        <w:rPr>
+          <w:rFonts w:ascii="Palatino Linotype" w:eastAsia="Times New Roman" w:hAnsi="Palatino Linotype" w:cs="Times New Roman"/>
+          <w:spacing w:val="2"/>
+          <w:kern w:val="16"/>
+          <w:sz w:val="22"/>
+          <w:szCs w:val="22"/>
+          <w:lang w:eastAsia="en-US"/>
+          <w14:numForm w14:val="oldStyle"/>
+          <w14:numSpacing w14:val="proportional"/>
+        </w:rPr>
+      </w:pPr>
+      <w:r>
+        <w:rPr>
+          <w:rFonts w:ascii="Palatino Linotype" w:eastAsia="Times New Roman" w:hAnsi="Palatino Linotype" w:cs="Times New Roman"/>
+          <w:spacing w:val="2"/>
+          <w:kern w:val="16"/>
+          <w:sz w:val="22"/>
+          <w:szCs w:val="22"/>
+          <w:lang w:eastAsia="en-US"/>
+          <w14:numForm w14:val="oldStyle"/>
+          <w14:numSpacing w14:val="proportional"/>
+        </w:rPr>
+        <w:t>Participants were first directed to Form A and asked to complete it without prior use of the practice application. They then used the Mandarin Tone Coach app for a minimum of five to ten minutes, exploring both monosyllabic and disyllabic practice modes at their own pace. Following practice, participants completed Form B using the identifier from Form A and then completed the TAM survey.</w:t>
+      </w:r>
+    </w:p>
+    <w:p>
+      <w:pPr>
+        <w:spacing w:after="170" w:line="340" w:lineRule="exact"/>
+        <w:jc w:val="both"/>
+        <w:rPr>
+          <w:rFonts w:ascii="Palatino Linotype" w:eastAsia="Times New Roman" w:hAnsi="Palatino Linotype" w:cs="Times New Roman"/>
+          <w:spacing w:val="2"/>
+          <w:kern w:val="16"/>
+          <w:sz w:val="22"/>
+          <w:szCs w:val="22"/>
+          <w:lang w:eastAsia="en-US"/>
+          <w14:numForm w14:val="oldStyle"/>
+          <w14:numSpacing w14:val="proportional"/>
+        </w:rPr>
+      </w:pPr>
+      <w:r>
+        <w:rPr>
+          <w:rFonts w:ascii="Palatino Linotype" w:eastAsia="Times New Roman" w:hAnsi="Palatino Linotype" w:cs="Times New Roman"/>
+          <w:spacing w:val="2"/>
+          <w:kern w:val="16"/>
+          <w:sz w:val="22"/>
+          <w:szCs w:val="22"/>
+          <w:lang w:eastAsia="en-US"/>
+          <w14:numForm w14:val="oldStyle"/>
+          <w14:numSpacing w14:val="proportional"/>
+        </w:rPr>
+        <w:t>Tone perception accuracy was computed as the proportion of correctly identified tones per form. Statistical comparison of pre- and post-test scores across the 13 paired participants used two complementary tests: a Wilcoxon signed-rank test, preferred for its robustness with small samples, and a paired t-test reported for reference. Per-tone accuracy was disaggregated across T1-T4 to identify tone-specific patterns. TAM results were summarized with item-level means and standard deviation.</w:t>
+      </w:r>
+    </w:p>
+    <w:p>
+      <w:pPr>
+        <w:spacing w:after="170" w:line="340" w:lineRule="exact"/>
+        <w:jc w:val="both"/>
+        <w:rPr>
+          <w:rFonts w:ascii="Palatino Linotype" w:eastAsia="Times New Roman" w:hAnsi="Palatino Linotype" w:cs="Times New Roman"/>
+          <w:spacing w:val="2"/>
+          <w:kern w:val="16"/>
+          <w:sz w:val="22"/>
+          <w:szCs w:val="22"/>
+          <w:lang w:eastAsia="en-US"/>
+          <w14:numForm w14:val="oldStyle"/>
+          <w14:numSpacing w14:val="proportional"/>
+        </w:rPr>
+      </w:pPr>
+    </w:p>
+    <w:p>
+      <w:pPr>
+        <w:pStyle w:val="Heading1"/>
+        <w:tabs>
+          <w:tab w:val="num" w:pos="202"/>
+        </w:tabs>
+        <w:suppressAutoHyphens/>
+        <w:spacing w:before="220" w:after="170" w:line="340" w:lineRule="exact"/>
+        <w:jc w:val="both"/>
         <w:rPr>
           <w:rFonts w:ascii="Palatino Linotype" w:hAnsi="Palatino Linotype" w:cs="Times New Roman (Headings CS)"/>
           <w:b/>
+          <w:caps/>
+          <w:color w:val="auto"/>
+          <w:spacing w:val="13"/>
+          <w:kern w:val="16"/>
+          <w:sz w:val="22"/>
+          <w:szCs w:val="48"/>
+          <w:lang w:eastAsia="en-US"/>
+          <w14:numForm w14:val="lining"/>
+          <w14:numSpacing w14:val="tabular"/>
+        </w:rPr>
+      </w:pPr>
+      <w:r>
+        <w:rPr>
+          <w:rFonts w:ascii="Palatino Linotype" w:hAnsi="Palatino Linotype" w:cs="Times New Roman (Headings CS)"/>
+          <w:b/>
+          <w:caps/>
+          <w:color w:val="auto"/>
+          <w:spacing w:val="13"/>
+          <w:kern w:val="16"/>
+          <w:sz w:val="22"/>
+          <w:szCs w:val="48"/>
+          <w:lang w:eastAsia="en-US"/>
+          <w14:numForm w14:val="lining"/>
+          <w14:numSpacing w14:val="tabular"/>
+        </w:rPr>
+        <w:lastRenderedPageBreak/>
+        <w:t>5</w:t>
+      </w:r>
+      <w:r>
+        <w:rPr>
+          <w:rFonts w:ascii="Palatino Linotype" w:hAnsi="Palatino Linotype" w:cs="Times New Roman (Headings CS)"/>
+          <w:b/>
+          <w:caps/>
+          <w:color w:val="auto"/>
+          <w:spacing w:val="13"/>
+          <w:kern w:val="16"/>
+          <w:sz w:val="22"/>
+          <w:szCs w:val="48"/>
+          <w:lang w:eastAsia="en-US"/>
+          <w14:numForm w14:val="lining"/>
+          <w14:numSpacing w14:val="tabular"/>
+        </w:rPr>
+        <w:t xml:space="preserve"> </w:t>
+      </w:r>
+      <w:r>
+        <w:rPr>
+          <w:rFonts w:ascii="Palatino Linotype" w:hAnsi="Palatino Linotype" w:cs="Times New Roman (Headings CS)"/>
+          <w:b/>
+          <w:caps/>
+          <w:color w:val="auto"/>
+          <w:spacing w:val="13"/>
+          <w:kern w:val="16"/>
+          <w:sz w:val="22"/>
+          <w:szCs w:val="48"/>
+          <w:lang w:eastAsia="en-US"/>
+          <w14:numForm w14:val="lining"/>
+          <w14:numSpacing w14:val="tabular"/>
+        </w:rPr>
+        <w:t>RESULTS</w:t>
+      </w:r>
+    </w:p>
+    <w:p>
+      <w:pPr>
+        <w:pStyle w:val="Heading2"/>
+        <w:tabs>
+          <w:tab w:val="num" w:pos="360"/>
+        </w:tabs>
+        <w:suppressAutoHyphens/>
+        <w:spacing w:before="170" w:after="170" w:line="340" w:lineRule="exact"/>
+        <w:jc w:val="both"/>
+        <w:rPr>
+          <w:rFonts w:ascii="Palatino Linotype" w:hAnsi="Palatino Linotype" w:cs="Times New Roman (Headings CS)"/>
+          <w:b/>
           <w:color w:val="000000"/>
           <w:spacing w:val="2"/>
           <w:kern w:val="16"/>
@@ -2288,6 +2324,397 @@
           <w14:numForm w14:val="oldStyle"/>
           <w14:numSpacing w14:val="proportional"/>
         </w:rPr>
+      </w:pPr>
+      <w:r>
+        <w:rPr>
+          <w:rFonts w:ascii="Palatino Linotype" w:hAnsi="Palatino Linotype" w:cs="Times New Roman (Headings CS)"/>
+          <w:b/>
+          <w:color w:val="000000"/>
+          <w:spacing w:val="2"/>
+          <w:kern w:val="16"/>
+          <w:sz w:val="22"/>
+          <w:szCs w:val="22"/>
+          <w:lang w:eastAsia="en-US"/>
+          <w14:numForm w14:val="oldStyle"/>
+          <w14:numSpacing w14:val="proportional"/>
+        </w:rPr>
+        <w:t>5</w:t>
+      </w:r>
+      <w:r>
+        <w:rPr>
+          <w:rFonts w:ascii="Palatino Linotype" w:hAnsi="Palatino Linotype" w:cs="Times New Roman (Headings CS)"/>
+          <w:b/>
+          <w:color w:val="000000"/>
+          <w:spacing w:val="2"/>
+          <w:kern w:val="16"/>
+          <w:sz w:val="22"/>
+          <w:szCs w:val="22"/>
+          <w:lang w:eastAsia="en-US"/>
+          <w14:numForm w14:val="oldStyle"/>
+          <w14:numSpacing w14:val="proportional"/>
+        </w:rPr>
+        <w:t xml:space="preserve">.1 </w:t>
+      </w:r>
+      <w:r>
+        <w:rPr>
+          <w:rFonts w:ascii="Palatino Linotype" w:hAnsi="Palatino Linotype" w:cs="Times New Roman (Headings CS)"/>
+          <w:b/>
+          <w:color w:val="000000"/>
+          <w:spacing w:val="2"/>
+          <w:kern w:val="16"/>
+          <w:sz w:val="22"/>
+          <w:szCs w:val="22"/>
+          <w:lang w:eastAsia="en-US"/>
+          <w14:numForm w14:val="oldStyle"/>
+          <w14:numSpacing w14:val="proportional"/>
+        </w:rPr>
+        <w:t>Perception Test: Pre/Post Accuracy</w:t>
+      </w:r>
+    </w:p>
+    <w:p>
+      <w:pPr>
+        <w:spacing w:after="170" w:line="340" w:lineRule="exact"/>
+        <w:jc w:val="both"/>
+        <w:rPr>
+          <w:rFonts w:ascii="Palatino Linotype" w:eastAsia="Times New Roman" w:hAnsi="Palatino Linotype" w:cs="Times New Roman"/>
+          <w:spacing w:val="2"/>
+          <w:kern w:val="16"/>
+          <w:sz w:val="22"/>
+          <w:szCs w:val="22"/>
+          <w:lang w:eastAsia="en-US"/>
+          <w14:numForm w14:val="oldStyle"/>
+          <w14:numSpacing w14:val="proportional"/>
+        </w:rPr>
+      </w:pPr>
+      <w:r>
+        <w:rPr>
+          <w:rFonts w:ascii="Palatino Linotype" w:eastAsia="Times New Roman" w:hAnsi="Palatino Linotype" w:cs="Times New Roman"/>
+          <w:spacing w:val="2"/>
+          <w:kern w:val="16"/>
+          <w:sz w:val="22"/>
+          <w:szCs w:val="22"/>
+          <w:lang w:eastAsia="en-US"/>
+          <w14:numForm w14:val="oldStyle"/>
+          <w14:numSpacing w14:val="proportional"/>
+        </w:rPr>
+        <w:t>Of 19 participants who submitted perception test responses, 13 completed both Form A (pre-test)</w:t>
+      </w:r>
+      <w:r>
+        <w:rPr>
+          <w:rFonts w:ascii="Palatino Linotype" w:eastAsia="Times New Roman" w:hAnsi="Palatino Linotype" w:cs="Times New Roman"/>
+          <w:spacing w:val="2"/>
+          <w:kern w:val="16"/>
+          <w:sz w:val="22"/>
+          <w:szCs w:val="22"/>
+          <w:lang w:eastAsia="en-US"/>
+          <w14:numForm w14:val="oldStyle"/>
+          <w14:numSpacing w14:val="proportional"/>
+        </w:rPr>
+        <w:t xml:space="preserve"> and Form B (post-test) and were included in the paired analysis. Mean pre-test accuracy was 53.8% (SD = 24.4%) and mean post-test accuracy was 64.1% (SD = 29.5%), a mean improvement of 10.3% following a single practice session. 10 of 13 participants maintained or improved their accuracy; 2 showed declines of 16.7% each.</w:t>
+      </w:r>
+    </w:p>
+    <w:p>
+      <w:pPr>
+        <w:spacing w:after="170" w:line="340" w:lineRule="exact"/>
+        <w:jc w:val="both"/>
+        <w:rPr>
+          <w:rFonts w:ascii="Palatino Linotype" w:eastAsia="Times New Roman" w:hAnsi="Palatino Linotype" w:cs="Times New Roman"/>
+          <w:spacing w:val="2"/>
+          <w:kern w:val="16"/>
+          <w:sz w:val="22"/>
+          <w:szCs w:val="22"/>
+          <w:lang w:eastAsia="en-US"/>
+          <w14:numForm w14:val="oldStyle"/>
+          <w14:numSpacing w14:val="proportional"/>
+        </w:rPr>
+      </w:pPr>
+      <w:r>
+        <w:rPr>
+          <w:rFonts w:ascii="Palatino Linotype" w:eastAsia="Times New Roman" w:hAnsi="Palatino Linotype" w:cs="Times New Roman"/>
+          <w:spacing w:val="2"/>
+          <w:kern w:val="16"/>
+          <w:sz w:val="22"/>
+          <w:szCs w:val="22"/>
+          <w:lang w:eastAsia="en-US"/>
+          <w14:numForm w14:val="oldStyle"/>
+          <w14:numSpacing w14:val="proportional"/>
+        </w:rPr>
+        <w:t>A Wilcoxon signed-rank test did not yield a statistically significant difference (W = 13.5, p = 0.087); a paired-samples t-test similarly fell short of conventional significance (</w:t>
+      </w:r>
+      <w:proofErr w:type="gramStart"/>
+      <w:r>
+        <w:rPr>
+          <w:rFonts w:ascii="Palatino Linotype" w:eastAsia="Times New Roman" w:hAnsi="Palatino Linotype" w:cs="Times New Roman"/>
+          <w:spacing w:val="2"/>
+          <w:kern w:val="16"/>
+          <w:sz w:val="22"/>
+          <w:szCs w:val="22"/>
+          <w:lang w:eastAsia="en-US"/>
+          <w14:numForm w14:val="oldStyle"/>
+          <w14:numSpacing w14:val="proportional"/>
+        </w:rPr>
+        <w:t>t(</w:t>
+      </w:r>
+      <w:proofErr w:type="gramEnd"/>
+      <w:r>
+        <w:rPr>
+          <w:rFonts w:ascii="Palatino Linotype" w:eastAsia="Times New Roman" w:hAnsi="Palatino Linotype" w:cs="Times New Roman"/>
+          <w:spacing w:val="2"/>
+          <w:kern w:val="16"/>
+          <w:sz w:val="22"/>
+          <w:szCs w:val="22"/>
+          <w:lang w:eastAsia="en-US"/>
+          <w14:numForm w14:val="oldStyle"/>
+          <w14:numSpacing w14:val="proportional"/>
+        </w:rPr>
+        <w:t>12) = -2.17, p = 0.051). These results indicate a positive trend in tone perception in tone perception accuracy that the sample size of 13 was insufficient to confirm statistically.</w:t>
+      </w:r>
+    </w:p>
+    <w:p>
+      <w:pPr>
+        <w:pStyle w:val="Heading2"/>
+        <w:tabs>
+          <w:tab w:val="num" w:pos="360"/>
+        </w:tabs>
+        <w:suppressAutoHyphens/>
+        <w:spacing w:before="170" w:after="170" w:line="340" w:lineRule="exact"/>
+        <w:jc w:val="both"/>
+        <w:rPr>
+          <w:rFonts w:ascii="Palatino Linotype" w:hAnsi="Palatino Linotype" w:cs="Times New Roman (Headings CS)"/>
+          <w:b/>
+          <w:color w:val="000000"/>
+          <w:spacing w:val="2"/>
+          <w:kern w:val="16"/>
+          <w:sz w:val="22"/>
+          <w:szCs w:val="22"/>
+          <w:lang w:eastAsia="en-US"/>
+          <w14:numForm w14:val="oldStyle"/>
+          <w14:numSpacing w14:val="proportional"/>
+        </w:rPr>
+      </w:pPr>
+      <w:r>
+        <w:rPr>
+          <w:rFonts w:ascii="Palatino Linotype" w:hAnsi="Palatino Linotype" w:cs="Times New Roman (Headings CS)"/>
+          <w:b/>
+          <w:color w:val="000000"/>
+          <w:spacing w:val="2"/>
+          <w:kern w:val="16"/>
+          <w:sz w:val="22"/>
+          <w:szCs w:val="22"/>
+          <w:lang w:eastAsia="en-US"/>
+          <w14:numForm w14:val="oldStyle"/>
+          <w14:numSpacing w14:val="proportional"/>
+        </w:rPr>
+        <w:t>5.</w:t>
+      </w:r>
+      <w:r>
+        <w:rPr>
+          <w:rFonts w:ascii="Palatino Linotype" w:hAnsi="Palatino Linotype" w:cs="Times New Roman (Headings CS)"/>
+          <w:b/>
+          <w:color w:val="000000"/>
+          <w:spacing w:val="2"/>
+          <w:kern w:val="16"/>
+          <w:sz w:val="22"/>
+          <w:szCs w:val="22"/>
+          <w:lang w:eastAsia="en-US"/>
+          <w14:numForm w14:val="oldStyle"/>
+          <w14:numSpacing w14:val="proportional"/>
+        </w:rPr>
+        <w:t>2</w:t>
+      </w:r>
+      <w:r>
+        <w:rPr>
+          <w:rFonts w:ascii="Palatino Linotype" w:hAnsi="Palatino Linotype" w:cs="Times New Roman (Headings CS)"/>
+          <w:b/>
+          <w:color w:val="000000"/>
+          <w:spacing w:val="2"/>
+          <w:kern w:val="16"/>
+          <w:sz w:val="22"/>
+          <w:szCs w:val="22"/>
+          <w:lang w:eastAsia="en-US"/>
+          <w14:numForm w14:val="oldStyle"/>
+          <w14:numSpacing w14:val="proportional"/>
+        </w:rPr>
+        <w:t xml:space="preserve"> Pe</w:t>
+      </w:r>
+      <w:r>
+        <w:rPr>
+          <w:rFonts w:ascii="Palatino Linotype" w:hAnsi="Palatino Linotype" w:cs="Times New Roman (Headings CS)"/>
+          <w:b/>
+          <w:color w:val="000000"/>
+          <w:spacing w:val="2"/>
+          <w:kern w:val="16"/>
+          <w:sz w:val="22"/>
+          <w:szCs w:val="22"/>
+          <w:lang w:eastAsia="en-US"/>
+          <w14:numForm w14:val="oldStyle"/>
+          <w14:numSpacing w14:val="proportional"/>
+        </w:rPr>
+        <w:t>r-Tone Accuracy</w:t>
+      </w:r>
+    </w:p>
+    <w:p>
+      <w:pPr>
+        <w:spacing w:after="170" w:line="340" w:lineRule="exact"/>
+        <w:jc w:val="both"/>
+        <w:rPr>
+          <w:rFonts w:ascii="Palatino Linotype" w:eastAsia="Times New Roman" w:hAnsi="Palatino Linotype" w:cs="Times New Roman"/>
+          <w:spacing w:val="2"/>
+          <w:kern w:val="16"/>
+          <w:sz w:val="22"/>
+          <w:szCs w:val="22"/>
+          <w:lang w:eastAsia="en-US"/>
+          <w14:numForm w14:val="oldStyle"/>
+          <w14:numSpacing w14:val="proportional"/>
+        </w:rPr>
+      </w:pPr>
+      <w:r>
+        <w:rPr>
+          <w:rFonts w:ascii="Palatino Linotype" w:eastAsia="Times New Roman" w:hAnsi="Palatino Linotype" w:cs="Times New Roman"/>
+          <w:spacing w:val="2"/>
+          <w:kern w:val="16"/>
+          <w:sz w:val="22"/>
+          <w:szCs w:val="22"/>
+          <w:lang w:eastAsia="en-US"/>
+          <w14:numForm w14:val="oldStyle"/>
+          <w14:numSpacing w14:val="proportional"/>
+        </w:rPr>
+        <w:t>Tone 3 (dipping) showed the largest gain (+20.5%, from 46.2 to 66.7%), consistent with prior reports that the dipping contour is particularly difficult for learners from non-tonal backgrounds (Lin, 2007). Tone 1 (flat) improved by 15.4%</w:t>
+      </w:r>
+      <w:r>
+        <w:rPr>
+          <w:rFonts w:ascii="Palatino Linotype" w:eastAsia="Times New Roman" w:hAnsi="Palatino Linotype" w:cs="Times New Roman"/>
+          <w:spacing w:val="2"/>
+          <w:kern w:val="16"/>
+          <w:sz w:val="22"/>
+          <w:szCs w:val="22"/>
+          <w:lang w:eastAsia="en-US"/>
+          <w14:numForm w14:val="oldStyle"/>
+          <w14:numSpacing w14:val="proportional"/>
+        </w:rPr>
+        <w:t xml:space="preserve"> and Tone 2 (rising) by +12.8%. Tone 4 (falling) declined by 7.7%, an outcome likely attributable to sampling variability given only 3 items per </w:t>
+      </w:r>
+      <w:proofErr w:type="spellStart"/>
+      <w:r>
+        <w:rPr>
+          <w:rFonts w:ascii="Palatino Linotype" w:eastAsia="Times New Roman" w:hAnsi="Palatino Linotype" w:cs="Times New Roman"/>
+          <w:spacing w:val="2"/>
+          <w:kern w:val="16"/>
+          <w:sz w:val="22"/>
+          <w:szCs w:val="22"/>
+          <w:lang w:eastAsia="en-US"/>
+          <w14:numForm w14:val="oldStyle"/>
+          <w14:numSpacing w14:val="proportional"/>
+        </w:rPr>
+        <w:t>tone</w:t>
+      </w:r>
+      <w:proofErr w:type="spellEnd"/>
+      <w:r>
+        <w:rPr>
+          <w:rFonts w:ascii="Palatino Linotype" w:eastAsia="Times New Roman" w:hAnsi="Palatino Linotype" w:cs="Times New Roman"/>
+          <w:spacing w:val="2"/>
+          <w:kern w:val="16"/>
+          <w:sz w:val="22"/>
+          <w:szCs w:val="22"/>
+          <w:lang w:eastAsia="en-US"/>
+          <w14:numForm w14:val="oldStyle"/>
+          <w14:numSpacing w14:val="proportional"/>
+        </w:rPr>
+        <w:t xml:space="preserve"> per participant. </w:t>
+      </w:r>
+      <w:r>
+        <w:rPr>
+          <w:rFonts w:ascii="Palatino Linotype" w:eastAsia="Times New Roman" w:hAnsi="Palatino Linotype" w:cs="Times New Roman"/>
+          <w:spacing w:val="2"/>
+          <w:kern w:val="16"/>
+          <w:sz w:val="22"/>
+          <w:szCs w:val="22"/>
+          <w:lang w:eastAsia="en-US"/>
+          <w14:numForm w14:val="oldStyle"/>
+          <w14:numSpacing w14:val="proportional"/>
+        </w:rPr>
+        <w:br/>
+        <w:t xml:space="preserve">The T2/T3 confusion observed in the classifier’s error analysis was mirrored in participant behavior, with several </w:t>
+      </w:r>
+      <w:proofErr w:type="gramStart"/>
+      <w:r>
+        <w:rPr>
+          <w:rFonts w:ascii="Palatino Linotype" w:eastAsia="Times New Roman" w:hAnsi="Palatino Linotype" w:cs="Times New Roman"/>
+          <w:spacing w:val="2"/>
+          <w:kern w:val="16"/>
+          <w:sz w:val="22"/>
+          <w:szCs w:val="22"/>
+          <w:lang w:eastAsia="en-US"/>
+          <w14:numForm w14:val="oldStyle"/>
+          <w14:numSpacing w14:val="proportional"/>
+        </w:rPr>
+        <w:t>respondents</w:t>
+      </w:r>
+      <w:proofErr w:type="gramEnd"/>
+      <w:r>
+        <w:rPr>
+          <w:rFonts w:ascii="Palatino Linotype" w:eastAsia="Times New Roman" w:hAnsi="Palatino Linotype" w:cs="Times New Roman"/>
+          <w:spacing w:val="2"/>
+          <w:kern w:val="16"/>
+          <w:sz w:val="22"/>
+          <w:szCs w:val="22"/>
+          <w:lang w:eastAsia="en-US"/>
+          <w14:numForm w14:val="oldStyle"/>
+          <w14:numSpacing w14:val="proportional"/>
+        </w:rPr>
+        <w:t xml:space="preserve"> reporting difficulty distinguishing the two contours.</w:t>
+      </w:r>
+    </w:p>
+    <w:p>
+      <w:pPr>
+        <w:pStyle w:val="Heading2"/>
+        <w:tabs>
+          <w:tab w:val="num" w:pos="360"/>
+        </w:tabs>
+        <w:suppressAutoHyphens/>
+        <w:spacing w:before="170" w:after="170" w:line="340" w:lineRule="exact"/>
+        <w:jc w:val="both"/>
+        <w:rPr>
+          <w:rFonts w:ascii="Palatino Linotype" w:hAnsi="Palatino Linotype" w:cs="Times New Roman (Headings CS)"/>
+          <w:b/>
+          <w:color w:val="000000"/>
+          <w:spacing w:val="2"/>
+          <w:kern w:val="16"/>
+          <w:sz w:val="22"/>
+          <w:szCs w:val="22"/>
+          <w:lang w:eastAsia="en-US"/>
+          <w14:numForm w14:val="oldStyle"/>
+          <w14:numSpacing w14:val="proportional"/>
+        </w:rPr>
+      </w:pPr>
+      <w:r>
+        <w:rPr>
+          <w:rFonts w:ascii="Palatino Linotype" w:hAnsi="Palatino Linotype" w:cs="Times New Roman (Headings CS)"/>
+          <w:b/>
+          <w:color w:val="000000"/>
+          <w:spacing w:val="2"/>
+          <w:kern w:val="16"/>
+          <w:sz w:val="22"/>
+          <w:szCs w:val="22"/>
+          <w:lang w:eastAsia="en-US"/>
+          <w14:numForm w14:val="oldStyle"/>
+          <w14:numSpacing w14:val="proportional"/>
+        </w:rPr>
+        <w:t>5.</w:t>
+      </w:r>
+      <w:r>
+        <w:rPr>
+          <w:rFonts w:ascii="Palatino Linotype" w:hAnsi="Palatino Linotype" w:cs="Times New Roman (Headings CS)"/>
+          <w:b/>
+          <w:color w:val="000000"/>
+          <w:spacing w:val="2"/>
+          <w:kern w:val="16"/>
+          <w:sz w:val="22"/>
+          <w:szCs w:val="22"/>
+          <w:lang w:eastAsia="en-US"/>
+          <w14:numForm w14:val="oldStyle"/>
+          <w14:numSpacing w14:val="proportional"/>
+        </w:rPr>
         <w:t>3</w:t>
       </w:r>
       <w:r>
@@ -2318,7 +2745,7 @@
           <w14:numForm w14:val="oldStyle"/>
           <w14:numSpacing w14:val="proportional"/>
         </w:rPr>
-        <w:t>Procedure and Analysis</w:t>
+        <w:t>App Usability Survey</w:t>
       </w:r>
     </w:p>
     <w:p>
@@ -2347,7 +2774,7 @@
           <w14:numForm w14:val="oldStyle"/>
           <w14:numSpacing w14:val="proportional"/>
         </w:rPr>
-        <w:t>Participants were first directed to Form A and asked to complete it without prior use of the practice application. They then used the Mandarin Tone Coach app for a minimum of five to ten minutes, exploring both monosyllabic and disyllabic practice modes at their own pace. Following practice, participants completed Form B using the identifier from Form A and then completed the TAM survey.</w:t>
+        <w:t>16 participants completed the TAM usability survey (two survey-only respondents were excluded). The overall mean rating across 8 five-point Likert items was 3.96 (SD = 1.01), reflecting broadly positive perceptions of the application. Willingness to recommend the app to other learners received the highest rating (mean = 4.19, SD = 1.05), followed by perceived overall usefulness (mean = 4.12, SD = 1.02), intent to reuse (mean = 4.06, SD = 1.00), and recording ease (M = 4.00, SD = 0.97). The item assessing whether the app helped participants better understand Mandarin tones received the lowest rating (mean = 3.69, SD = 0.79).</w:t>
       </w:r>
     </w:p>
     <w:p>
@@ -2376,7 +2803,49 @@
           <w14:numForm w14:val="oldStyle"/>
           <w14:numSpacing w14:val="proportional"/>
         </w:rPr>
-        <w:t>Tone perception accuracy was computed as the proportion of correctly identified tones per form. Statistical comparison of pre- and post-test scores across the 13 paired participants used two complementary tests: a Wilcoxon signed-rank test, preferred for its robustness with small samples, and a paired t-test reported for reference. Per-tone accuracy was disaggregated across T1-T4 to identify tone-specific patterns. TAM results were summarized with item-level means and standard deviation.</w:t>
+        <w:lastRenderedPageBreak/>
+        <w:t xml:space="preserve">3 of the 16 respondents identified as native or heritage Mandarin speakers who encountered classifier limitations outside the training distribution; their inclusion may depress mean usability scores for </w:t>
+      </w:r>
+      <w:proofErr w:type="spellStart"/>
+      <w:r>
+        <w:rPr>
+          <w:rFonts w:ascii="Palatino Linotype" w:eastAsia="Times New Roman" w:hAnsi="Palatino Linotype" w:cs="Times New Roman"/>
+          <w:spacing w:val="2"/>
+          <w:kern w:val="16"/>
+          <w:sz w:val="22"/>
+          <w:szCs w:val="22"/>
+          <w:lang w:eastAsia="en-US"/>
+          <w14:numForm w14:val="oldStyle"/>
+          <w14:numSpacing w14:val="proportional"/>
+        </w:rPr>
+        <w:t>th</w:t>
+      </w:r>
+      <w:proofErr w:type="spellEnd"/>
+      <w:r>
+        <w:rPr>
+          <w:rFonts w:ascii="Palatino Linotype" w:eastAsia="Times New Roman" w:hAnsi="Palatino Linotype" w:cs="Times New Roman"/>
+          <w:spacing w:val="2"/>
+          <w:kern w:val="16"/>
+          <w:sz w:val="22"/>
+          <w:szCs w:val="22"/>
+          <w:lang w:eastAsia="en-US"/>
+          <w14:numForm w14:val="oldStyle"/>
+          <w14:numSpacing w14:val="proportional"/>
+        </w:rPr>
+        <w:sym w:font="Symbol" w:char="F061"/>
+      </w:r>
+      <w:r>
+        <w:rPr>
+          <w:rFonts w:ascii="Palatino Linotype" w:eastAsia="Times New Roman" w:hAnsi="Palatino Linotype" w:cs="Times New Roman"/>
+          <w:spacing w:val="2"/>
+          <w:kern w:val="16"/>
+          <w:sz w:val="22"/>
+          <w:szCs w:val="22"/>
+          <w:lang w:eastAsia="en-US"/>
+          <w14:numForm w14:val="oldStyle"/>
+          <w14:numSpacing w14:val="proportional"/>
+        </w:rPr>
+        <w:t>e intended learner population.</w:t>
       </w:r>
     </w:p>
     <w:p>
@@ -2394,34 +2863,2674 @@
           <w14:numSpacing w14:val="proportional"/>
         </w:rPr>
       </w:pPr>
-    </w:p>
-    <w:p>
-      <w:pPr>
-        <w:spacing w:after="170" w:line="340" w:lineRule="exact"/>
-        <w:jc w:val="both"/>
-        <w:rPr>
-          <w:rFonts w:ascii="Palatino Linotype" w:eastAsia="Times New Roman" w:hAnsi="Palatino Linotype" w:cs="Times New Roman"/>
-          <w:spacing w:val="2"/>
-          <w:kern w:val="16"/>
-          <w:sz w:val="22"/>
-          <w:szCs w:val="22"/>
-          <w:lang w:eastAsia="en-US"/>
-          <w14:numForm w14:val="oldStyle"/>
-          <w14:numSpacing w14:val="proportional"/>
-        </w:rPr>
-      </w:pPr>
-    </w:p>
-    <w:p>
-      <w:pPr>
-        <w:rPr>
-          <w:lang w:eastAsia="en-US"/>
-        </w:rPr>
-      </w:pPr>
+      <w:r>
+        <w:rPr>
+          <w:rFonts w:ascii="Palatino Linotype" w:eastAsia="Times New Roman" w:hAnsi="Palatino Linotype" w:cs="Times New Roman"/>
+          <w:spacing w:val="2"/>
+          <w:kern w:val="16"/>
+          <w:sz w:val="22"/>
+          <w:szCs w:val="22"/>
+          <w:lang w:eastAsia="en-US"/>
+          <w14:numForm w14:val="oldStyle"/>
+          <w14:numSpacing w14:val="proportional"/>
+        </w:rPr>
+        <w:t>Open-ended responses highlighted consistent themes: participants appreciated the pitch contour overlay and found the app intuitive overall. Frequently requested improvements included reference audio playback prior to recording, more specific feedback on recording quality issues, and an expanded word list.</w:t>
+      </w:r>
+    </w:p>
+    <w:p>
+      <w:pPr>
+        <w:pStyle w:val="Heading1"/>
+        <w:tabs>
+          <w:tab w:val="num" w:pos="202"/>
+        </w:tabs>
+        <w:suppressAutoHyphens/>
+        <w:spacing w:before="220" w:after="170" w:line="340" w:lineRule="exact"/>
+        <w:jc w:val="both"/>
+        <w:rPr>
+          <w:rFonts w:ascii="Palatino Linotype" w:hAnsi="Palatino Linotype" w:cs="Times New Roman (Headings CS)"/>
+          <w:b/>
+          <w:caps/>
+          <w:color w:val="auto"/>
+          <w:spacing w:val="13"/>
+          <w:kern w:val="16"/>
+          <w:sz w:val="22"/>
+          <w:szCs w:val="48"/>
+          <w:lang w:eastAsia="en-US"/>
+          <w14:numForm w14:val="lining"/>
+          <w14:numSpacing w14:val="tabular"/>
+        </w:rPr>
+      </w:pPr>
+      <w:r>
+        <w:rPr>
+          <w:rFonts w:ascii="Palatino Linotype" w:hAnsi="Palatino Linotype" w:cs="Times New Roman (Headings CS)"/>
+          <w:b/>
+          <w:caps/>
+          <w:color w:val="auto"/>
+          <w:spacing w:val="13"/>
+          <w:kern w:val="16"/>
+          <w:sz w:val="22"/>
+          <w:szCs w:val="48"/>
+          <w:lang w:eastAsia="en-US"/>
+          <w14:numForm w14:val="lining"/>
+          <w14:numSpacing w14:val="tabular"/>
+        </w:rPr>
+        <w:t>6</w:t>
+      </w:r>
+      <w:r>
+        <w:rPr>
+          <w:rFonts w:ascii="Palatino Linotype" w:hAnsi="Palatino Linotype" w:cs="Times New Roman (Headings CS)"/>
+          <w:b/>
+          <w:caps/>
+          <w:color w:val="auto"/>
+          <w:spacing w:val="13"/>
+          <w:kern w:val="16"/>
+          <w:sz w:val="22"/>
+          <w:szCs w:val="48"/>
+          <w:lang w:eastAsia="en-US"/>
+          <w14:numForm w14:val="lining"/>
+          <w14:numSpacing w14:val="tabular"/>
+        </w:rPr>
+        <w:t xml:space="preserve"> </w:t>
+      </w:r>
+      <w:proofErr w:type="gramStart"/>
+      <w:r>
+        <w:rPr>
+          <w:rFonts w:ascii="Palatino Linotype" w:hAnsi="Palatino Linotype" w:cs="Times New Roman (Headings CS)"/>
+          <w:b/>
+          <w:caps/>
+          <w:color w:val="auto"/>
+          <w:spacing w:val="13"/>
+          <w:kern w:val="16"/>
+          <w:sz w:val="22"/>
+          <w:szCs w:val="48"/>
+          <w:lang w:eastAsia="en-US"/>
+          <w14:numForm w14:val="lining"/>
+          <w14:numSpacing w14:val="tabular"/>
+        </w:rPr>
+        <w:t>DISCUSSION</w:t>
+      </w:r>
+      <w:proofErr w:type="gramEnd"/>
+    </w:p>
+    <w:p>
+      <w:pPr>
+        <w:pStyle w:val="Heading2"/>
+        <w:tabs>
+          <w:tab w:val="num" w:pos="360"/>
+        </w:tabs>
+        <w:suppressAutoHyphens/>
+        <w:spacing w:before="170" w:after="170" w:line="340" w:lineRule="exact"/>
+        <w:jc w:val="both"/>
+        <w:rPr>
+          <w:rFonts w:ascii="Palatino Linotype" w:hAnsi="Palatino Linotype" w:cs="Times New Roman (Headings CS)"/>
+          <w:b/>
+          <w:color w:val="000000"/>
+          <w:spacing w:val="2"/>
+          <w:kern w:val="16"/>
+          <w:sz w:val="22"/>
+          <w:szCs w:val="22"/>
+          <w:lang w:eastAsia="en-US"/>
+          <w14:numForm w14:val="oldStyle"/>
+          <w14:numSpacing w14:val="proportional"/>
+        </w:rPr>
+      </w:pPr>
+      <w:r>
+        <w:rPr>
+          <w:rFonts w:ascii="Palatino Linotype" w:hAnsi="Palatino Linotype" w:cs="Times New Roman (Headings CS)"/>
+          <w:b/>
+          <w:color w:val="000000"/>
+          <w:spacing w:val="2"/>
+          <w:kern w:val="16"/>
+          <w:sz w:val="22"/>
+          <w:szCs w:val="22"/>
+          <w:lang w:eastAsia="en-US"/>
+          <w14:numForm w14:val="oldStyle"/>
+          <w14:numSpacing w14:val="proportional"/>
+        </w:rPr>
+        <w:t>6</w:t>
+      </w:r>
+      <w:r>
+        <w:rPr>
+          <w:rFonts w:ascii="Palatino Linotype" w:hAnsi="Palatino Linotype" w:cs="Times New Roman (Headings CS)"/>
+          <w:b/>
+          <w:color w:val="000000"/>
+          <w:spacing w:val="2"/>
+          <w:kern w:val="16"/>
+          <w:sz w:val="22"/>
+          <w:szCs w:val="22"/>
+          <w:lang w:eastAsia="en-US"/>
+          <w14:numForm w14:val="oldStyle"/>
+          <w14:numSpacing w14:val="proportional"/>
+        </w:rPr>
+        <w:t xml:space="preserve">.1 </w:t>
+      </w:r>
+      <w:r>
+        <w:rPr>
+          <w:rFonts w:ascii="Palatino Linotype" w:hAnsi="Palatino Linotype" w:cs="Times New Roman (Headings CS)"/>
+          <w:b/>
+          <w:color w:val="000000"/>
+          <w:spacing w:val="2"/>
+          <w:kern w:val="16"/>
+          <w:sz w:val="22"/>
+          <w:szCs w:val="22"/>
+          <w:lang w:eastAsia="en-US"/>
+          <w14:numForm w14:val="oldStyle"/>
+          <w14:numSpacing w14:val="proportional"/>
+        </w:rPr>
+        <w:t>Interpretation of Perception Test Results</w:t>
+      </w:r>
+    </w:p>
+    <w:p>
+      <w:pPr>
+        <w:jc w:val="both"/>
+        <w:rPr>
+          <w:rFonts w:ascii="Palatino Linotype" w:eastAsia="Times New Roman" w:hAnsi="Palatino Linotype" w:cs="Times New Roman"/>
+          <w:spacing w:val="2"/>
+          <w:kern w:val="16"/>
+          <w:sz w:val="22"/>
+          <w:szCs w:val="22"/>
+          <w:lang w:eastAsia="en-US"/>
+          <w14:numForm w14:val="oldStyle"/>
+          <w14:numSpacing w14:val="proportional"/>
+        </w:rPr>
+      </w:pPr>
+      <w:r>
+        <w:rPr>
+          <w:rFonts w:ascii="Palatino Linotype" w:eastAsia="Times New Roman" w:hAnsi="Palatino Linotype" w:cs="Times New Roman"/>
+          <w:spacing w:val="2"/>
+          <w:kern w:val="16"/>
+          <w:sz w:val="22"/>
+          <w:szCs w:val="22"/>
+          <w:lang w:eastAsia="en-US"/>
+          <w14:numForm w14:val="oldStyle"/>
+          <w14:numSpacing w14:val="proportional"/>
+        </w:rPr>
+        <w:t xml:space="preserve">The </w:t>
+      </w:r>
+      <w:r>
+        <w:rPr>
+          <w:rFonts w:ascii="Palatino Linotype" w:eastAsia="Times New Roman" w:hAnsi="Palatino Linotype" w:cs="Times New Roman"/>
+          <w:spacing w:val="2"/>
+          <w:kern w:val="16"/>
+          <w:sz w:val="22"/>
+          <w:szCs w:val="22"/>
+          <w:lang w:eastAsia="en-US"/>
+          <w14:numForm w14:val="oldStyle"/>
+          <w14:numSpacing w14:val="proportional"/>
+        </w:rPr>
+        <w:t xml:space="preserve">10.3% improvement in mean tone perception accuracy is encouraging, though the absence of statistical significance (p = 0.087) prevents strong causal claims. The most likely explanation is insufficient power: with 13 paired participants, the study was underpowered to detect the moderate effect size suggested by the data, with an estimated 28 pairs needed for 80% power at </w:t>
+      </w:r>
+      <w:r>
+        <w:rPr>
+          <w:rFonts w:ascii="Cambria Math" w:eastAsia="Times New Roman" w:hAnsi="Cambria Math" w:cs="Times New Roman"/>
+          <w:spacing w:val="2"/>
+          <w:kern w:val="16"/>
+          <w:sz w:val="22"/>
+          <w:szCs w:val="22"/>
+          <w:lang w:eastAsia="en-US"/>
+          <w14:numForm w14:val="oldStyle"/>
+          <w14:numSpacing w14:val="proportional"/>
+        </w:rPr>
+        <w:t xml:space="preserve">⍺ </w:t>
+      </w:r>
+      <w:r>
+        <w:rPr>
+          <w:rFonts w:ascii="Palatino Linotype" w:eastAsia="Times New Roman" w:hAnsi="Palatino Linotype" w:cs="Times New Roman"/>
+          <w:spacing w:val="2"/>
+          <w:kern w:val="16"/>
+          <w:sz w:val="22"/>
+          <w:szCs w:val="22"/>
+          <w:lang w:eastAsia="en-US"/>
+          <w14:numForm w14:val="oldStyle"/>
+          <w14:numSpacing w14:val="proportional"/>
+        </w:rPr>
+        <w:t>= 0.05. The positive trend nonetheless aligns with prior CAPT systems for Mandarin that have demonstrated short-term perceptual gains following brief practice (Wang et al., 2003).</w:t>
+      </w:r>
+    </w:p>
+    <w:p>
+      <w:pPr>
+        <w:jc w:val="both"/>
+        <w:rPr>
+          <w:rFonts w:ascii="Palatino Linotype" w:eastAsia="Times New Roman" w:hAnsi="Palatino Linotype" w:cs="Times New Roman"/>
+          <w:spacing w:val="2"/>
+          <w:kern w:val="16"/>
+          <w:sz w:val="22"/>
+          <w:szCs w:val="22"/>
+          <w:lang w:eastAsia="en-US"/>
+          <w14:numForm w14:val="oldStyle"/>
+          <w14:numSpacing w14:val="proportional"/>
+        </w:rPr>
+      </w:pPr>
+      <w:r>
+        <w:rPr>
+          <w:rFonts w:ascii="Palatino Linotype" w:eastAsia="Times New Roman" w:hAnsi="Palatino Linotype" w:cs="Times New Roman"/>
+          <w:spacing w:val="2"/>
+          <w:kern w:val="16"/>
+          <w:sz w:val="22"/>
+          <w:szCs w:val="22"/>
+          <w:lang w:eastAsia="en-US"/>
+          <w14:numForm w14:val="oldStyle"/>
+          <w14:numSpacing w14:val="proportional"/>
+        </w:rPr>
+        <w:t>The per-tone results offer additional nuance. The largest gain occurred in Tone 3 (dipping, +20.5%), which was also the most difficult tone at baseline, consistent</w:t>
+      </w:r>
+      <w:r>
+        <w:rPr>
+          <w:rFonts w:ascii="Palatino Linotype" w:eastAsia="Times New Roman" w:hAnsi="Palatino Linotype" w:cs="Times New Roman"/>
+          <w:spacing w:val="2"/>
+          <w:kern w:val="16"/>
+          <w:sz w:val="22"/>
+          <w:szCs w:val="22"/>
+          <w:lang w:eastAsia="en-US"/>
+          <w14:numForm w14:val="oldStyle"/>
+          <w14:numSpacing w14:val="proportional"/>
+        </w:rPr>
+        <w:t xml:space="preserve"> with the broader literature on the dipping contour’s difficulty for non-tonal language learners (Lin, 2007). The T2/T3 confusion documented in the classifier’s error analysis was clearly present in learner perception as well. The Tone 4 (-7.7%) is most plausibly explained by sampling variability, as only 3 items per </w:t>
+      </w:r>
+      <w:proofErr w:type="spellStart"/>
+      <w:r>
+        <w:rPr>
+          <w:rFonts w:ascii="Palatino Linotype" w:eastAsia="Times New Roman" w:hAnsi="Palatino Linotype" w:cs="Times New Roman"/>
+          <w:spacing w:val="2"/>
+          <w:kern w:val="16"/>
+          <w:sz w:val="22"/>
+          <w:szCs w:val="22"/>
+          <w:lang w:eastAsia="en-US"/>
+          <w14:numForm w14:val="oldStyle"/>
+          <w14:numSpacing w14:val="proportional"/>
+        </w:rPr>
+        <w:t>tone</w:t>
+      </w:r>
+      <w:proofErr w:type="spellEnd"/>
+      <w:r>
+        <w:rPr>
+          <w:rFonts w:ascii="Palatino Linotype" w:eastAsia="Times New Roman" w:hAnsi="Palatino Linotype" w:cs="Times New Roman"/>
+          <w:spacing w:val="2"/>
+          <w:kern w:val="16"/>
+          <w:sz w:val="22"/>
+          <w:szCs w:val="22"/>
+          <w:lang w:eastAsia="en-US"/>
+          <w14:numForm w14:val="oldStyle"/>
+          <w14:numSpacing w14:val="proportional"/>
+        </w:rPr>
+        <w:t xml:space="preserve"> per participant were available.</w:t>
+      </w:r>
+    </w:p>
+    <w:p>
+      <w:pPr>
+        <w:pStyle w:val="Heading2"/>
+        <w:tabs>
+          <w:tab w:val="num" w:pos="360"/>
+        </w:tabs>
+        <w:suppressAutoHyphens/>
+        <w:spacing w:before="170" w:after="170" w:line="340" w:lineRule="exact"/>
+        <w:jc w:val="both"/>
+        <w:rPr>
+          <w:rFonts w:ascii="Palatino Linotype" w:hAnsi="Palatino Linotype" w:cs="Times New Roman (Headings CS)"/>
+          <w:b/>
+          <w:color w:val="000000"/>
+          <w:spacing w:val="2"/>
+          <w:kern w:val="16"/>
+          <w:sz w:val="22"/>
+          <w:szCs w:val="22"/>
+          <w:lang w:eastAsia="en-US"/>
+          <w14:numForm w14:val="oldStyle"/>
+          <w14:numSpacing w14:val="proportional"/>
+        </w:rPr>
+      </w:pPr>
+      <w:r>
+        <w:rPr>
+          <w:rFonts w:ascii="Palatino Linotype" w:hAnsi="Palatino Linotype" w:cs="Times New Roman (Headings CS)"/>
+          <w:b/>
+          <w:color w:val="000000"/>
+          <w:spacing w:val="2"/>
+          <w:kern w:val="16"/>
+          <w:sz w:val="22"/>
+          <w:szCs w:val="22"/>
+          <w:lang w:eastAsia="en-US"/>
+          <w14:numForm w14:val="oldStyle"/>
+          <w14:numSpacing w14:val="proportional"/>
+        </w:rPr>
+        <w:t>6.</w:t>
+      </w:r>
+      <w:r>
+        <w:rPr>
+          <w:rFonts w:ascii="Palatino Linotype" w:hAnsi="Palatino Linotype" w:cs="Times New Roman (Headings CS)"/>
+          <w:b/>
+          <w:color w:val="000000"/>
+          <w:spacing w:val="2"/>
+          <w:kern w:val="16"/>
+          <w:sz w:val="22"/>
+          <w:szCs w:val="22"/>
+          <w:lang w:eastAsia="en-US"/>
+          <w14:numForm w14:val="oldStyle"/>
+          <w14:numSpacing w14:val="proportional"/>
+        </w:rPr>
+        <w:t>2</w:t>
+      </w:r>
+      <w:r>
+        <w:rPr>
+          <w:rFonts w:ascii="Palatino Linotype" w:hAnsi="Palatino Linotype" w:cs="Times New Roman (Headings CS)"/>
+          <w:b/>
+          <w:color w:val="000000"/>
+          <w:spacing w:val="2"/>
+          <w:kern w:val="16"/>
+          <w:sz w:val="22"/>
+          <w:szCs w:val="22"/>
+          <w:lang w:eastAsia="en-US"/>
+          <w14:numForm w14:val="oldStyle"/>
+          <w14:numSpacing w14:val="proportional"/>
+        </w:rPr>
+        <w:t xml:space="preserve"> Interpretation of </w:t>
+      </w:r>
+      <w:r>
+        <w:rPr>
+          <w:rFonts w:ascii="Palatino Linotype" w:hAnsi="Palatino Linotype" w:cs="Times New Roman (Headings CS)"/>
+          <w:b/>
+          <w:color w:val="000000"/>
+          <w:spacing w:val="2"/>
+          <w:kern w:val="16"/>
+          <w:sz w:val="22"/>
+          <w:szCs w:val="22"/>
+          <w:lang w:eastAsia="en-US"/>
+          <w14:numForm w14:val="oldStyle"/>
+          <w14:numSpacing w14:val="proportional"/>
+        </w:rPr>
+        <w:t>Usability Results</w:t>
+      </w:r>
+    </w:p>
+    <w:p>
+      <w:pPr>
+        <w:jc w:val="both"/>
+        <w:rPr>
+          <w:rFonts w:ascii="Palatino Linotype" w:eastAsia="Times New Roman" w:hAnsi="Palatino Linotype" w:cs="Times New Roman"/>
+          <w:spacing w:val="2"/>
+          <w:kern w:val="16"/>
+          <w:sz w:val="22"/>
+          <w:szCs w:val="22"/>
+          <w:lang w:eastAsia="en-US"/>
+          <w14:numForm w14:val="oldStyle"/>
+          <w14:numSpacing w14:val="proportional"/>
+        </w:rPr>
+      </w:pPr>
+      <w:r>
+        <w:rPr>
+          <w:rFonts w:ascii="Palatino Linotype" w:eastAsia="Times New Roman" w:hAnsi="Palatino Linotype" w:cs="Times New Roman"/>
+          <w:spacing w:val="2"/>
+          <w:kern w:val="16"/>
+          <w:sz w:val="22"/>
+          <w:szCs w:val="22"/>
+          <w:lang w:eastAsia="en-US"/>
+          <w14:numForm w14:val="oldStyle"/>
+          <w14:numSpacing w14:val="proportional"/>
+        </w:rPr>
+        <w:t>The</w:t>
+      </w:r>
+      <w:r>
+        <w:rPr>
+          <w:rFonts w:ascii="Palatino Linotype" w:eastAsia="Times New Roman" w:hAnsi="Palatino Linotype" w:cs="Times New Roman"/>
+          <w:spacing w:val="2"/>
+          <w:kern w:val="16"/>
+          <w:sz w:val="22"/>
+          <w:szCs w:val="22"/>
+          <w:lang w:eastAsia="en-US"/>
+          <w14:numForm w14:val="oldStyle"/>
+          <w14:numSpacing w14:val="proportional"/>
+        </w:rPr>
+        <w:t xml:space="preserve"> overall TAM mean of 3.96 out of 5 indicates that participants found the application both useful and accessible. The highest-rated items – willingness to recommend (4.19) and overall usefulness (4.12) – suggest the tool’s core value was recognized even after a brief session. The lower rating for whether the app helped participants better understand Mandarin tones (3.69) is unsurprising given the session’s brevity. The 3 native and heritage Mandarin speakers in the </w:t>
+      </w:r>
+      <w:r>
+        <w:rPr>
+          <w:rFonts w:ascii="Palatino Linotype" w:eastAsia="Times New Roman" w:hAnsi="Palatino Linotype" w:cs="Times New Roman"/>
+          <w:spacing w:val="2"/>
+          <w:kern w:val="16"/>
+          <w:sz w:val="22"/>
+          <w:szCs w:val="22"/>
+          <w:lang w:eastAsia="en-US"/>
+          <w14:numForm w14:val="oldStyle"/>
+          <w14:numSpacing w14:val="proportional"/>
+        </w:rPr>
+        <w:lastRenderedPageBreak/>
+        <w:t>sample encountered classifier errors outside the intended use case and likely depressed mean ratings; their inclusion should be weighed accordingly when interpreting the usability results.</w:t>
+      </w:r>
+    </w:p>
+    <w:p>
+      <w:pPr>
+        <w:pStyle w:val="Heading2"/>
+        <w:tabs>
+          <w:tab w:val="num" w:pos="360"/>
+        </w:tabs>
+        <w:suppressAutoHyphens/>
+        <w:spacing w:before="170" w:after="170" w:line="340" w:lineRule="exact"/>
+        <w:jc w:val="both"/>
+        <w:rPr>
+          <w:rFonts w:ascii="Palatino Linotype" w:hAnsi="Palatino Linotype" w:cs="Times New Roman (Headings CS)"/>
+          <w:b/>
+          <w:color w:val="000000"/>
+          <w:spacing w:val="2"/>
+          <w:kern w:val="16"/>
+          <w:sz w:val="22"/>
+          <w:szCs w:val="22"/>
+          <w:lang w:eastAsia="en-US"/>
+          <w14:numForm w14:val="oldStyle"/>
+          <w14:numSpacing w14:val="proportional"/>
+        </w:rPr>
+      </w:pPr>
+      <w:r>
+        <w:rPr>
+          <w:rFonts w:ascii="Palatino Linotype" w:hAnsi="Palatino Linotype" w:cs="Times New Roman (Headings CS)"/>
+          <w:b/>
+          <w:color w:val="000000"/>
+          <w:spacing w:val="2"/>
+          <w:kern w:val="16"/>
+          <w:sz w:val="22"/>
+          <w:szCs w:val="22"/>
+          <w:lang w:eastAsia="en-US"/>
+          <w14:numForm w14:val="oldStyle"/>
+          <w14:numSpacing w14:val="proportional"/>
+        </w:rPr>
+        <w:t>6.</w:t>
+      </w:r>
+      <w:r>
+        <w:rPr>
+          <w:rFonts w:ascii="Palatino Linotype" w:hAnsi="Palatino Linotype" w:cs="Times New Roman (Headings CS)"/>
+          <w:b/>
+          <w:color w:val="000000"/>
+          <w:spacing w:val="2"/>
+          <w:kern w:val="16"/>
+          <w:sz w:val="22"/>
+          <w:szCs w:val="22"/>
+          <w:lang w:eastAsia="en-US"/>
+          <w14:numForm w14:val="oldStyle"/>
+          <w14:numSpacing w14:val="proportional"/>
+        </w:rPr>
+        <w:t>3</w:t>
+      </w:r>
+      <w:r>
+        <w:rPr>
+          <w:rFonts w:ascii="Palatino Linotype" w:hAnsi="Palatino Linotype" w:cs="Times New Roman (Headings CS)"/>
+          <w:b/>
+          <w:color w:val="000000"/>
+          <w:spacing w:val="2"/>
+          <w:kern w:val="16"/>
+          <w:sz w:val="22"/>
+          <w:szCs w:val="22"/>
+          <w:lang w:eastAsia="en-US"/>
+          <w14:numForm w14:val="oldStyle"/>
+          <w14:numSpacing w14:val="proportional"/>
+        </w:rPr>
+        <w:t xml:space="preserve"> </w:t>
+      </w:r>
+      <w:r>
+        <w:rPr>
+          <w:rFonts w:ascii="Palatino Linotype" w:hAnsi="Palatino Linotype" w:cs="Times New Roman (Headings CS)"/>
+          <w:b/>
+          <w:color w:val="000000"/>
+          <w:spacing w:val="2"/>
+          <w:kern w:val="16"/>
+          <w:sz w:val="22"/>
+          <w:szCs w:val="22"/>
+          <w:lang w:eastAsia="en-US"/>
+          <w14:numForm w14:val="oldStyle"/>
+          <w14:numSpacing w14:val="proportional"/>
+        </w:rPr>
+        <w:t>Limitations and Future Directions</w:t>
+      </w:r>
+    </w:p>
+    <w:p>
+      <w:pPr>
+        <w:jc w:val="both"/>
+        <w:rPr>
+          <w:rFonts w:ascii="Palatino Linotype" w:eastAsia="Times New Roman" w:hAnsi="Palatino Linotype" w:cs="Times New Roman"/>
+          <w:spacing w:val="2"/>
+          <w:kern w:val="16"/>
+          <w:sz w:val="22"/>
+          <w:szCs w:val="22"/>
+          <w:lang w:eastAsia="en-US"/>
+          <w14:numForm w14:val="oldStyle"/>
+          <w14:numSpacing w14:val="proportional"/>
+        </w:rPr>
+      </w:pPr>
+      <w:r>
+        <w:rPr>
+          <w:rFonts w:ascii="Palatino Linotype" w:eastAsia="Times New Roman" w:hAnsi="Palatino Linotype" w:cs="Times New Roman"/>
+          <w:spacing w:val="2"/>
+          <w:kern w:val="16"/>
+          <w:sz w:val="22"/>
+          <w:szCs w:val="22"/>
+          <w:lang w:eastAsia="en-US"/>
+          <w14:numForm w14:val="oldStyle"/>
+          <w14:numSpacing w14:val="proportional"/>
+        </w:rPr>
+        <w:t xml:space="preserve">The </w:t>
+      </w:r>
+      <w:r>
+        <w:rPr>
+          <w:rFonts w:ascii="Palatino Linotype" w:eastAsia="Times New Roman" w:hAnsi="Palatino Linotype" w:cs="Times New Roman"/>
+          <w:spacing w:val="2"/>
+          <w:kern w:val="16"/>
+          <w:sz w:val="22"/>
+          <w:szCs w:val="22"/>
+          <w:lang w:eastAsia="en-US"/>
+          <w14:numForm w14:val="oldStyle"/>
+          <w14:numSpacing w14:val="proportional"/>
+        </w:rPr>
+        <w:t>study used a convenience sample with no control group, making it difficult to fully dissociate observed gains from test-retest learning effects or form difficulty differences. No delayed post-test was administered</w:t>
+      </w:r>
+      <w:r>
+        <w:rPr>
+          <w:rFonts w:ascii="Palatino Linotype" w:eastAsia="Times New Roman" w:hAnsi="Palatino Linotype" w:cs="Times New Roman"/>
+          <w:spacing w:val="2"/>
+          <w:kern w:val="16"/>
+          <w:sz w:val="22"/>
+          <w:szCs w:val="22"/>
+          <w:lang w:eastAsia="en-US"/>
+          <w14:numForm w14:val="oldStyle"/>
+          <w14:numSpacing w14:val="proportional"/>
+        </w:rPr>
+        <w:t>, so retention effects remain unknown. Future work should employ a larger and more diverse participant pool, a matched control condition, and a longitudinal design with delayed post-testing. On the system side, reference audio playback, adaptive difficulty, and improved speaker normalization would directly address the most common usability concerns raised by participants.</w:t>
+      </w:r>
+    </w:p>
+    <w:p>
+      <w:pPr>
+        <w:pStyle w:val="Heading1"/>
+        <w:tabs>
+          <w:tab w:val="num" w:pos="202"/>
+        </w:tabs>
+        <w:suppressAutoHyphens/>
+        <w:spacing w:before="220" w:after="170" w:line="340" w:lineRule="exact"/>
+        <w:jc w:val="both"/>
+        <w:rPr>
+          <w:rFonts w:ascii="Palatino Linotype" w:hAnsi="Palatino Linotype" w:cs="Times New Roman (Headings CS)"/>
+          <w:b/>
+          <w:caps/>
+          <w:color w:val="auto"/>
+          <w:spacing w:val="13"/>
+          <w:kern w:val="16"/>
+          <w:sz w:val="22"/>
+          <w:szCs w:val="48"/>
+          <w:lang w:eastAsia="en-US"/>
+          <w14:numForm w14:val="lining"/>
+          <w14:numSpacing w14:val="tabular"/>
+        </w:rPr>
+      </w:pPr>
+      <w:r>
+        <w:rPr>
+          <w:rFonts w:ascii="Palatino Linotype" w:hAnsi="Palatino Linotype" w:cs="Times New Roman (Headings CS)"/>
+          <w:b/>
+          <w:caps/>
+          <w:color w:val="auto"/>
+          <w:spacing w:val="13"/>
+          <w:kern w:val="16"/>
+          <w:sz w:val="22"/>
+          <w:szCs w:val="48"/>
+          <w:lang w:eastAsia="en-US"/>
+          <w14:numForm w14:val="lining"/>
+          <w14:numSpacing w14:val="tabular"/>
+        </w:rPr>
+        <w:t>7</w:t>
+      </w:r>
+      <w:r>
+        <w:rPr>
+          <w:rFonts w:ascii="Palatino Linotype" w:hAnsi="Palatino Linotype" w:cs="Times New Roman (Headings CS)"/>
+          <w:b/>
+          <w:caps/>
+          <w:color w:val="auto"/>
+          <w:spacing w:val="13"/>
+          <w:kern w:val="16"/>
+          <w:sz w:val="22"/>
+          <w:szCs w:val="48"/>
+          <w:lang w:eastAsia="en-US"/>
+          <w14:numForm w14:val="lining"/>
+          <w14:numSpacing w14:val="tabular"/>
+        </w:rPr>
+        <w:t xml:space="preserve"> </w:t>
+      </w:r>
+      <w:proofErr w:type="gramStart"/>
+      <w:r>
+        <w:rPr>
+          <w:rFonts w:ascii="Palatino Linotype" w:hAnsi="Palatino Linotype" w:cs="Times New Roman (Headings CS)"/>
+          <w:b/>
+          <w:caps/>
+          <w:color w:val="auto"/>
+          <w:spacing w:val="13"/>
+          <w:kern w:val="16"/>
+          <w:sz w:val="22"/>
+          <w:szCs w:val="48"/>
+          <w:lang w:eastAsia="en-US"/>
+          <w14:numForm w14:val="lining"/>
+          <w14:numSpacing w14:val="tabular"/>
+        </w:rPr>
+        <w:t>CONCLUSION</w:t>
+      </w:r>
+      <w:proofErr w:type="gramEnd"/>
+    </w:p>
+    <w:p>
+      <w:pPr>
+        <w:jc w:val="both"/>
+        <w:rPr>
+          <w:rFonts w:ascii="Palatino Linotype" w:eastAsia="Times New Roman" w:hAnsi="Palatino Linotype" w:cs="Times New Roman"/>
+          <w:spacing w:val="2"/>
+          <w:kern w:val="16"/>
+          <w:sz w:val="22"/>
+          <w:szCs w:val="22"/>
+          <w:lang w:eastAsia="en-US"/>
+          <w14:numForm w14:val="oldStyle"/>
+          <w14:numSpacing w14:val="proportional"/>
+        </w:rPr>
+      </w:pPr>
+      <w:r>
+        <w:rPr>
+          <w:rFonts w:ascii="Palatino Linotype" w:eastAsia="Times New Roman" w:hAnsi="Palatino Linotype" w:cs="Times New Roman"/>
+          <w:spacing w:val="2"/>
+          <w:kern w:val="16"/>
+          <w:sz w:val="22"/>
+          <w:szCs w:val="22"/>
+          <w:lang w:eastAsia="en-US"/>
+          <w14:numForm w14:val="oldStyle"/>
+          <w14:numSpacing w14:val="proportional"/>
+        </w:rPr>
+        <w:t>This paper presented Mandarin Tone Coach, a web-based computer-assisted</w:t>
+      </w:r>
+      <w:r>
+        <w:rPr>
+          <w:rFonts w:ascii="Palatino Linotype" w:eastAsia="Times New Roman" w:hAnsi="Palatino Linotype" w:cs="Times New Roman"/>
+          <w:spacing w:val="2"/>
+          <w:kern w:val="16"/>
+          <w:sz w:val="22"/>
+          <w:szCs w:val="22"/>
+          <w:lang w:eastAsia="en-US"/>
+          <w14:numForm w14:val="oldStyle"/>
+          <w14:numSpacing w14:val="proportional"/>
+        </w:rPr>
+        <w:t xml:space="preserve"> </w:t>
+      </w:r>
+      <w:r>
+        <w:rPr>
+          <w:rFonts w:ascii="Palatino Linotype" w:eastAsia="Times New Roman" w:hAnsi="Palatino Linotype" w:cs="Times New Roman"/>
+          <w:spacing w:val="2"/>
+          <w:kern w:val="16"/>
+          <w:sz w:val="22"/>
+          <w:szCs w:val="22"/>
+          <w:lang w:eastAsia="en-US"/>
+          <w14:numForm w14:val="oldStyle"/>
+          <w14:numSpacing w14:val="proportional"/>
+        </w:rPr>
+        <w:t>pronunciation training system designed to help speakers of non-tonal languages</w:t>
+      </w:r>
+      <w:r>
+        <w:rPr>
+          <w:rFonts w:ascii="Palatino Linotype" w:eastAsia="Times New Roman" w:hAnsi="Palatino Linotype" w:cs="Times New Roman"/>
+          <w:spacing w:val="2"/>
+          <w:kern w:val="16"/>
+          <w:sz w:val="22"/>
+          <w:szCs w:val="22"/>
+          <w:lang w:eastAsia="en-US"/>
+          <w14:numForm w14:val="oldStyle"/>
+          <w14:numSpacing w14:val="proportional"/>
+        </w:rPr>
+        <w:t xml:space="preserve"> </w:t>
+      </w:r>
+      <w:r>
+        <w:rPr>
+          <w:rFonts w:ascii="Palatino Linotype" w:eastAsia="Times New Roman" w:hAnsi="Palatino Linotype" w:cs="Times New Roman"/>
+          <w:spacing w:val="2"/>
+          <w:kern w:val="16"/>
+          <w:sz w:val="22"/>
+          <w:szCs w:val="22"/>
+          <w:lang w:eastAsia="en-US"/>
+          <w14:numForm w14:val="oldStyle"/>
+          <w14:numSpacing w14:val="proportional"/>
+        </w:rPr>
+        <w:t>develop perceptual and productive competence in the four Mandarin tones. The</w:t>
+      </w:r>
+      <w:r>
+        <w:rPr>
+          <w:rFonts w:ascii="Palatino Linotype" w:eastAsia="Times New Roman" w:hAnsi="Palatino Linotype" w:cs="Times New Roman"/>
+          <w:spacing w:val="2"/>
+          <w:kern w:val="16"/>
+          <w:sz w:val="22"/>
+          <w:szCs w:val="22"/>
+          <w:lang w:eastAsia="en-US"/>
+          <w14:numForm w14:val="oldStyle"/>
+          <w14:numSpacing w14:val="proportional"/>
+        </w:rPr>
+        <w:t xml:space="preserve"> </w:t>
+      </w:r>
+      <w:r>
+        <w:rPr>
+          <w:rFonts w:ascii="Palatino Linotype" w:eastAsia="Times New Roman" w:hAnsi="Palatino Linotype" w:cs="Times New Roman"/>
+          <w:spacing w:val="2"/>
+          <w:kern w:val="16"/>
+          <w:sz w:val="22"/>
+          <w:szCs w:val="22"/>
+          <w:lang w:eastAsia="en-US"/>
+          <w14:numForm w14:val="oldStyle"/>
+          <w14:numSpacing w14:val="proportional"/>
+        </w:rPr>
+        <w:t>system combined an SVM classifier trained on speaker-normalized pitch features</w:t>
+      </w:r>
+      <w:r>
+        <w:rPr>
+          <w:rFonts w:ascii="Palatino Linotype" w:eastAsia="Times New Roman" w:hAnsi="Palatino Linotype" w:cs="Times New Roman"/>
+          <w:spacing w:val="2"/>
+          <w:kern w:val="16"/>
+          <w:sz w:val="22"/>
+          <w:szCs w:val="22"/>
+          <w:lang w:eastAsia="en-US"/>
+          <w14:numForm w14:val="oldStyle"/>
+          <w14:numSpacing w14:val="proportional"/>
+        </w:rPr>
+        <w:t xml:space="preserve"> - </w:t>
+      </w:r>
+      <w:r>
+        <w:rPr>
+          <w:rFonts w:ascii="Palatino Linotype" w:eastAsia="Times New Roman" w:hAnsi="Palatino Linotype" w:cs="Times New Roman"/>
+          <w:spacing w:val="2"/>
+          <w:kern w:val="16"/>
+          <w:sz w:val="22"/>
+          <w:szCs w:val="22"/>
+          <w:lang w:eastAsia="en-US"/>
+          <w14:numForm w14:val="oldStyle"/>
+          <w14:numSpacing w14:val="proportional"/>
+        </w:rPr>
+        <w:t>achieving 91.95% speaker-independent accuracy</w:t>
+      </w:r>
+      <w:r>
+        <w:rPr>
+          <w:rFonts w:ascii="Palatino Linotype" w:eastAsia="Times New Roman" w:hAnsi="Palatino Linotype" w:cs="Times New Roman"/>
+          <w:spacing w:val="2"/>
+          <w:kern w:val="16"/>
+          <w:sz w:val="22"/>
+          <w:szCs w:val="22"/>
+          <w:lang w:eastAsia="en-US"/>
+          <w14:numForm w14:val="oldStyle"/>
+          <w14:numSpacing w14:val="proportional"/>
+        </w:rPr>
+        <w:t xml:space="preserve"> - </w:t>
+      </w:r>
+      <w:r>
+        <w:rPr>
+          <w:rFonts w:ascii="Palatino Linotype" w:eastAsia="Times New Roman" w:hAnsi="Palatino Linotype" w:cs="Times New Roman"/>
+          <w:spacing w:val="2"/>
+          <w:kern w:val="16"/>
+          <w:sz w:val="22"/>
+          <w:szCs w:val="22"/>
+          <w:lang w:eastAsia="en-US"/>
+          <w14:numForm w14:val="oldStyle"/>
+          <w14:numSpacing w14:val="proportional"/>
+        </w:rPr>
+        <w:t>with real-time pitch</w:t>
+      </w:r>
+      <w:r>
+        <w:rPr>
+          <w:rFonts w:ascii="Palatino Linotype" w:eastAsia="Times New Roman" w:hAnsi="Palatino Linotype" w:cs="Times New Roman"/>
+          <w:spacing w:val="2"/>
+          <w:kern w:val="16"/>
+          <w:sz w:val="22"/>
+          <w:szCs w:val="22"/>
+          <w:lang w:eastAsia="en-US"/>
+          <w14:numForm w14:val="oldStyle"/>
+          <w14:numSpacing w14:val="proportional"/>
+        </w:rPr>
+        <w:t xml:space="preserve"> </w:t>
+      </w:r>
+      <w:r>
+        <w:rPr>
+          <w:rFonts w:ascii="Palatino Linotype" w:eastAsia="Times New Roman" w:hAnsi="Palatino Linotype" w:cs="Times New Roman"/>
+          <w:spacing w:val="2"/>
+          <w:kern w:val="16"/>
+          <w:sz w:val="22"/>
+          <w:szCs w:val="22"/>
+          <w:lang w:eastAsia="en-US"/>
+          <w14:numForm w14:val="oldStyle"/>
+          <w14:numSpacing w14:val="proportional"/>
+        </w:rPr>
+        <w:t>contour visualization and tone-pair-specific corrective feedback, deploye</w:t>
+      </w:r>
+      <w:r>
+        <w:rPr>
+          <w:rFonts w:ascii="Palatino Linotype" w:eastAsia="Times New Roman" w:hAnsi="Palatino Linotype" w:cs="Times New Roman"/>
+          <w:spacing w:val="2"/>
+          <w:kern w:val="16"/>
+          <w:sz w:val="22"/>
+          <w:szCs w:val="22"/>
+          <w:lang w:eastAsia="en-US"/>
+          <w14:numForm w14:val="oldStyle"/>
+          <w14:numSpacing w14:val="proportional"/>
+        </w:rPr>
+        <w:t xml:space="preserve">d </w:t>
+      </w:r>
+      <w:r>
+        <w:rPr>
+          <w:rFonts w:ascii="Palatino Linotype" w:eastAsia="Times New Roman" w:hAnsi="Palatino Linotype" w:cs="Times New Roman"/>
+          <w:spacing w:val="2"/>
+          <w:kern w:val="16"/>
+          <w:sz w:val="22"/>
+          <w:szCs w:val="22"/>
+          <w:lang w:eastAsia="en-US"/>
+          <w14:numForm w14:val="oldStyle"/>
+          <w14:numSpacing w14:val="proportional"/>
+        </w:rPr>
+        <w:t>across monosyllabic and disyllabic practice modes.</w:t>
+      </w:r>
+    </w:p>
+    <w:p>
+      <w:pPr>
+        <w:jc w:val="both"/>
+        <w:rPr>
+          <w:rFonts w:ascii="Palatino Linotype" w:eastAsia="Times New Roman" w:hAnsi="Palatino Linotype" w:cs="Times New Roman"/>
+          <w:spacing w:val="2"/>
+          <w:kern w:val="16"/>
+          <w:sz w:val="22"/>
+          <w:szCs w:val="22"/>
+          <w:lang w:eastAsia="en-US"/>
+          <w14:numForm w14:val="oldStyle"/>
+          <w14:numSpacing w14:val="proportional"/>
+        </w:rPr>
+      </w:pPr>
+      <w:r>
+        <w:rPr>
+          <w:rFonts w:ascii="Palatino Linotype" w:eastAsia="Times New Roman" w:hAnsi="Palatino Linotype" w:cs="Times New Roman"/>
+          <w:spacing w:val="2"/>
+          <w:kern w:val="16"/>
+          <w:sz w:val="22"/>
+          <w:szCs w:val="22"/>
+          <w:lang w:eastAsia="en-US"/>
+          <w14:numForm w14:val="oldStyle"/>
+          <w14:numSpacing w14:val="proportional"/>
+        </w:rPr>
+        <w:t>A pilot study with thirteen paired participants found a mean improvement of</w:t>
+      </w:r>
+      <w:r>
+        <w:rPr>
+          <w:rFonts w:ascii="Palatino Linotype" w:eastAsia="Times New Roman" w:hAnsi="Palatino Linotype" w:cs="Times New Roman"/>
+          <w:spacing w:val="2"/>
+          <w:kern w:val="16"/>
+          <w:sz w:val="22"/>
+          <w:szCs w:val="22"/>
+          <w:lang w:eastAsia="en-US"/>
+          <w14:numForm w14:val="oldStyle"/>
+          <w14:numSpacing w14:val="proportional"/>
+        </w:rPr>
+        <w:t xml:space="preserve"> </w:t>
+      </w:r>
+      <w:r>
+        <w:rPr>
+          <w:rFonts w:ascii="Palatino Linotype" w:eastAsia="Times New Roman" w:hAnsi="Palatino Linotype" w:cs="Times New Roman"/>
+          <w:spacing w:val="2"/>
+          <w:kern w:val="16"/>
+          <w:sz w:val="22"/>
+          <w:szCs w:val="22"/>
+          <w:lang w:eastAsia="en-US"/>
+          <w14:numForm w14:val="oldStyle"/>
+          <w14:numSpacing w14:val="proportional"/>
+        </w:rPr>
+        <w:t>10.3</w:t>
+      </w:r>
+      <w:r>
+        <w:rPr>
+          <w:rFonts w:ascii="Palatino Linotype" w:eastAsia="Times New Roman" w:hAnsi="Palatino Linotype" w:cs="Times New Roman"/>
+          <w:spacing w:val="2"/>
+          <w:kern w:val="16"/>
+          <w:sz w:val="22"/>
+          <w:szCs w:val="22"/>
+          <w:lang w:eastAsia="en-US"/>
+          <w14:numForm w14:val="oldStyle"/>
+          <w14:numSpacing w14:val="proportional"/>
+        </w:rPr>
+        <w:t>%</w:t>
+      </w:r>
+      <w:r>
+        <w:rPr>
+          <w:rFonts w:ascii="Palatino Linotype" w:eastAsia="Times New Roman" w:hAnsi="Palatino Linotype" w:cs="Times New Roman"/>
+          <w:spacing w:val="2"/>
+          <w:kern w:val="16"/>
+          <w:sz w:val="22"/>
+          <w:szCs w:val="22"/>
+          <w:lang w:eastAsia="en-US"/>
+          <w14:numForm w14:val="oldStyle"/>
+          <w14:numSpacing w14:val="proportional"/>
+        </w:rPr>
+        <w:t xml:space="preserve"> in tone perception accuracy following a single practice</w:t>
+      </w:r>
+      <w:r>
+        <w:rPr>
+          <w:rFonts w:ascii="Palatino Linotype" w:eastAsia="Times New Roman" w:hAnsi="Palatino Linotype" w:cs="Times New Roman"/>
+          <w:spacing w:val="2"/>
+          <w:kern w:val="16"/>
+          <w:sz w:val="22"/>
+          <w:szCs w:val="22"/>
+          <w:lang w:eastAsia="en-US"/>
+          <w14:numForm w14:val="oldStyle"/>
+          <w14:numSpacing w14:val="proportional"/>
+        </w:rPr>
+        <w:t xml:space="preserve"> </w:t>
+      </w:r>
+      <w:r>
+        <w:rPr>
+          <w:rFonts w:ascii="Palatino Linotype" w:eastAsia="Times New Roman" w:hAnsi="Palatino Linotype" w:cs="Times New Roman"/>
+          <w:spacing w:val="2"/>
+          <w:kern w:val="16"/>
+          <w:sz w:val="22"/>
+          <w:szCs w:val="22"/>
+          <w:lang w:eastAsia="en-US"/>
+          <w14:numForm w14:val="oldStyle"/>
+          <w14:numSpacing w14:val="proportional"/>
+        </w:rPr>
+        <w:t>session, with the largest gains observed in Tone 3, the contour most</w:t>
+      </w:r>
+      <w:r>
+        <w:rPr>
+          <w:rFonts w:ascii="Palatino Linotype" w:eastAsia="Times New Roman" w:hAnsi="Palatino Linotype" w:cs="Times New Roman"/>
+          <w:spacing w:val="2"/>
+          <w:kern w:val="16"/>
+          <w:sz w:val="22"/>
+          <w:szCs w:val="22"/>
+          <w:lang w:eastAsia="en-US"/>
+          <w14:numForm w14:val="oldStyle"/>
+          <w14:numSpacing w14:val="proportional"/>
+        </w:rPr>
+        <w:t xml:space="preserve"> </w:t>
+      </w:r>
+      <w:r>
+        <w:rPr>
+          <w:rFonts w:ascii="Palatino Linotype" w:eastAsia="Times New Roman" w:hAnsi="Palatino Linotype" w:cs="Times New Roman"/>
+          <w:spacing w:val="2"/>
+          <w:kern w:val="16"/>
+          <w:sz w:val="22"/>
+          <w:szCs w:val="22"/>
+          <w:lang w:eastAsia="en-US"/>
+          <w14:numForm w14:val="oldStyle"/>
+          <w14:numSpacing w14:val="proportional"/>
+        </w:rPr>
+        <w:t>challenging for non-tonal language learners. Although the result did not reach</w:t>
+      </w:r>
+      <w:r>
+        <w:rPr>
+          <w:rFonts w:ascii="Palatino Linotype" w:eastAsia="Times New Roman" w:hAnsi="Palatino Linotype" w:cs="Times New Roman"/>
+          <w:spacing w:val="2"/>
+          <w:kern w:val="16"/>
+          <w:sz w:val="22"/>
+          <w:szCs w:val="22"/>
+          <w:lang w:eastAsia="en-US"/>
+          <w14:numForm w14:val="oldStyle"/>
+          <w14:numSpacing w14:val="proportional"/>
+        </w:rPr>
+        <w:t xml:space="preserve"> </w:t>
+      </w:r>
+      <w:r>
+        <w:rPr>
+          <w:rFonts w:ascii="Palatino Linotype" w:eastAsia="Times New Roman" w:hAnsi="Palatino Linotype" w:cs="Times New Roman"/>
+          <w:spacing w:val="2"/>
+          <w:kern w:val="16"/>
+          <w:sz w:val="22"/>
+          <w:szCs w:val="22"/>
+          <w:lang w:eastAsia="en-US"/>
+          <w14:numForm w14:val="oldStyle"/>
+          <w14:numSpacing w14:val="proportional"/>
+        </w:rPr>
+        <w:t>statistical significance at the current sample size, the direction and</w:t>
+      </w:r>
+      <w:r>
+        <w:rPr>
+          <w:rFonts w:ascii="Palatino Linotype" w:eastAsia="Times New Roman" w:hAnsi="Palatino Linotype" w:cs="Times New Roman"/>
+          <w:spacing w:val="2"/>
+          <w:kern w:val="16"/>
+          <w:sz w:val="22"/>
+          <w:szCs w:val="22"/>
+          <w:lang w:eastAsia="en-US"/>
+          <w14:numForm w14:val="oldStyle"/>
+          <w14:numSpacing w14:val="proportional"/>
+        </w:rPr>
+        <w:t xml:space="preserve"> </w:t>
+      </w:r>
+      <w:r>
+        <w:rPr>
+          <w:rFonts w:ascii="Palatino Linotype" w:eastAsia="Times New Roman" w:hAnsi="Palatino Linotype" w:cs="Times New Roman"/>
+          <w:spacing w:val="2"/>
+          <w:kern w:val="16"/>
+          <w:sz w:val="22"/>
+          <w:szCs w:val="22"/>
+          <w:lang w:eastAsia="en-US"/>
+          <w14:numForm w14:val="oldStyle"/>
+          <w14:numSpacing w14:val="proportional"/>
+        </w:rPr>
+        <w:t>magnitude of the effect are consistent with prior CAPT research. Usability</w:t>
+      </w:r>
+      <w:r>
+        <w:rPr>
+          <w:rFonts w:ascii="Palatino Linotype" w:eastAsia="Times New Roman" w:hAnsi="Palatino Linotype" w:cs="Times New Roman"/>
+          <w:spacing w:val="2"/>
+          <w:kern w:val="16"/>
+          <w:sz w:val="22"/>
+          <w:szCs w:val="22"/>
+          <w:lang w:eastAsia="en-US"/>
+          <w14:numForm w14:val="oldStyle"/>
+          <w14:numSpacing w14:val="proportional"/>
+        </w:rPr>
+        <w:t xml:space="preserve"> </w:t>
+      </w:r>
+      <w:r>
+        <w:rPr>
+          <w:rFonts w:ascii="Palatino Linotype" w:eastAsia="Times New Roman" w:hAnsi="Palatino Linotype" w:cs="Times New Roman"/>
+          <w:spacing w:val="2"/>
+          <w:kern w:val="16"/>
+          <w:sz w:val="22"/>
+          <w:szCs w:val="22"/>
+          <w:lang w:eastAsia="en-US"/>
+          <w14:numForm w14:val="oldStyle"/>
+          <w14:numSpacing w14:val="proportional"/>
+        </w:rPr>
+        <w:t xml:space="preserve">ratings averaged 3.96 out of 5 across </w:t>
+      </w:r>
+      <w:r>
+        <w:rPr>
+          <w:rFonts w:ascii="Palatino Linotype" w:eastAsia="Times New Roman" w:hAnsi="Palatino Linotype" w:cs="Times New Roman"/>
+          <w:spacing w:val="2"/>
+          <w:kern w:val="16"/>
+          <w:sz w:val="22"/>
+          <w:szCs w:val="22"/>
+          <w:lang w:eastAsia="en-US"/>
+          <w14:numForm w14:val="oldStyle"/>
+          <w14:numSpacing w14:val="proportional"/>
+        </w:rPr>
+        <w:t>16</w:t>
+      </w:r>
+      <w:r>
+        <w:rPr>
+          <w:rFonts w:ascii="Palatino Linotype" w:eastAsia="Times New Roman" w:hAnsi="Palatino Linotype" w:cs="Times New Roman"/>
+          <w:spacing w:val="2"/>
+          <w:kern w:val="16"/>
+          <w:sz w:val="22"/>
+          <w:szCs w:val="22"/>
+          <w:lang w:eastAsia="en-US"/>
+          <w14:numForm w14:val="oldStyle"/>
+          <w14:numSpacing w14:val="proportional"/>
+        </w:rPr>
+        <w:t xml:space="preserve"> survey respondents, with</w:t>
+      </w:r>
+      <w:r>
+        <w:rPr>
+          <w:rFonts w:ascii="Palatino Linotype" w:eastAsia="Times New Roman" w:hAnsi="Palatino Linotype" w:cs="Times New Roman"/>
+          <w:spacing w:val="2"/>
+          <w:kern w:val="16"/>
+          <w:sz w:val="22"/>
+          <w:szCs w:val="22"/>
+          <w:lang w:eastAsia="en-US"/>
+          <w14:numForm w14:val="oldStyle"/>
+          <w14:numSpacing w14:val="proportional"/>
+        </w:rPr>
+        <w:t xml:space="preserve"> </w:t>
+      </w:r>
+      <w:r>
+        <w:rPr>
+          <w:rFonts w:ascii="Palatino Linotype" w:eastAsia="Times New Roman" w:hAnsi="Palatino Linotype" w:cs="Times New Roman"/>
+          <w:spacing w:val="2"/>
+          <w:kern w:val="16"/>
+          <w:sz w:val="22"/>
+          <w:szCs w:val="22"/>
+          <w:lang w:eastAsia="en-US"/>
+          <w14:numForm w14:val="oldStyle"/>
+          <w14:numSpacing w14:val="proportional"/>
+        </w:rPr>
+        <w:t>participants particularly endorsing the app's overall usefulness and the pitch</w:t>
+      </w:r>
+      <w:r>
+        <w:rPr>
+          <w:rFonts w:ascii="Palatino Linotype" w:eastAsia="Times New Roman" w:hAnsi="Palatino Linotype" w:cs="Times New Roman"/>
+          <w:spacing w:val="2"/>
+          <w:kern w:val="16"/>
+          <w:sz w:val="22"/>
+          <w:szCs w:val="22"/>
+          <w:lang w:eastAsia="en-US"/>
+          <w14:numForm w14:val="oldStyle"/>
+          <w14:numSpacing w14:val="proportional"/>
+        </w:rPr>
+        <w:t xml:space="preserve"> </w:t>
+      </w:r>
+      <w:r>
+        <w:rPr>
+          <w:rFonts w:ascii="Palatino Linotype" w:eastAsia="Times New Roman" w:hAnsi="Palatino Linotype" w:cs="Times New Roman"/>
+          <w:spacing w:val="2"/>
+          <w:kern w:val="16"/>
+          <w:sz w:val="22"/>
+          <w:szCs w:val="22"/>
+          <w:lang w:eastAsia="en-US"/>
+          <w14:numForm w14:val="oldStyle"/>
+          <w14:numSpacing w14:val="proportional"/>
+        </w:rPr>
+        <w:t>contour visualization as a learning tool.</w:t>
+      </w:r>
+    </w:p>
+    <w:p>
+      <w:pPr>
+        <w:jc w:val="both"/>
+        <w:rPr>
+          <w:rFonts w:ascii="Palatino Linotype" w:eastAsia="Times New Roman" w:hAnsi="Palatino Linotype" w:cs="Times New Roman"/>
+          <w:spacing w:val="2"/>
+          <w:kern w:val="16"/>
+          <w:sz w:val="22"/>
+          <w:szCs w:val="22"/>
+          <w:lang w:eastAsia="en-US"/>
+          <w14:numForm w14:val="oldStyle"/>
+          <w14:numSpacing w14:val="proportional"/>
+        </w:rPr>
+      </w:pPr>
+      <w:r>
+        <w:rPr>
+          <w:rFonts w:ascii="Palatino Linotype" w:eastAsia="Times New Roman" w:hAnsi="Palatino Linotype" w:cs="Times New Roman"/>
+          <w:spacing w:val="2"/>
+          <w:kern w:val="16"/>
+          <w:sz w:val="22"/>
+          <w:szCs w:val="22"/>
+          <w:lang w:eastAsia="en-US"/>
+          <w14:numForm w14:val="oldStyle"/>
+          <w14:numSpacing w14:val="proportional"/>
+        </w:rPr>
+        <w:t>These findings suggest that lightweight, browser-based CAPT tools can produce</w:t>
+      </w:r>
+      <w:r>
+        <w:rPr>
+          <w:rFonts w:ascii="Palatino Linotype" w:eastAsia="Times New Roman" w:hAnsi="Palatino Linotype" w:cs="Times New Roman"/>
+          <w:spacing w:val="2"/>
+          <w:kern w:val="16"/>
+          <w:sz w:val="22"/>
+          <w:szCs w:val="22"/>
+          <w:lang w:eastAsia="en-US"/>
+          <w14:numForm w14:val="oldStyle"/>
+          <w14:numSpacing w14:val="proportional"/>
+        </w:rPr>
+        <w:t xml:space="preserve"> </w:t>
+      </w:r>
+      <w:r>
+        <w:rPr>
+          <w:rFonts w:ascii="Palatino Linotype" w:eastAsia="Times New Roman" w:hAnsi="Palatino Linotype" w:cs="Times New Roman"/>
+          <w:spacing w:val="2"/>
+          <w:kern w:val="16"/>
+          <w:sz w:val="22"/>
+          <w:szCs w:val="22"/>
+          <w:lang w:eastAsia="en-US"/>
+          <w14:numForm w14:val="oldStyle"/>
+          <w14:numSpacing w14:val="proportional"/>
+        </w:rPr>
+        <w:t xml:space="preserve">meaningful perceptual gains with minimal instructional </w:t>
+      </w:r>
+      <w:proofErr w:type="gramStart"/>
+      <w:r>
+        <w:rPr>
+          <w:rFonts w:ascii="Palatino Linotype" w:eastAsia="Times New Roman" w:hAnsi="Palatino Linotype" w:cs="Times New Roman"/>
+          <w:spacing w:val="2"/>
+          <w:kern w:val="16"/>
+          <w:sz w:val="22"/>
+          <w:szCs w:val="22"/>
+          <w:lang w:eastAsia="en-US"/>
+          <w14:numForm w14:val="oldStyle"/>
+          <w14:numSpacing w14:val="proportional"/>
+        </w:rPr>
+        <w:t>overhead, and</w:t>
+      </w:r>
+      <w:proofErr w:type="gramEnd"/>
+      <w:r>
+        <w:rPr>
+          <w:rFonts w:ascii="Palatino Linotype" w:eastAsia="Times New Roman" w:hAnsi="Palatino Linotype" w:cs="Times New Roman"/>
+          <w:spacing w:val="2"/>
+          <w:kern w:val="16"/>
+          <w:sz w:val="22"/>
+          <w:szCs w:val="22"/>
+          <w:lang w:eastAsia="en-US"/>
+          <w14:numForm w14:val="oldStyle"/>
+          <w14:numSpacing w14:val="proportional"/>
+        </w:rPr>
+        <w:t xml:space="preserve"> provide a</w:t>
+      </w:r>
+      <w:r>
+        <w:rPr>
+          <w:rFonts w:ascii="Palatino Linotype" w:eastAsia="Times New Roman" w:hAnsi="Palatino Linotype" w:cs="Times New Roman"/>
+          <w:spacing w:val="2"/>
+          <w:kern w:val="16"/>
+          <w:sz w:val="22"/>
+          <w:szCs w:val="22"/>
+          <w:lang w:eastAsia="en-US"/>
+          <w14:numForm w14:val="oldStyle"/>
+          <w14:numSpacing w14:val="proportional"/>
+        </w:rPr>
+        <w:t xml:space="preserve"> </w:t>
+      </w:r>
+      <w:r>
+        <w:rPr>
+          <w:rFonts w:ascii="Palatino Linotype" w:eastAsia="Times New Roman" w:hAnsi="Palatino Linotype" w:cs="Times New Roman"/>
+          <w:spacing w:val="2"/>
+          <w:kern w:val="16"/>
+          <w:sz w:val="22"/>
+          <w:szCs w:val="22"/>
+          <w:lang w:eastAsia="en-US"/>
+          <w14:numForm w14:val="oldStyle"/>
+          <w14:numSpacing w14:val="proportional"/>
+        </w:rPr>
+        <w:t>foundation for future work exploring larger-scale deployment, longitudinal</w:t>
+      </w:r>
+      <w:r>
+        <w:rPr>
+          <w:rFonts w:ascii="Palatino Linotype" w:eastAsia="Times New Roman" w:hAnsi="Palatino Linotype" w:cs="Times New Roman"/>
+          <w:spacing w:val="2"/>
+          <w:kern w:val="16"/>
+          <w:sz w:val="22"/>
+          <w:szCs w:val="22"/>
+          <w:lang w:eastAsia="en-US"/>
+          <w14:numForm w14:val="oldStyle"/>
+          <w14:numSpacing w14:val="proportional"/>
+        </w:rPr>
+        <w:t xml:space="preserve"> </w:t>
+      </w:r>
+      <w:r>
+        <w:rPr>
+          <w:rFonts w:ascii="Palatino Linotype" w:eastAsia="Times New Roman" w:hAnsi="Palatino Linotype" w:cs="Times New Roman"/>
+          <w:spacing w:val="2"/>
+          <w:kern w:val="16"/>
+          <w:sz w:val="22"/>
+          <w:szCs w:val="22"/>
+          <w:lang w:eastAsia="en-US"/>
+          <w14:numForm w14:val="oldStyle"/>
+          <w14:numSpacing w14:val="proportional"/>
+        </w:rPr>
+        <w:t>retention, and adaptive feedback mechanisms.</w:t>
+      </w:r>
+    </w:p>
+    <w:p>
+      <w:pPr>
+        <w:pStyle w:val="Heading4"/>
+        <w:rPr>
+          <w:rFonts w:ascii="Palatino Linotype" w:hAnsi="Palatino Linotype"/>
+          <w:b/>
+          <w:bCs/>
+          <w:i w:val="0"/>
+          <w:iCs w:val="0"/>
+          <w:color w:val="auto"/>
+        </w:rPr>
+      </w:pPr>
+      <w:r>
+        <w:rPr>
+          <w:rFonts w:ascii="Palatino Linotype" w:hAnsi="Palatino Linotype"/>
+          <w:b/>
+          <w:bCs/>
+          <w:i w:val="0"/>
+          <w:iCs w:val="0"/>
+          <w:color w:val="auto"/>
+        </w:rPr>
+        <w:lastRenderedPageBreak/>
+        <w:t xml:space="preserve">7 </w:t>
+      </w:r>
+      <w:r>
+        <w:rPr>
+          <w:rFonts w:ascii="Palatino Linotype" w:hAnsi="Palatino Linotype"/>
+          <w:b/>
+          <w:bCs/>
+          <w:i w:val="0"/>
+          <w:iCs w:val="0"/>
+          <w:color w:val="auto"/>
+        </w:rPr>
+        <w:t>REFERENCES</w:t>
+      </w:r>
+    </w:p>
+    <w:p>
+      <w:pPr>
+        <w:pStyle w:val="ListParagraph"/>
+        <w:numPr>
+          <w:ilvl w:val="0"/>
+          <w:numId w:val="1"/>
+        </w:numPr>
+        <w:spacing w:before="240" w:after="240" w:line="276" w:lineRule="auto"/>
+        <w:jc w:val="both"/>
+        <w:rPr>
+          <w:rFonts w:ascii="Palatino Linotype" w:hAnsi="Palatino Linotype"/>
+          <w:color w:val="1155CC"/>
+          <w:u w:val="single"/>
+        </w:rPr>
+      </w:pPr>
+      <w:proofErr w:type="spellStart"/>
+      <w:r>
+        <w:rPr>
+          <w:rFonts w:ascii="Palatino Linotype" w:hAnsi="Palatino Linotype"/>
+        </w:rPr>
+        <w:t>Amrate</w:t>
+      </w:r>
+      <w:proofErr w:type="spellEnd"/>
+      <w:r>
+        <w:rPr>
+          <w:rFonts w:ascii="Palatino Linotype" w:hAnsi="Palatino Linotype"/>
+        </w:rPr>
+        <w:t xml:space="preserve">, M., &amp; Tsai, P. (2025). Computer-assisted pronunciation training: A systematic review. </w:t>
+      </w:r>
+      <w:proofErr w:type="spellStart"/>
+      <w:r>
+        <w:rPr>
+          <w:rFonts w:ascii="Palatino Linotype" w:hAnsi="Palatino Linotype"/>
+          <w:i/>
+          <w:iCs/>
+        </w:rPr>
+        <w:t>ReCALL</w:t>
+      </w:r>
+      <w:proofErr w:type="spellEnd"/>
+      <w:r>
+        <w:rPr>
+          <w:rFonts w:ascii="Palatino Linotype" w:hAnsi="Palatino Linotype"/>
+          <w:i/>
+          <w:iCs/>
+        </w:rPr>
+        <w:t>, 37</w:t>
+      </w:r>
+      <w:r>
+        <w:rPr>
+          <w:rFonts w:ascii="Palatino Linotype" w:hAnsi="Palatino Linotype"/>
+        </w:rPr>
+        <w:t>(1), 22–42.</w:t>
+      </w:r>
+      <w:hyperlink r:id="rId8">
+        <w:r>
+          <w:rPr>
+            <w:rFonts w:ascii="Palatino Linotype" w:hAnsi="Palatino Linotype"/>
+          </w:rPr>
+          <w:t xml:space="preserve"> </w:t>
+        </w:r>
+      </w:hyperlink>
+      <w:hyperlink r:id="rId9">
+        <w:r>
+          <w:rPr>
+            <w:rFonts w:ascii="Palatino Linotype" w:hAnsi="Palatino Linotype"/>
+            <w:color w:val="1155CC"/>
+            <w:u w:val="single"/>
+          </w:rPr>
+          <w:t>https://doi.org/10.1017/S0958344024000181</w:t>
+        </w:r>
+      </w:hyperlink>
+    </w:p>
+    <w:p>
+      <w:pPr>
+        <w:pStyle w:val="ListParagraph"/>
+        <w:numPr>
+          <w:ilvl w:val="0"/>
+          <w:numId w:val="1"/>
+        </w:numPr>
+        <w:spacing w:before="240" w:after="240" w:line="276" w:lineRule="auto"/>
+        <w:jc w:val="both"/>
+        <w:rPr>
+          <w:rFonts w:ascii="Palatino Linotype" w:hAnsi="Palatino Linotype"/>
+          <w:color w:val="1155CC"/>
+          <w:u w:val="single"/>
+        </w:rPr>
+      </w:pPr>
+      <w:r>
+        <w:rPr>
+          <w:rFonts w:ascii="Palatino Linotype" w:hAnsi="Palatino Linotype"/>
+        </w:rPr>
+        <w:t xml:space="preserve">Bu, X., Guo, W., Yang, H., et al. (2025). Evaluating Mandarin tone pronunciation accuracy for second language learners using a </w:t>
+      </w:r>
+      <w:proofErr w:type="spellStart"/>
+      <w:r>
+        <w:rPr>
+          <w:rFonts w:ascii="Palatino Linotype" w:hAnsi="Palatino Linotype"/>
+        </w:rPr>
+        <w:t>ResNet</w:t>
+      </w:r>
+      <w:proofErr w:type="spellEnd"/>
+      <w:r>
+        <w:rPr>
+          <w:rFonts w:ascii="Palatino Linotype" w:hAnsi="Palatino Linotype"/>
+        </w:rPr>
+        <w:t xml:space="preserve">-based Siamese network. </w:t>
+      </w:r>
+      <w:r>
+        <w:rPr>
+          <w:rFonts w:ascii="Palatino Linotype" w:hAnsi="Palatino Linotype"/>
+          <w:i/>
+          <w:iCs/>
+        </w:rPr>
+        <w:t>Scientific Reports, 15</w:t>
+      </w:r>
+      <w:r>
+        <w:rPr>
+          <w:rFonts w:ascii="Palatino Linotype" w:hAnsi="Palatino Linotype"/>
+        </w:rPr>
+        <w:t>, Article 24558.</w:t>
+      </w:r>
+      <w:hyperlink r:id="rId10">
+        <w:r>
+          <w:rPr>
+            <w:rFonts w:ascii="Palatino Linotype" w:hAnsi="Palatino Linotype"/>
+          </w:rPr>
+          <w:t xml:space="preserve"> </w:t>
+        </w:r>
+      </w:hyperlink>
+      <w:hyperlink r:id="rId11">
+        <w:r>
+          <w:rPr>
+            <w:rFonts w:ascii="Palatino Linotype" w:hAnsi="Palatino Linotype"/>
+            <w:color w:val="1155CC"/>
+            <w:u w:val="single"/>
+          </w:rPr>
+          <w:t>https://doi.org/10.1038/s41598-025-08544-8</w:t>
+        </w:r>
+      </w:hyperlink>
+    </w:p>
+    <w:p>
+      <w:pPr>
+        <w:pStyle w:val="ListParagraph"/>
+        <w:numPr>
+          <w:ilvl w:val="0"/>
+          <w:numId w:val="1"/>
+        </w:numPr>
+        <w:spacing w:before="240" w:after="240" w:line="276" w:lineRule="auto"/>
+        <w:jc w:val="both"/>
+        <w:rPr>
+          <w:rFonts w:ascii="Palatino Linotype" w:hAnsi="Palatino Linotype"/>
+          <w:color w:val="1155CC"/>
+          <w:u w:val="single"/>
+        </w:rPr>
+      </w:pPr>
+      <w:r>
+        <w:rPr>
+          <w:rFonts w:ascii="Palatino Linotype" w:hAnsi="Palatino Linotype"/>
+        </w:rPr>
+        <w:t xml:space="preserve">Chen, M. (2024). Computer-aided feedback on the pronunciation of Mandarin Chinese tones: Using </w:t>
+      </w:r>
+      <w:proofErr w:type="spellStart"/>
+      <w:r>
+        <w:rPr>
+          <w:rFonts w:ascii="Palatino Linotype" w:hAnsi="Palatino Linotype"/>
+        </w:rPr>
+        <w:t>Praat</w:t>
+      </w:r>
+      <w:proofErr w:type="spellEnd"/>
+      <w:r>
+        <w:rPr>
+          <w:rFonts w:ascii="Palatino Linotype" w:hAnsi="Palatino Linotype"/>
+        </w:rPr>
+        <w:t xml:space="preserve"> to promote multimedia foreign language learning. </w:t>
+      </w:r>
+      <w:r>
+        <w:rPr>
+          <w:rFonts w:ascii="Palatino Linotype" w:hAnsi="Palatino Linotype"/>
+          <w:i/>
+          <w:iCs/>
+        </w:rPr>
+        <w:t>Computer Assisted Language Learning, 37</w:t>
+      </w:r>
+      <w:r>
+        <w:rPr>
+          <w:rFonts w:ascii="Palatino Linotype" w:hAnsi="Palatino Linotype"/>
+        </w:rPr>
+        <w:t>(3), 363–388.</w:t>
+      </w:r>
+      <w:hyperlink r:id="rId12">
+        <w:r>
+          <w:rPr>
+            <w:rFonts w:ascii="Palatino Linotype" w:hAnsi="Palatino Linotype"/>
+          </w:rPr>
+          <w:t xml:space="preserve"> </w:t>
+        </w:r>
+      </w:hyperlink>
+      <w:hyperlink r:id="rId13">
+        <w:r>
+          <w:rPr>
+            <w:rFonts w:ascii="Palatino Linotype" w:hAnsi="Palatino Linotype"/>
+            <w:color w:val="1155CC"/>
+            <w:u w:val="single"/>
+          </w:rPr>
+          <w:t>https://doi.org/10.1080/09588221.2022.2037652</w:t>
+        </w:r>
+      </w:hyperlink>
+    </w:p>
+    <w:p>
+      <w:pPr>
+        <w:pStyle w:val="ListParagraph"/>
+        <w:numPr>
+          <w:ilvl w:val="0"/>
+          <w:numId w:val="1"/>
+        </w:numPr>
+        <w:spacing w:before="240" w:after="240" w:line="276" w:lineRule="auto"/>
+        <w:jc w:val="both"/>
+        <w:rPr>
+          <w:rFonts w:ascii="Palatino Linotype" w:hAnsi="Palatino Linotype"/>
+        </w:rPr>
+      </w:pPr>
+      <w:r>
+        <w:rPr>
+          <w:rFonts w:ascii="Palatino Linotype" w:hAnsi="Palatino Linotype"/>
+        </w:rPr>
+        <w:t xml:space="preserve">Chun, D. M., Jiang, Y., &amp; Ávila, N. (2013). Visualization of tone for learning Mandarin Chinese. In J. Levis &amp; K. LeVelle (Eds.), </w:t>
+      </w:r>
+      <w:r>
+        <w:rPr>
+          <w:rFonts w:ascii="Palatino Linotype" w:hAnsi="Palatino Linotype"/>
+          <w:i/>
+          <w:iCs/>
+        </w:rPr>
+        <w:t>Proceedings of the 4th Pronunciation in Second Language Learning and Teaching Conference</w:t>
+      </w:r>
+      <w:r>
+        <w:rPr>
+          <w:rFonts w:ascii="Palatino Linotype" w:hAnsi="Palatino Linotype"/>
+        </w:rPr>
+        <w:t xml:space="preserve"> (pp. 77–89). Iowa State University.</w:t>
+      </w:r>
+    </w:p>
+    <w:p>
+      <w:pPr>
+        <w:pStyle w:val="ListParagraph"/>
+        <w:numPr>
+          <w:ilvl w:val="0"/>
+          <w:numId w:val="1"/>
+        </w:numPr>
+        <w:spacing w:before="240" w:after="240" w:line="276" w:lineRule="auto"/>
+        <w:jc w:val="both"/>
+        <w:rPr>
+          <w:rFonts w:ascii="Palatino Linotype" w:hAnsi="Palatino Linotype"/>
+        </w:rPr>
+      </w:pPr>
+      <w:r>
+        <w:rPr>
+          <w:rFonts w:ascii="Palatino Linotype" w:hAnsi="Palatino Linotype"/>
+        </w:rPr>
+        <w:t xml:space="preserve">Davis, F. D. (1989). Perceived usefulness, perceived ease of use, and user acceptance of information technology. </w:t>
+      </w:r>
+      <w:r>
+        <w:rPr>
+          <w:rFonts w:ascii="Palatino Linotype" w:hAnsi="Palatino Linotype"/>
+          <w:i/>
+          <w:iCs/>
+        </w:rPr>
+        <w:t>MIS Quarterly, 13</w:t>
+      </w:r>
+      <w:r>
+        <w:rPr>
+          <w:rFonts w:ascii="Palatino Linotype" w:hAnsi="Palatino Linotype"/>
+        </w:rPr>
+        <w:t>(3), 319–340.</w:t>
+      </w:r>
+    </w:p>
+    <w:p>
+      <w:pPr>
+        <w:pStyle w:val="ListParagraph"/>
+        <w:numPr>
+          <w:ilvl w:val="0"/>
+          <w:numId w:val="1"/>
+        </w:numPr>
+        <w:spacing w:before="240" w:after="240" w:line="276" w:lineRule="auto"/>
+        <w:jc w:val="both"/>
+        <w:rPr>
+          <w:rFonts w:ascii="Palatino Linotype" w:hAnsi="Palatino Linotype"/>
+          <w:color w:val="1155CC"/>
+          <w:u w:val="single"/>
+        </w:rPr>
+      </w:pPr>
+      <w:r>
+        <w:rPr>
+          <w:rFonts w:ascii="Palatino Linotype" w:hAnsi="Palatino Linotype"/>
+        </w:rPr>
+        <w:t xml:space="preserve">Farran, B. M., &amp; Morett, L. M. (2024). Multimodal cues in L2 lexical tone acquisition: Current research and future directions. </w:t>
+      </w:r>
+      <w:r>
+        <w:rPr>
+          <w:rFonts w:ascii="Palatino Linotype" w:hAnsi="Palatino Linotype"/>
+          <w:i/>
+          <w:iCs/>
+        </w:rPr>
+        <w:t>Frontiers in Education, 9</w:t>
+      </w:r>
+      <w:r>
+        <w:rPr>
+          <w:rFonts w:ascii="Palatino Linotype" w:hAnsi="Palatino Linotype"/>
+        </w:rPr>
+        <w:t>, Article 1410795.</w:t>
+      </w:r>
+      <w:hyperlink r:id="rId14">
+        <w:r>
+          <w:rPr>
+            <w:rFonts w:ascii="Palatino Linotype" w:hAnsi="Palatino Linotype"/>
+          </w:rPr>
+          <w:t xml:space="preserve"> </w:t>
+        </w:r>
+      </w:hyperlink>
+      <w:hyperlink r:id="rId15">
+        <w:r>
+          <w:rPr>
+            <w:rFonts w:ascii="Palatino Linotype" w:hAnsi="Palatino Linotype"/>
+            <w:color w:val="1155CC"/>
+            <w:u w:val="single"/>
+          </w:rPr>
+          <w:t>https://doi.org/10.3389/feduc.2024.1410795</w:t>
+        </w:r>
+      </w:hyperlink>
+    </w:p>
+    <w:p>
+      <w:pPr>
+        <w:pStyle w:val="ListParagraph"/>
+        <w:numPr>
+          <w:ilvl w:val="0"/>
+          <w:numId w:val="1"/>
+        </w:numPr>
+        <w:spacing w:before="240" w:after="240" w:line="276" w:lineRule="auto"/>
+        <w:jc w:val="both"/>
+        <w:rPr>
+          <w:rFonts w:ascii="Palatino Linotype" w:hAnsi="Palatino Linotype"/>
+          <w:color w:val="1155CC"/>
+          <w:u w:val="single"/>
+        </w:rPr>
+      </w:pPr>
+      <w:r>
+        <w:rPr>
+          <w:rFonts w:ascii="Palatino Linotype" w:hAnsi="Palatino Linotype"/>
+        </w:rPr>
+        <w:t xml:space="preserve">Gan, Z., &amp; Wei, W. (2025). Mispronunciation detection of Mandarin pronunciation errors in Tibetan students based on BIDFSMN. In </w:t>
+      </w:r>
+      <w:r>
+        <w:rPr>
+          <w:rFonts w:ascii="Palatino Linotype" w:hAnsi="Palatino Linotype"/>
+          <w:i/>
+          <w:iCs/>
+        </w:rPr>
+        <w:t>Proceedings of the 2024 2nd International Conference on Information Education and Artificial Intelligence (ICIEAI '24)</w:t>
+      </w:r>
+      <w:r>
+        <w:rPr>
+          <w:rFonts w:ascii="Palatino Linotype" w:hAnsi="Palatino Linotype"/>
+        </w:rPr>
+        <w:t xml:space="preserve"> (pp. 218–222). Association for Computing Machinery.</w:t>
+      </w:r>
+      <w:hyperlink r:id="rId16">
+        <w:r>
+          <w:rPr>
+            <w:rFonts w:ascii="Palatino Linotype" w:hAnsi="Palatino Linotype"/>
+          </w:rPr>
+          <w:t xml:space="preserve"> </w:t>
+        </w:r>
+      </w:hyperlink>
+      <w:hyperlink r:id="rId17">
+        <w:r>
+          <w:rPr>
+            <w:rFonts w:ascii="Palatino Linotype" w:hAnsi="Palatino Linotype"/>
+            <w:color w:val="1155CC"/>
+            <w:u w:val="single"/>
+          </w:rPr>
+          <w:t>https://doi.org/10.1145/3724504.3724542</w:t>
+        </w:r>
+      </w:hyperlink>
+    </w:p>
+    <w:p>
+      <w:pPr>
+        <w:pStyle w:val="ListParagraph"/>
+        <w:numPr>
+          <w:ilvl w:val="0"/>
+          <w:numId w:val="1"/>
+        </w:numPr>
+        <w:spacing w:before="240" w:after="240" w:line="276" w:lineRule="auto"/>
+        <w:jc w:val="both"/>
+        <w:rPr>
+          <w:rFonts w:ascii="Palatino Linotype" w:hAnsi="Palatino Linotype"/>
+          <w:color w:val="1155CC"/>
+          <w:u w:val="single"/>
+        </w:rPr>
+      </w:pPr>
+      <w:proofErr w:type="spellStart"/>
+      <w:r>
+        <w:rPr>
+          <w:rFonts w:ascii="Palatino Linotype" w:hAnsi="Palatino Linotype"/>
+        </w:rPr>
+        <w:t>Godfroid</w:t>
+      </w:r>
+      <w:proofErr w:type="spellEnd"/>
+      <w:r>
+        <w:rPr>
+          <w:rFonts w:ascii="Palatino Linotype" w:hAnsi="Palatino Linotype"/>
+        </w:rPr>
+        <w:t xml:space="preserve">, A., Lin, C.-H., &amp; Ryu, C. (2017). Hearing and seeing tone through color: An efficacy study of web-based, multimodal Chinese tone perception training. </w:t>
+      </w:r>
+      <w:r>
+        <w:rPr>
+          <w:rFonts w:ascii="Palatino Linotype" w:hAnsi="Palatino Linotype"/>
+          <w:i/>
+          <w:iCs/>
+        </w:rPr>
+        <w:t>Language Learning, 67</w:t>
+      </w:r>
+      <w:r>
+        <w:rPr>
+          <w:rFonts w:ascii="Palatino Linotype" w:hAnsi="Palatino Linotype"/>
+        </w:rPr>
+        <w:t>(4), 819–857.</w:t>
+      </w:r>
+      <w:hyperlink r:id="rId18">
+        <w:r>
+          <w:rPr>
+            <w:rFonts w:ascii="Palatino Linotype" w:hAnsi="Palatino Linotype"/>
+          </w:rPr>
+          <w:t xml:space="preserve"> </w:t>
+        </w:r>
+      </w:hyperlink>
+      <w:hyperlink r:id="rId19">
+        <w:r>
+          <w:rPr>
+            <w:rFonts w:ascii="Palatino Linotype" w:hAnsi="Palatino Linotype"/>
+            <w:color w:val="1155CC"/>
+            <w:u w:val="single"/>
+          </w:rPr>
+          <w:t>https://doi.org/10.1111/lang.12246</w:t>
+        </w:r>
+      </w:hyperlink>
+    </w:p>
+    <w:p>
+      <w:pPr>
+        <w:pStyle w:val="ListParagraph"/>
+        <w:numPr>
+          <w:ilvl w:val="0"/>
+          <w:numId w:val="1"/>
+        </w:numPr>
+        <w:spacing w:before="240" w:after="240" w:line="276" w:lineRule="auto"/>
+        <w:jc w:val="both"/>
+        <w:rPr>
+          <w:rFonts w:ascii="Palatino Linotype" w:hAnsi="Palatino Linotype"/>
+          <w:color w:val="1155CC"/>
+          <w:u w:val="single"/>
+        </w:rPr>
+      </w:pPr>
+      <w:r>
+        <w:rPr>
+          <w:rFonts w:ascii="Palatino Linotype" w:hAnsi="Palatino Linotype"/>
+        </w:rPr>
+        <w:t xml:space="preserve">Guo, T., Wen, C., Zhang, Z., Hu, Y., Chen, J., Huang, Z., &amp; Li, X. (2021). </w:t>
+      </w:r>
+      <w:proofErr w:type="spellStart"/>
+      <w:r>
+        <w:rPr>
+          <w:rFonts w:ascii="Palatino Linotype" w:hAnsi="Palatino Linotype"/>
+        </w:rPr>
+        <w:t>DiDiSpeech</w:t>
+      </w:r>
+      <w:proofErr w:type="spellEnd"/>
+      <w:r>
+        <w:rPr>
+          <w:rFonts w:ascii="Palatino Linotype" w:hAnsi="Palatino Linotype"/>
+        </w:rPr>
+        <w:t xml:space="preserve">: A large-scale Mandarin speech corpus. In </w:t>
+      </w:r>
+      <w:r>
+        <w:rPr>
+          <w:rFonts w:ascii="Palatino Linotype" w:hAnsi="Palatino Linotype"/>
+          <w:i/>
+          <w:iCs/>
+        </w:rPr>
+        <w:t xml:space="preserve">Proceedings of the </w:t>
+      </w:r>
+      <w:r>
+        <w:rPr>
+          <w:rFonts w:ascii="Palatino Linotype" w:hAnsi="Palatino Linotype"/>
+          <w:i/>
+          <w:iCs/>
+        </w:rPr>
+        <w:lastRenderedPageBreak/>
+        <w:t>IEEE International Conference on Acoustics, Speech and Signal Processing (ICASSP 2021)</w:t>
+      </w:r>
+      <w:r>
+        <w:rPr>
+          <w:rFonts w:ascii="Palatino Linotype" w:hAnsi="Palatino Linotype"/>
+        </w:rPr>
+        <w:t xml:space="preserve"> (pp. 6968–6972). IEEE.</w:t>
+      </w:r>
+      <w:hyperlink r:id="rId20">
+        <w:r>
+          <w:rPr>
+            <w:rFonts w:ascii="Palatino Linotype" w:hAnsi="Palatino Linotype"/>
+          </w:rPr>
+          <w:t xml:space="preserve"> </w:t>
+        </w:r>
+      </w:hyperlink>
+      <w:hyperlink r:id="rId21">
+        <w:r>
+          <w:rPr>
+            <w:rFonts w:ascii="Palatino Linotype" w:hAnsi="Palatino Linotype"/>
+            <w:color w:val="1155CC"/>
+            <w:u w:val="single"/>
+          </w:rPr>
+          <w:t>https://doi.org/10.1109/ICASSP39728.2021.9414423</w:t>
+        </w:r>
+      </w:hyperlink>
+    </w:p>
+    <w:p>
+      <w:pPr>
+        <w:pStyle w:val="ListParagraph"/>
+        <w:numPr>
+          <w:ilvl w:val="0"/>
+          <w:numId w:val="1"/>
+        </w:numPr>
+        <w:spacing w:before="240" w:after="240" w:line="276" w:lineRule="auto"/>
+        <w:jc w:val="both"/>
+        <w:rPr>
+          <w:rFonts w:ascii="Palatino Linotype" w:hAnsi="Palatino Linotype"/>
+        </w:rPr>
+      </w:pPr>
+      <w:r>
+        <w:rPr>
+          <w:rFonts w:ascii="Palatino Linotype" w:hAnsi="Palatino Linotype"/>
+        </w:rPr>
+        <w:t xml:space="preserve">Hao, Y.-C. (2014). The application of the speech learning model to the L2 acquisition of Mandarin tones. In </w:t>
+      </w:r>
+      <w:r>
+        <w:rPr>
+          <w:rFonts w:ascii="Palatino Linotype" w:hAnsi="Palatino Linotype"/>
+          <w:i/>
+          <w:iCs/>
+        </w:rPr>
+        <w:t>Proceedings of the 4th International Symposium on Tonal Aspects of Languages (TAL 2014)</w:t>
+      </w:r>
+      <w:r>
+        <w:rPr>
+          <w:rFonts w:ascii="Palatino Linotype" w:hAnsi="Palatino Linotype"/>
+        </w:rPr>
+        <w:t xml:space="preserve"> (pp. 67–70).</w:t>
+      </w:r>
+    </w:p>
+    <w:p>
+      <w:pPr>
+        <w:pStyle w:val="ListParagraph"/>
+        <w:numPr>
+          <w:ilvl w:val="0"/>
+          <w:numId w:val="1"/>
+        </w:numPr>
+        <w:spacing w:before="240" w:after="240" w:line="276" w:lineRule="auto"/>
+        <w:jc w:val="both"/>
+        <w:rPr>
+          <w:rFonts w:ascii="Palatino Linotype" w:hAnsi="Palatino Linotype"/>
+          <w:color w:val="1155CC"/>
+          <w:u w:val="single"/>
+        </w:rPr>
+      </w:pPr>
+      <w:r>
+        <w:rPr>
+          <w:rFonts w:ascii="Palatino Linotype" w:hAnsi="Palatino Linotype"/>
+        </w:rPr>
+        <w:t xml:space="preserve">Li, W., Chen, N. F., Siniscalchi, S. M., &amp; Lee, C.-H. (2019). Improving mispronunciation detection of Mandarin tones for non-native learners with soft-target tone labels and BLSTM-based deep tone models. </w:t>
+      </w:r>
+      <w:r>
+        <w:rPr>
+          <w:rFonts w:ascii="Palatino Linotype" w:hAnsi="Palatino Linotype"/>
+          <w:i/>
+          <w:iCs/>
+        </w:rPr>
+        <w:t>IEEE/ACM Transactions on Audio, Speech, and Language Processing, 27</w:t>
+      </w:r>
+      <w:r>
+        <w:rPr>
+          <w:rFonts w:ascii="Palatino Linotype" w:hAnsi="Palatino Linotype"/>
+        </w:rPr>
+        <w:t>(12), 2012–2024.</w:t>
+      </w:r>
+      <w:hyperlink r:id="rId22">
+        <w:r>
+          <w:rPr>
+            <w:rFonts w:ascii="Palatino Linotype" w:hAnsi="Palatino Linotype"/>
+          </w:rPr>
+          <w:t xml:space="preserve"> </w:t>
+        </w:r>
+      </w:hyperlink>
+      <w:hyperlink r:id="rId23">
+        <w:r>
+          <w:rPr>
+            <w:rFonts w:ascii="Palatino Linotype" w:hAnsi="Palatino Linotype"/>
+            <w:color w:val="1155CC"/>
+            <w:u w:val="single"/>
+          </w:rPr>
+          <w:t>https://doi.org/10.1109/TASLP.2019.2936755</w:t>
+        </w:r>
+      </w:hyperlink>
+    </w:p>
+    <w:p>
+      <w:pPr>
+        <w:pStyle w:val="ListParagraph"/>
+        <w:numPr>
+          <w:ilvl w:val="0"/>
+          <w:numId w:val="1"/>
+        </w:numPr>
+        <w:spacing w:before="240" w:after="240" w:line="276" w:lineRule="auto"/>
+        <w:jc w:val="both"/>
+        <w:rPr>
+          <w:rFonts w:ascii="Palatino Linotype" w:hAnsi="Palatino Linotype"/>
+          <w:color w:val="1155CC"/>
+          <w:u w:val="single"/>
+        </w:rPr>
+      </w:pPr>
+      <w:r>
+        <w:rPr>
+          <w:rFonts w:ascii="Palatino Linotype" w:hAnsi="Palatino Linotype"/>
+        </w:rPr>
+        <w:t xml:space="preserve">Liu, D., Chen, Z., Zhu, W., Jia, G., &amp; Zhou, R. (2025). The effects of tones and time pressure on the user experience of voice input on mobile devices for Mandarin Chinese: An experimental study. </w:t>
+      </w:r>
+      <w:proofErr w:type="spellStart"/>
+      <w:r>
+        <w:rPr>
+          <w:rFonts w:ascii="Palatino Linotype" w:hAnsi="Palatino Linotype"/>
+          <w:i/>
+          <w:iCs/>
+        </w:rPr>
+        <w:t>Behaviour</w:t>
+      </w:r>
+      <w:proofErr w:type="spellEnd"/>
+      <w:r>
+        <w:rPr>
+          <w:rFonts w:ascii="Palatino Linotype" w:hAnsi="Palatino Linotype"/>
+          <w:i/>
+          <w:iCs/>
+        </w:rPr>
+        <w:t xml:space="preserve"> &amp; Information Technology, 44</w:t>
+      </w:r>
+      <w:r>
+        <w:rPr>
+          <w:rFonts w:ascii="Palatino Linotype" w:hAnsi="Palatino Linotype"/>
+        </w:rPr>
+        <w:t>(2), 337–356.</w:t>
+      </w:r>
+      <w:hyperlink r:id="rId24">
+        <w:r>
+          <w:rPr>
+            <w:rFonts w:ascii="Palatino Linotype" w:hAnsi="Palatino Linotype"/>
+          </w:rPr>
+          <w:t xml:space="preserve"> </w:t>
+        </w:r>
+      </w:hyperlink>
+      <w:hyperlink r:id="rId25">
+        <w:r>
+          <w:rPr>
+            <w:rFonts w:ascii="Palatino Linotype" w:hAnsi="Palatino Linotype"/>
+            <w:color w:val="1155CC"/>
+            <w:u w:val="single"/>
+          </w:rPr>
+          <w:t>https://doi.org/10.1080/0144929X.2024.2317372</w:t>
+        </w:r>
+      </w:hyperlink>
+    </w:p>
+    <w:p>
+      <w:pPr>
+        <w:pStyle w:val="ListParagraph"/>
+        <w:numPr>
+          <w:ilvl w:val="0"/>
+          <w:numId w:val="1"/>
+        </w:numPr>
+        <w:spacing w:before="240" w:after="240" w:line="276" w:lineRule="auto"/>
+        <w:jc w:val="both"/>
+        <w:rPr>
+          <w:rFonts w:ascii="Palatino Linotype" w:hAnsi="Palatino Linotype"/>
+        </w:rPr>
+      </w:pPr>
+      <w:r>
+        <w:rPr>
+          <w:rFonts w:ascii="Palatino Linotype" w:hAnsi="Palatino Linotype"/>
+        </w:rPr>
+        <w:t xml:space="preserve">Long, M. (1996). The role of the linguistic environment in second language acquisition. In W. C. Ritchie &amp; T. K. Bhatia (Eds.), </w:t>
+      </w:r>
+      <w:r>
+        <w:rPr>
+          <w:rFonts w:ascii="Palatino Linotype" w:hAnsi="Palatino Linotype"/>
+          <w:i/>
+          <w:iCs/>
+        </w:rPr>
+        <w:t>Handbook of second language acquisition</w:t>
+      </w:r>
+      <w:r>
+        <w:rPr>
+          <w:rFonts w:ascii="Palatino Linotype" w:hAnsi="Palatino Linotype"/>
+        </w:rPr>
+        <w:t xml:space="preserve"> (pp. 413–468). Academic Press.</w:t>
+      </w:r>
+    </w:p>
+    <w:p>
+      <w:pPr>
+        <w:pStyle w:val="ListParagraph"/>
+        <w:numPr>
+          <w:ilvl w:val="0"/>
+          <w:numId w:val="1"/>
+        </w:numPr>
+        <w:spacing w:before="240" w:after="240" w:line="276" w:lineRule="auto"/>
+        <w:jc w:val="both"/>
+        <w:rPr>
+          <w:rFonts w:ascii="Palatino Linotype" w:hAnsi="Palatino Linotype"/>
+        </w:rPr>
+      </w:pPr>
+      <w:r>
+        <w:rPr>
+          <w:rFonts w:ascii="Palatino Linotype" w:hAnsi="Palatino Linotype"/>
+        </w:rPr>
+        <w:t xml:space="preserve">Meng, H., Chen, C.-T., Chen, Y., Liu, Z., &amp; Xu, Y. (2023). Mandarin tone production can be learned under perceptual guidance: A machine learning simulation. In </w:t>
+      </w:r>
+      <w:r>
+        <w:rPr>
+          <w:rFonts w:ascii="Palatino Linotype" w:hAnsi="Palatino Linotype"/>
+          <w:i/>
+          <w:iCs/>
+        </w:rPr>
+        <w:t>Proceedings of the 20th International Congress of Phonetic Sciences (</w:t>
+      </w:r>
+      <w:proofErr w:type="spellStart"/>
+      <w:r>
+        <w:rPr>
+          <w:rFonts w:ascii="Palatino Linotype" w:hAnsi="Palatino Linotype"/>
+          <w:i/>
+          <w:iCs/>
+        </w:rPr>
+        <w:t>ICPhS</w:t>
+      </w:r>
+      <w:proofErr w:type="spellEnd"/>
+      <w:r>
+        <w:rPr>
+          <w:rFonts w:ascii="Palatino Linotype" w:hAnsi="Palatino Linotype"/>
+          <w:i/>
+          <w:iCs/>
+        </w:rPr>
+        <w:t xml:space="preserve"> 2023)</w:t>
+      </w:r>
+      <w:r>
+        <w:rPr>
+          <w:rFonts w:ascii="Palatino Linotype" w:hAnsi="Palatino Linotype"/>
+        </w:rPr>
+        <w:t>. International Phonetic Association.</w:t>
+      </w:r>
+    </w:p>
+    <w:p>
+      <w:pPr>
+        <w:pStyle w:val="ListParagraph"/>
+        <w:numPr>
+          <w:ilvl w:val="0"/>
+          <w:numId w:val="1"/>
+        </w:numPr>
+        <w:spacing w:before="240" w:after="240" w:line="276" w:lineRule="auto"/>
+        <w:jc w:val="both"/>
+        <w:rPr>
+          <w:rFonts w:ascii="Palatino Linotype" w:hAnsi="Palatino Linotype"/>
+          <w:color w:val="1155CC"/>
+          <w:u w:val="single"/>
+        </w:rPr>
+      </w:pPr>
+      <w:r>
+        <w:rPr>
+          <w:rFonts w:ascii="Palatino Linotype" w:hAnsi="Palatino Linotype"/>
+        </w:rPr>
+        <w:t xml:space="preserve">Nielsen, J. (1994). Enhancing the explanatory power of usability heuristics. In </w:t>
+      </w:r>
+      <w:r>
+        <w:rPr>
+          <w:rFonts w:ascii="Palatino Linotype" w:hAnsi="Palatino Linotype"/>
+          <w:i/>
+          <w:iCs/>
+        </w:rPr>
+        <w:t>Proceedings of the SIGCHI Conference on Human Factors in Computing Systems (CHI '94)</w:t>
+      </w:r>
+      <w:r>
+        <w:rPr>
+          <w:rFonts w:ascii="Palatino Linotype" w:hAnsi="Palatino Linotype"/>
+        </w:rPr>
+        <w:t xml:space="preserve"> (pp. 152–158). Association for Computing Machinery.</w:t>
+      </w:r>
+      <w:hyperlink r:id="rId26">
+        <w:r>
+          <w:rPr>
+            <w:rFonts w:ascii="Palatino Linotype" w:hAnsi="Palatino Linotype"/>
+          </w:rPr>
+          <w:t xml:space="preserve"> </w:t>
+        </w:r>
+      </w:hyperlink>
+      <w:hyperlink r:id="rId27">
+        <w:r>
+          <w:rPr>
+            <w:rFonts w:ascii="Palatino Linotype" w:hAnsi="Palatino Linotype"/>
+            <w:color w:val="1155CC"/>
+            <w:u w:val="single"/>
+          </w:rPr>
+          <w:t>https://doi.org/10.1145/191666.191729</w:t>
+        </w:r>
+      </w:hyperlink>
+    </w:p>
+    <w:p>
+      <w:pPr>
+        <w:pStyle w:val="ListParagraph"/>
+        <w:numPr>
+          <w:ilvl w:val="0"/>
+          <w:numId w:val="1"/>
+        </w:numPr>
+        <w:spacing w:before="240" w:after="240" w:line="276" w:lineRule="auto"/>
+        <w:jc w:val="both"/>
+        <w:rPr>
+          <w:rFonts w:ascii="Palatino Linotype" w:hAnsi="Palatino Linotype"/>
+          <w:color w:val="1155CC"/>
+          <w:u w:val="single"/>
+        </w:rPr>
+      </w:pPr>
+      <w:r>
+        <w:rPr>
+          <w:rFonts w:ascii="Palatino Linotype" w:hAnsi="Palatino Linotype"/>
+        </w:rPr>
+        <w:t xml:space="preserve">Qin, Z., &amp; Wang, Y. (2014). A computer-aided Chinese pronunciation training program for English-speaking learners. In </w:t>
+      </w:r>
+      <w:r>
+        <w:rPr>
+          <w:rFonts w:ascii="Palatino Linotype" w:hAnsi="Palatino Linotype"/>
+          <w:i/>
+          <w:iCs/>
+        </w:rPr>
+        <w:t>Proceedings of the 2014 International Conference on Asian Language Processing (IALP)</w:t>
+      </w:r>
+      <w:r>
+        <w:rPr>
+          <w:rFonts w:ascii="Palatino Linotype" w:hAnsi="Palatino Linotype"/>
+        </w:rPr>
+        <w:t xml:space="preserve"> (pp. 1–4). IEEE.</w:t>
+      </w:r>
+      <w:hyperlink r:id="rId28">
+        <w:r>
+          <w:rPr>
+            <w:rFonts w:ascii="Palatino Linotype" w:hAnsi="Palatino Linotype"/>
+          </w:rPr>
+          <w:t xml:space="preserve"> </w:t>
+        </w:r>
+      </w:hyperlink>
+      <w:hyperlink r:id="rId29">
+        <w:r>
+          <w:rPr>
+            <w:rFonts w:ascii="Palatino Linotype" w:hAnsi="Palatino Linotype"/>
+            <w:color w:val="1155CC"/>
+            <w:u w:val="single"/>
+          </w:rPr>
+          <w:t>https://doi.org/10.1109/ialp.2014.6973499</w:t>
+        </w:r>
+      </w:hyperlink>
+    </w:p>
+    <w:p>
+      <w:pPr>
+        <w:pStyle w:val="ListParagraph"/>
+        <w:numPr>
+          <w:ilvl w:val="0"/>
+          <w:numId w:val="1"/>
+        </w:numPr>
+        <w:spacing w:before="240" w:after="240" w:line="276" w:lineRule="auto"/>
+        <w:jc w:val="both"/>
+        <w:rPr>
+          <w:rFonts w:ascii="Palatino Linotype" w:hAnsi="Palatino Linotype"/>
+          <w:color w:val="1155CC"/>
+          <w:u w:val="single"/>
+        </w:rPr>
+      </w:pPr>
+      <w:r>
+        <w:rPr>
+          <w:rFonts w:ascii="Palatino Linotype" w:hAnsi="Palatino Linotype"/>
+        </w:rPr>
+        <w:lastRenderedPageBreak/>
+        <w:t xml:space="preserve">Rogerson-Revell, P. M. (2021). Computer-assisted pronunciation training (CAPT): Current issues and future directions. </w:t>
+      </w:r>
+      <w:r>
+        <w:rPr>
+          <w:rFonts w:ascii="Palatino Linotype" w:hAnsi="Palatino Linotype"/>
+          <w:i/>
+          <w:iCs/>
+        </w:rPr>
+        <w:t>RELC Journal, 52</w:t>
+      </w:r>
+      <w:r>
+        <w:rPr>
+          <w:rFonts w:ascii="Palatino Linotype" w:hAnsi="Palatino Linotype"/>
+        </w:rPr>
+        <w:t>(1), 189–205.</w:t>
+      </w:r>
+      <w:hyperlink r:id="rId30">
+        <w:r>
+          <w:rPr>
+            <w:rFonts w:ascii="Palatino Linotype" w:hAnsi="Palatino Linotype"/>
+          </w:rPr>
+          <w:t xml:space="preserve"> </w:t>
+        </w:r>
+      </w:hyperlink>
+      <w:hyperlink r:id="rId31">
+        <w:r>
+          <w:rPr>
+            <w:rFonts w:ascii="Palatino Linotype" w:hAnsi="Palatino Linotype"/>
+            <w:color w:val="1155CC"/>
+            <w:u w:val="single"/>
+          </w:rPr>
+          <w:t>https://doi.org/10.1177/0033688220977406</w:t>
+        </w:r>
+      </w:hyperlink>
+    </w:p>
+    <w:p>
+      <w:pPr>
+        <w:pStyle w:val="ListParagraph"/>
+        <w:numPr>
+          <w:ilvl w:val="0"/>
+          <w:numId w:val="1"/>
+        </w:numPr>
+        <w:spacing w:before="240" w:after="240" w:line="276" w:lineRule="auto"/>
+        <w:jc w:val="both"/>
+        <w:rPr>
+          <w:rFonts w:ascii="Palatino Linotype" w:hAnsi="Palatino Linotype"/>
+        </w:rPr>
+      </w:pPr>
+      <w:r>
+        <w:rPr>
+          <w:rFonts w:ascii="Palatino Linotype" w:hAnsi="Palatino Linotype"/>
+        </w:rPr>
+        <w:t xml:space="preserve">Schmidt, R. (1990). The role of consciousness in second language learning. </w:t>
+      </w:r>
+      <w:r>
+        <w:rPr>
+          <w:rFonts w:ascii="Palatino Linotype" w:hAnsi="Palatino Linotype"/>
+          <w:i/>
+          <w:iCs/>
+        </w:rPr>
+        <w:t>Applied Linguistics, 11</w:t>
+      </w:r>
+      <w:r>
+        <w:rPr>
+          <w:rFonts w:ascii="Palatino Linotype" w:hAnsi="Palatino Linotype"/>
+        </w:rPr>
+        <w:t>(2), 129–158.</w:t>
+      </w:r>
+    </w:p>
+    <w:p>
+      <w:pPr>
+        <w:pStyle w:val="ListParagraph"/>
+        <w:numPr>
+          <w:ilvl w:val="0"/>
+          <w:numId w:val="1"/>
+        </w:numPr>
+        <w:spacing w:before="240" w:after="240" w:line="276" w:lineRule="auto"/>
+        <w:jc w:val="both"/>
+        <w:rPr>
+          <w:rFonts w:ascii="Palatino Linotype" w:hAnsi="Palatino Linotype"/>
+          <w:color w:val="1155CC"/>
+          <w:u w:val="single"/>
+        </w:rPr>
+      </w:pPr>
+      <w:r>
+        <w:rPr>
+          <w:rFonts w:ascii="Palatino Linotype" w:hAnsi="Palatino Linotype"/>
+        </w:rPr>
+        <w:t xml:space="preserve">Tang, J., &amp; Li, M. (2021). </w:t>
+      </w:r>
+      <w:r>
+        <w:rPr>
+          <w:rFonts w:ascii="Palatino Linotype" w:hAnsi="Palatino Linotype"/>
+          <w:i/>
+          <w:iCs/>
+        </w:rPr>
+        <w:t>End-to-end Mandarin tone classification with short term context information</w:t>
+      </w:r>
+      <w:r>
+        <w:rPr>
+          <w:rFonts w:ascii="Palatino Linotype" w:hAnsi="Palatino Linotype"/>
+        </w:rPr>
+        <w:t xml:space="preserve"> [Preprint]. </w:t>
+      </w:r>
+      <w:proofErr w:type="spellStart"/>
+      <w:r>
+        <w:rPr>
+          <w:rFonts w:ascii="Palatino Linotype" w:hAnsi="Palatino Linotype"/>
+        </w:rPr>
+        <w:t>arXiv</w:t>
+      </w:r>
+      <w:proofErr w:type="spellEnd"/>
+      <w:r>
+        <w:rPr>
+          <w:rFonts w:ascii="Palatino Linotype" w:hAnsi="Palatino Linotype"/>
+        </w:rPr>
+        <w:t>.</w:t>
+      </w:r>
+      <w:hyperlink r:id="rId32">
+        <w:r>
+          <w:rPr>
+            <w:rFonts w:ascii="Palatino Linotype" w:hAnsi="Palatino Linotype"/>
+          </w:rPr>
+          <w:t xml:space="preserve"> </w:t>
+        </w:r>
+      </w:hyperlink>
+      <w:hyperlink r:id="rId33">
+        <w:r>
+          <w:rPr>
+            <w:rFonts w:ascii="Palatino Linotype" w:hAnsi="Palatino Linotype"/>
+            <w:color w:val="1155CC"/>
+            <w:u w:val="single"/>
+          </w:rPr>
+          <w:t>https://arxiv.org/abs/2104.05657</w:t>
+        </w:r>
+      </w:hyperlink>
+    </w:p>
+    <w:p>
+      <w:pPr>
+        <w:pStyle w:val="ListParagraph"/>
+        <w:numPr>
+          <w:ilvl w:val="0"/>
+          <w:numId w:val="1"/>
+        </w:numPr>
+        <w:spacing w:before="240" w:after="240" w:line="276" w:lineRule="auto"/>
+        <w:jc w:val="both"/>
+        <w:rPr>
+          <w:rFonts w:ascii="Palatino Linotype" w:hAnsi="Palatino Linotype"/>
+        </w:rPr>
+      </w:pPr>
+      <w:r>
+        <w:rPr>
+          <w:rFonts w:ascii="Palatino Linotype" w:hAnsi="Palatino Linotype"/>
+        </w:rPr>
+        <w:t xml:space="preserve">Tong, R., Chen, N. F., Ma, B., &amp; Li, H. (2018). Context-aware mispronunciation detection for Mandarin pronunciation training. In </w:t>
+      </w:r>
+      <w:r>
+        <w:rPr>
+          <w:rFonts w:ascii="Palatino Linotype" w:hAnsi="Palatino Linotype"/>
+          <w:i/>
+          <w:iCs/>
+        </w:rPr>
+        <w:t>Proceedings of the 19th Annual Conference of the International Speech Communication Association (INTERSPEECH 2018)</w:t>
+      </w:r>
+      <w:r>
+        <w:rPr>
+          <w:rFonts w:ascii="Palatino Linotype" w:hAnsi="Palatino Linotype"/>
+        </w:rPr>
+        <w:t xml:space="preserve"> (pp. 381–385). International Speech Communication Association.</w:t>
+      </w:r>
+    </w:p>
+    <w:p>
+      <w:pPr>
+        <w:pStyle w:val="ListParagraph"/>
+        <w:numPr>
+          <w:ilvl w:val="0"/>
+          <w:numId w:val="1"/>
+        </w:numPr>
+        <w:spacing w:before="240" w:after="240" w:line="276" w:lineRule="auto"/>
+        <w:jc w:val="both"/>
+        <w:rPr>
+          <w:rFonts w:ascii="Palatino Linotype" w:hAnsi="Palatino Linotype"/>
+          <w:color w:val="1155CC"/>
+          <w:u w:val="single"/>
+        </w:rPr>
+      </w:pPr>
+      <w:r>
+        <w:rPr>
+          <w:rFonts w:ascii="Palatino Linotype" w:hAnsi="Palatino Linotype"/>
+        </w:rPr>
+        <w:t xml:space="preserve">Tsukada, K., Xu, H. L., &amp; </w:t>
+      </w:r>
+      <w:proofErr w:type="spellStart"/>
+      <w:r>
+        <w:rPr>
+          <w:rFonts w:ascii="Palatino Linotype" w:hAnsi="Palatino Linotype"/>
+        </w:rPr>
+        <w:t>Rattanasone</w:t>
+      </w:r>
+      <w:proofErr w:type="spellEnd"/>
+      <w:r>
+        <w:rPr>
+          <w:rFonts w:ascii="Palatino Linotype" w:hAnsi="Palatino Linotype"/>
+        </w:rPr>
+        <w:t xml:space="preserve">, N. X. (2014). The perception of Mandarin tones by learners from heritage and non-heritage backgrounds. In </w:t>
+      </w:r>
+      <w:r>
+        <w:rPr>
+          <w:rFonts w:ascii="Palatino Linotype" w:hAnsi="Palatino Linotype"/>
+          <w:i/>
+          <w:iCs/>
+        </w:rPr>
+        <w:t>Proceedings of the 9th International Symposium on Chinese Spoken Language Processing (ISCSLP)</w:t>
+      </w:r>
+      <w:r>
+        <w:rPr>
+          <w:rFonts w:ascii="Palatino Linotype" w:hAnsi="Palatino Linotype"/>
+        </w:rPr>
+        <w:t xml:space="preserve"> (pp. 260–264). IEEE.</w:t>
+      </w:r>
+      <w:hyperlink r:id="rId34">
+        <w:r>
+          <w:rPr>
+            <w:rFonts w:ascii="Palatino Linotype" w:hAnsi="Palatino Linotype"/>
+          </w:rPr>
+          <w:t xml:space="preserve"> </w:t>
+        </w:r>
+      </w:hyperlink>
+      <w:hyperlink r:id="rId35">
+        <w:r>
+          <w:rPr>
+            <w:rFonts w:ascii="Palatino Linotype" w:hAnsi="Palatino Linotype"/>
+            <w:color w:val="1155CC"/>
+            <w:u w:val="single"/>
+          </w:rPr>
+          <w:t>https://doi.org/10.1109/ISCSLP.2014.6936587</w:t>
+        </w:r>
+      </w:hyperlink>
+    </w:p>
+    <w:p>
+      <w:pPr>
+        <w:pStyle w:val="ListParagraph"/>
+        <w:numPr>
+          <w:ilvl w:val="0"/>
+          <w:numId w:val="1"/>
+        </w:numPr>
+        <w:spacing w:before="240" w:after="240" w:line="276" w:lineRule="auto"/>
+        <w:jc w:val="both"/>
+        <w:rPr>
+          <w:rFonts w:ascii="Palatino Linotype" w:hAnsi="Palatino Linotype"/>
+        </w:rPr>
+      </w:pPr>
+      <w:r>
+        <w:rPr>
+          <w:rFonts w:ascii="Palatino Linotype" w:hAnsi="Palatino Linotype"/>
+        </w:rPr>
+        <w:t xml:space="preserve">Tyler, M. D., &amp; Best, C. T. (2024). The Perceptual Assimilation Model: Early bilingual adults and developmental foundations. In M. Amengual (Ed.), </w:t>
+      </w:r>
+      <w:r>
+        <w:rPr>
+          <w:rFonts w:ascii="Palatino Linotype" w:hAnsi="Palatino Linotype"/>
+          <w:i/>
+          <w:iCs/>
+        </w:rPr>
+        <w:t>The Cambridge handbook of bilingual phonetics and phonology</w:t>
+      </w:r>
+      <w:r>
+        <w:rPr>
+          <w:rFonts w:ascii="Palatino Linotype" w:hAnsi="Palatino Linotype"/>
+        </w:rPr>
+        <w:t xml:space="preserve"> (pp. 147–172). Cambridge University Press.</w:t>
+      </w:r>
+    </w:p>
+    <w:p>
+      <w:pPr>
+        <w:pStyle w:val="ListParagraph"/>
+        <w:numPr>
+          <w:ilvl w:val="0"/>
+          <w:numId w:val="1"/>
+        </w:numPr>
+        <w:spacing w:before="240" w:after="240" w:line="276" w:lineRule="auto"/>
+        <w:jc w:val="both"/>
+        <w:rPr>
+          <w:rFonts w:ascii="Palatino Linotype" w:hAnsi="Palatino Linotype"/>
+          <w:color w:val="1155CC"/>
+          <w:u w:val="single"/>
+        </w:rPr>
+      </w:pPr>
+      <w:r>
+        <w:rPr>
+          <w:rFonts w:ascii="Palatino Linotype" w:hAnsi="Palatino Linotype"/>
+        </w:rPr>
+        <w:t xml:space="preserve">van Leussen, J. W., &amp; Escudero, P. (2015). Learning to perceive and recognize a second language: The L2LP model revised. </w:t>
+      </w:r>
+      <w:r>
+        <w:rPr>
+          <w:rFonts w:ascii="Palatino Linotype" w:hAnsi="Palatino Linotype"/>
+          <w:i/>
+          <w:iCs/>
+        </w:rPr>
+        <w:t>Frontiers in Psychology, 6</w:t>
+      </w:r>
+      <w:r>
+        <w:rPr>
+          <w:rFonts w:ascii="Palatino Linotype" w:hAnsi="Palatino Linotype"/>
+        </w:rPr>
+        <w:t>, Article 1000.</w:t>
+      </w:r>
+      <w:hyperlink r:id="rId36">
+        <w:r>
+          <w:rPr>
+            <w:rFonts w:ascii="Palatino Linotype" w:hAnsi="Palatino Linotype"/>
+          </w:rPr>
+          <w:t xml:space="preserve"> </w:t>
+        </w:r>
+      </w:hyperlink>
+      <w:hyperlink r:id="rId37">
+        <w:r>
+          <w:rPr>
+            <w:rFonts w:ascii="Palatino Linotype" w:hAnsi="Palatino Linotype"/>
+            <w:color w:val="1155CC"/>
+            <w:u w:val="single"/>
+          </w:rPr>
+          <w:t>https://doi.org/10.3389/fpsyg.2015.01000</w:t>
+        </w:r>
+      </w:hyperlink>
+    </w:p>
+    <w:p>
+      <w:pPr>
+        <w:pStyle w:val="ListParagraph"/>
+        <w:numPr>
+          <w:ilvl w:val="0"/>
+          <w:numId w:val="1"/>
+        </w:numPr>
+        <w:spacing w:before="240" w:after="240" w:line="276" w:lineRule="auto"/>
+        <w:jc w:val="both"/>
+        <w:rPr>
+          <w:rFonts w:ascii="Palatino Linotype" w:hAnsi="Palatino Linotype"/>
+        </w:rPr>
+      </w:pPr>
+      <w:r>
+        <w:rPr>
+          <w:rFonts w:ascii="Palatino Linotype" w:hAnsi="Palatino Linotype"/>
+        </w:rPr>
+        <w:t xml:space="preserve">Wang, Y., </w:t>
+      </w:r>
+      <w:proofErr w:type="spellStart"/>
+      <w:r>
+        <w:rPr>
+          <w:rFonts w:ascii="Palatino Linotype" w:hAnsi="Palatino Linotype"/>
+        </w:rPr>
+        <w:t>Jongman</w:t>
+      </w:r>
+      <w:proofErr w:type="spellEnd"/>
+      <w:r>
+        <w:rPr>
+          <w:rFonts w:ascii="Palatino Linotype" w:hAnsi="Palatino Linotype"/>
+        </w:rPr>
+        <w:t xml:space="preserve">, A., &amp; Sereno, J. A. (n.d.). L2 acquisition of Chinese tone. In R. Sybesma, J. Huang, J. Myers, W. Behr, &amp; Z. Handel (Eds.), </w:t>
+      </w:r>
+      <w:r>
+        <w:rPr>
+          <w:rFonts w:ascii="Palatino Linotype" w:hAnsi="Palatino Linotype"/>
+          <w:i/>
+          <w:iCs/>
+        </w:rPr>
+        <w:t>Encyclopedia of Chinese languages and linguistics</w:t>
+      </w:r>
+      <w:r>
+        <w:rPr>
+          <w:rFonts w:ascii="Palatino Linotype" w:hAnsi="Palatino Linotype"/>
+        </w:rPr>
+        <w:t>. Brill.</w:t>
+      </w:r>
+    </w:p>
+    <w:p>
+      <w:pPr>
+        <w:pStyle w:val="ListParagraph"/>
+        <w:numPr>
+          <w:ilvl w:val="0"/>
+          <w:numId w:val="1"/>
+        </w:numPr>
+        <w:spacing w:before="240" w:after="240" w:line="276" w:lineRule="auto"/>
+        <w:jc w:val="both"/>
+        <w:rPr>
+          <w:rFonts w:ascii="Palatino Linotype" w:hAnsi="Palatino Linotype"/>
+          <w:color w:val="1155CC"/>
+          <w:u w:val="single"/>
+        </w:rPr>
+      </w:pPr>
+      <w:r>
+        <w:rPr>
+          <w:rFonts w:ascii="Palatino Linotype" w:hAnsi="Palatino Linotype"/>
+        </w:rPr>
+        <w:t xml:space="preserve">Yuen, C. L., &amp; Schlote, N. (2024). Learner experiences of mobile apps and artificial intelligence to support additional language learning in education. </w:t>
+      </w:r>
+      <w:r>
+        <w:rPr>
+          <w:rFonts w:ascii="Palatino Linotype" w:hAnsi="Palatino Linotype"/>
+          <w:i/>
+          <w:iCs/>
+        </w:rPr>
+        <w:t>Journal of Educational Technology Systems, 52</w:t>
+      </w:r>
+      <w:r>
+        <w:rPr>
+          <w:rFonts w:ascii="Palatino Linotype" w:hAnsi="Palatino Linotype"/>
+        </w:rPr>
+        <w:t>(4), 507–525.</w:t>
+      </w:r>
+      <w:hyperlink r:id="rId38">
+        <w:r>
+          <w:rPr>
+            <w:rFonts w:ascii="Palatino Linotype" w:hAnsi="Palatino Linotype"/>
+          </w:rPr>
+          <w:t xml:space="preserve"> </w:t>
+        </w:r>
+      </w:hyperlink>
+      <w:hyperlink r:id="rId39">
+        <w:r>
+          <w:rPr>
+            <w:rFonts w:ascii="Palatino Linotype" w:hAnsi="Palatino Linotype"/>
+            <w:color w:val="1155CC"/>
+            <w:u w:val="single"/>
+          </w:rPr>
+          <w:t>https://doi.org/10.1177/00472395241238693</w:t>
+        </w:r>
+      </w:hyperlink>
+    </w:p>
+    <w:p>
+      <w:pPr>
+        <w:pStyle w:val="ListParagraph"/>
+        <w:numPr>
+          <w:ilvl w:val="0"/>
+          <w:numId w:val="1"/>
+        </w:numPr>
+        <w:spacing w:before="240" w:after="240" w:line="276" w:lineRule="auto"/>
+        <w:jc w:val="both"/>
+        <w:rPr>
+          <w:rFonts w:ascii="Palatino Linotype" w:hAnsi="Palatino Linotype"/>
+          <w:color w:val="1155CC"/>
+          <w:u w:val="single"/>
+        </w:rPr>
+      </w:pPr>
+      <w:r>
+        <w:rPr>
+          <w:rFonts w:ascii="Palatino Linotype" w:hAnsi="Palatino Linotype"/>
+        </w:rPr>
+        <w:lastRenderedPageBreak/>
+        <w:t xml:space="preserve">Zou, T. (2017). </w:t>
+      </w:r>
+      <w:r>
+        <w:rPr>
+          <w:rFonts w:ascii="Palatino Linotype" w:hAnsi="Palatino Linotype"/>
+          <w:i/>
+          <w:iCs/>
+        </w:rPr>
+        <w:t>Production and perception of tones by Dutch learners of Mandarin</w:t>
+      </w:r>
+      <w:r>
+        <w:rPr>
+          <w:rFonts w:ascii="Palatino Linotype" w:hAnsi="Palatino Linotype"/>
+        </w:rPr>
+        <w:t xml:space="preserve"> [Doctoral thesis]. LOT Publications.</w:t>
+      </w:r>
     </w:p>
     <w:p/>
     <w:sectPr>
-      <w:footerReference w:type="even" r:id="rId6"/>
-      <w:footerReference w:type="default" r:id="rId7"/>
+      <w:footerReference w:type="even" r:id="rId40"/>
+      <w:footerReference w:type="default" r:id="rId41"/>
       <w:pgSz w:w="12240" w:h="15840"/>
       <w:pgMar w:top="1440" w:right="2160" w:bottom="2160" w:left="2160" w:header="720" w:footer="1498" w:gutter="0"/>
       <w:cols w:space="720"/>
@@ -2615,6 +5724,103 @@
     </w:p>
   </w:footnote>
 </w:footnotes>
+</file>
+
+<file path=word/numbering.xml><?xml version="1.0" encoding="utf-8"?>
+<w:numbering xmlns:wpc="http://schemas.microsoft.com/office/word/2010/wordprocessingCanvas" xmlns:cx="http://schemas.microsoft.com/office/drawing/2014/chartex" xmlns:cx1="http://schemas.microsoft.com/office/drawing/2015/9/8/chartex" xmlns:cx2="http://schemas.microsoft.com/office/drawing/2015/10/21/chartex" xmlns:cx3="http://schemas.microsoft.com/office/drawing/2016/5/9/chartex" xmlns:cx4="http://schemas.microsoft.com/office/drawing/2016/5/10/chartex" xmlns:cx5="http://schemas.microsoft.com/office/drawing/2016/5/11/chartex" xmlns:cx6="http://schemas.microsoft.com/office/drawing/2016/5/12/chartex" xmlns:cx7="http://schemas.microsoft.com/office/drawing/2016/5/13/chartex" xmlns:cx8="http://schemas.microsoft.com/office/drawing/2016/5/14/chartex" xmlns:mc="http://schemas.openxmlformats.org/markup-compatibility/2006" xmlns:aink="http://schemas.microsoft.com/office/drawing/2016/ink" xmlns:am3d="http://schemas.microsoft.com/office/drawing/2017/model3d" xmlns:o="urn:schemas-microsoft-com:office:office" xmlns:oel="http://schemas.microsoft.com/office/2019/extlst" xmlns:r="http://schemas.openxmlformats.org/officeDocument/2006/relationships" xmlns:m="http://schemas.openxmlformats.org/officeDocument/2006/math" xmlns:v="urn:schemas-microsoft-com:vml" xmlns:wp14="http://schemas.microsoft.com/office/word/2010/wordprocessingDrawing" xmlns:wp="http://schemas.openxmlformats.org/drawingml/2006/wordprocessingDrawing" xmlns:w10="urn:schemas-microsoft-com:office:word" xmlns:w="http://schemas.openxmlformats.org/wordprocessingml/2006/main" xmlns:w14="http://schemas.microsoft.com/office/word/2010/wordml" xmlns:w15="http://schemas.microsoft.com/office/word/2012/wordml" xmlns:w16cex="http://schemas.microsoft.com/office/word/2018/wordml/cex" xmlns:w16cid="http://schemas.microsoft.com/office/word/2016/wordml/cid" xmlns:w16="http://schemas.microsoft.com/office/word/2018/wordml" xmlns:w16du="http://schemas.microsoft.com/office/word/2023/wordml/word16du" xmlns:w16sdtdh="http://schemas.microsoft.com/office/word/2020/wordml/sdtdatahash" xmlns:w16sdtfl="http://schemas.microsoft.com/office/word/2024/wordml/sdtformatlock" xmlns:w16se="http://schemas.microsoft.com/office/word/2015/wordml/symex" xmlns:wpg="http://schemas.microsoft.com/office/word/2010/wordprocessingGroup" xmlns:wpi="http://schemas.microsoft.com/office/word/2010/wordprocessingInk" xmlns:wne="http://schemas.microsoft.com/office/word/2006/wordml" xmlns:wps="http://schemas.microsoft.com/office/word/2010/wordprocessingShape" mc:Ignorable="w14 w15 w16se w16cid w16 w16cex w16sdtdh w16sdtfl w16du wp14">
+  <w:abstractNum w:abstractNumId="0" w15:restartNumberingAfterBreak="0">
+    <w:nsid w:val="46FE4BE6"/>
+    <w:multiLevelType w:val="multilevel"/>
+    <w:tmpl w:val="ED36E79C"/>
+    <w:lvl w:ilvl="0">
+      <w:start w:val="1"/>
+      <w:numFmt w:val="decimal"/>
+      <w:lvlText w:val="%1."/>
+      <w:lvlJc w:val="left"/>
+      <w:pPr>
+        <w:ind w:left="360" w:hanging="360"/>
+      </w:pPr>
+      <w:rPr>
+        <w:color w:val="auto"/>
+      </w:rPr>
+    </w:lvl>
+    <w:lvl w:ilvl="1">
+      <w:start w:val="1"/>
+      <w:numFmt w:val="decimal"/>
+      <w:lvlText w:val="%1.%2."/>
+      <w:lvlJc w:val="left"/>
+      <w:pPr>
+        <w:ind w:left="792" w:hanging="432"/>
+      </w:pPr>
+    </w:lvl>
+    <w:lvl w:ilvl="2">
+      <w:start w:val="1"/>
+      <w:numFmt w:val="decimal"/>
+      <w:lvlText w:val="%1.%2.%3."/>
+      <w:lvlJc w:val="left"/>
+      <w:pPr>
+        <w:ind w:left="1224" w:hanging="504"/>
+      </w:pPr>
+    </w:lvl>
+    <w:lvl w:ilvl="3">
+      <w:start w:val="1"/>
+      <w:numFmt w:val="decimal"/>
+      <w:lvlText w:val="%1.%2.%3.%4."/>
+      <w:lvlJc w:val="left"/>
+      <w:pPr>
+        <w:ind w:left="1728" w:hanging="648"/>
+      </w:pPr>
+    </w:lvl>
+    <w:lvl w:ilvl="4">
+      <w:start w:val="1"/>
+      <w:numFmt w:val="decimal"/>
+      <w:lvlText w:val="%1.%2.%3.%4.%5."/>
+      <w:lvlJc w:val="left"/>
+      <w:pPr>
+        <w:ind w:left="2232" w:hanging="792"/>
+      </w:pPr>
+    </w:lvl>
+    <w:lvl w:ilvl="5">
+      <w:start w:val="1"/>
+      <w:numFmt w:val="decimal"/>
+      <w:lvlText w:val="%1.%2.%3.%4.%5.%6."/>
+      <w:lvlJc w:val="left"/>
+      <w:pPr>
+        <w:ind w:left="2736" w:hanging="936"/>
+      </w:pPr>
+    </w:lvl>
+    <w:lvl w:ilvl="6">
+      <w:start w:val="1"/>
+      <w:numFmt w:val="decimal"/>
+      <w:lvlText w:val="%1.%2.%3.%4.%5.%6.%7."/>
+      <w:lvlJc w:val="left"/>
+      <w:pPr>
+        <w:ind w:left="3240" w:hanging="1080"/>
+      </w:pPr>
+    </w:lvl>
+    <w:lvl w:ilvl="7">
+      <w:start w:val="1"/>
+      <w:numFmt w:val="decimal"/>
+      <w:lvlText w:val="%1.%2.%3.%4.%5.%6.%7.%8."/>
+      <w:lvlJc w:val="left"/>
+      <w:pPr>
+        <w:ind w:left="3744" w:hanging="1224"/>
+      </w:pPr>
+    </w:lvl>
+    <w:lvl w:ilvl="8">
+      <w:start w:val="1"/>
+      <w:numFmt w:val="decimal"/>
+      <w:lvlText w:val="%1.%2.%3.%4.%5.%6.%7.%8.%9."/>
+      <w:lvlJc w:val="left"/>
+      <w:pPr>
+        <w:ind w:left="4320" w:hanging="1440"/>
+      </w:pPr>
+    </w:lvl>
+  </w:abstractNum>
+  <w:num w:numId="1" w16cid:durableId="1619221041">
+    <w:abstractNumId w:val="0"/>
+  </w:num>
+</w:numbering>
 </file>
 
 <file path=word/styles.xml><?xml version="1.0" encoding="utf-8"?>
@@ -4016,4 +7222,16 @@
     </a:ext>
   </a:extLst>
 </a:theme>
+</file>
+
+<file path=customXml/item1.xml><?xml version="1.0" encoding="utf-8"?>
+<b:Sources xmlns:b="http://schemas.openxmlformats.org/officeDocument/2006/bibliography" xmlns="http://schemas.openxmlformats.org/officeDocument/2006/bibliography" SelectedStyle="/APASixthEditionOfficeOnline.xsl" StyleName="APA" Version="6"/>
+</file>
+
+<file path=customXml/itemProps1.xml><?xml version="1.0" encoding="utf-8"?>
+<ds:datastoreItem xmlns:ds="http://schemas.openxmlformats.org/officeDocument/2006/customXml" ds:itemID="{D90ABC72-1F03-0D4E-8E63-A7AFAA7D2717}">
+  <ds:schemaRefs>
+    <ds:schemaRef ds:uri="http://schemas.openxmlformats.org/officeDocument/2006/bibliography"/>
+  </ds:schemaRefs>
+</ds:datastoreItem>
 </file>
</xml_diff>

<commit_message>
Add final presentation, inference flowchart script, and paper updates
Co-Authored-By: Claude Sonnet 4.6 <noreply@anthropic.com>
</commit_message>
<xml_diff>
--- a/Ed_Tech_Project_Paper_bjagadish3.docx
+++ b/Ed_Tech_Project_Paper_bjagadish3.docx
@@ -2268,39 +2268,7 @@
           <w14:numSpacing w14:val="tabular"/>
         </w:rPr>
         <w:lastRenderedPageBreak/>
-        <w:t>5</w:t>
-      </w:r>
-      <w:r>
-        <w:rPr>
-          <w:rFonts w:ascii="Palatino Linotype" w:hAnsi="Palatino Linotype" w:cs="Times New Roman (Headings CS)"/>
-          <w:b/>
-          <w:caps/>
-          <w:color w:val="auto"/>
-          <w:spacing w:val="13"/>
-          <w:kern w:val="16"/>
-          <w:sz w:val="22"/>
-          <w:szCs w:val="48"/>
-          <w:lang w:eastAsia="en-US"/>
-          <w14:numForm w14:val="lining"/>
-          <w14:numSpacing w14:val="tabular"/>
-        </w:rPr>
-        <w:t xml:space="preserve"> </w:t>
-      </w:r>
-      <w:r>
-        <w:rPr>
-          <w:rFonts w:ascii="Palatino Linotype" w:hAnsi="Palatino Linotype" w:cs="Times New Roman (Headings CS)"/>
-          <w:b/>
-          <w:caps/>
-          <w:color w:val="auto"/>
-          <w:spacing w:val="13"/>
-          <w:kern w:val="16"/>
-          <w:sz w:val="22"/>
-          <w:szCs w:val="48"/>
-          <w:lang w:eastAsia="en-US"/>
-          <w14:numForm w14:val="lining"/>
-          <w14:numSpacing w14:val="tabular"/>
-        </w:rPr>
-        <w:t>RESULTS</w:t>
+        <w:t>5 RESULTS</w:t>
       </w:r>
     </w:p>
     <w:p>
@@ -2338,37 +2306,7 @@
           <w14:numForm w14:val="oldStyle"/>
           <w14:numSpacing w14:val="proportional"/>
         </w:rPr>
-        <w:t>5</w:t>
-      </w:r>
-      <w:r>
-        <w:rPr>
-          <w:rFonts w:ascii="Palatino Linotype" w:hAnsi="Palatino Linotype" w:cs="Times New Roman (Headings CS)"/>
-          <w:b/>
-          <w:color w:val="000000"/>
-          <w:spacing w:val="2"/>
-          <w:kern w:val="16"/>
-          <w:sz w:val="22"/>
-          <w:szCs w:val="22"/>
-          <w:lang w:eastAsia="en-US"/>
-          <w14:numForm w14:val="oldStyle"/>
-          <w14:numSpacing w14:val="proportional"/>
-        </w:rPr>
-        <w:t xml:space="preserve">.1 </w:t>
-      </w:r>
-      <w:r>
-        <w:rPr>
-          <w:rFonts w:ascii="Palatino Linotype" w:hAnsi="Palatino Linotype" w:cs="Times New Roman (Headings CS)"/>
-          <w:b/>
-          <w:color w:val="000000"/>
-          <w:spacing w:val="2"/>
-          <w:kern w:val="16"/>
-          <w:sz w:val="22"/>
-          <w:szCs w:val="22"/>
-          <w:lang w:eastAsia="en-US"/>
-          <w14:numForm w14:val="oldStyle"/>
-          <w14:numSpacing w14:val="proportional"/>
-        </w:rPr>
-        <w:t>Perception Test: Pre/Post Accuracy</w:t>
+        <w:t>5.1 Perception Test: Pre/Post Accuracy</w:t>
       </w:r>
     </w:p>
     <w:p>
@@ -2505,52 +2443,7 @@
           <w14:numForm w14:val="oldStyle"/>
           <w14:numSpacing w14:val="proportional"/>
         </w:rPr>
-        <w:t>5.</w:t>
-      </w:r>
-      <w:r>
-        <w:rPr>
-          <w:rFonts w:ascii="Palatino Linotype" w:hAnsi="Palatino Linotype" w:cs="Times New Roman (Headings CS)"/>
-          <w:b/>
-          <w:color w:val="000000"/>
-          <w:spacing w:val="2"/>
-          <w:kern w:val="16"/>
-          <w:sz w:val="22"/>
-          <w:szCs w:val="22"/>
-          <w:lang w:eastAsia="en-US"/>
-          <w14:numForm w14:val="oldStyle"/>
-          <w14:numSpacing w14:val="proportional"/>
-        </w:rPr>
-        <w:t>2</w:t>
-      </w:r>
-      <w:r>
-        <w:rPr>
-          <w:rFonts w:ascii="Palatino Linotype" w:hAnsi="Palatino Linotype" w:cs="Times New Roman (Headings CS)"/>
-          <w:b/>
-          <w:color w:val="000000"/>
-          <w:spacing w:val="2"/>
-          <w:kern w:val="16"/>
-          <w:sz w:val="22"/>
-          <w:szCs w:val="22"/>
-          <w:lang w:eastAsia="en-US"/>
-          <w14:numForm w14:val="oldStyle"/>
-          <w14:numSpacing w14:val="proportional"/>
-        </w:rPr>
-        <w:t xml:space="preserve"> Pe</w:t>
-      </w:r>
-      <w:r>
-        <w:rPr>
-          <w:rFonts w:ascii="Palatino Linotype" w:hAnsi="Palatino Linotype" w:cs="Times New Roman (Headings CS)"/>
-          <w:b/>
-          <w:color w:val="000000"/>
-          <w:spacing w:val="2"/>
-          <w:kern w:val="16"/>
-          <w:sz w:val="22"/>
-          <w:szCs w:val="22"/>
-          <w:lang w:eastAsia="en-US"/>
-          <w14:numForm w14:val="oldStyle"/>
-          <w14:numSpacing w14:val="proportional"/>
-        </w:rPr>
-        <w:t>r-Tone Accuracy</w:t>
+        <w:t>5.2 Per-Tone Accuracy</w:t>
       </w:r>
     </w:p>
     <w:p>
@@ -2700,52 +2593,7 @@
           <w14:numForm w14:val="oldStyle"/>
           <w14:numSpacing w14:val="proportional"/>
         </w:rPr>
-        <w:t>5.</w:t>
-      </w:r>
-      <w:r>
-        <w:rPr>
-          <w:rFonts w:ascii="Palatino Linotype" w:hAnsi="Palatino Linotype" w:cs="Times New Roman (Headings CS)"/>
-          <w:b/>
-          <w:color w:val="000000"/>
-          <w:spacing w:val="2"/>
-          <w:kern w:val="16"/>
-          <w:sz w:val="22"/>
-          <w:szCs w:val="22"/>
-          <w:lang w:eastAsia="en-US"/>
-          <w14:numForm w14:val="oldStyle"/>
-          <w14:numSpacing w14:val="proportional"/>
-        </w:rPr>
-        <w:t>3</w:t>
-      </w:r>
-      <w:r>
-        <w:rPr>
-          <w:rFonts w:ascii="Palatino Linotype" w:hAnsi="Palatino Linotype" w:cs="Times New Roman (Headings CS)"/>
-          <w:b/>
-          <w:color w:val="000000"/>
-          <w:spacing w:val="2"/>
-          <w:kern w:val="16"/>
-          <w:sz w:val="22"/>
-          <w:szCs w:val="22"/>
-          <w:lang w:eastAsia="en-US"/>
-          <w14:numForm w14:val="oldStyle"/>
-          <w14:numSpacing w14:val="proportional"/>
-        </w:rPr>
-        <w:t xml:space="preserve"> </w:t>
-      </w:r>
-      <w:r>
-        <w:rPr>
-          <w:rFonts w:ascii="Palatino Linotype" w:hAnsi="Palatino Linotype" w:cs="Times New Roman (Headings CS)"/>
-          <w:b/>
-          <w:color w:val="000000"/>
-          <w:spacing w:val="2"/>
-          <w:kern w:val="16"/>
-          <w:sz w:val="22"/>
-          <w:szCs w:val="22"/>
-          <w:lang w:eastAsia="en-US"/>
-          <w14:numForm w14:val="oldStyle"/>
-          <w14:numSpacing w14:val="proportional"/>
-        </w:rPr>
-        <w:t>App Usability Survey</w:t>
+        <w:t>5.3 App Usability Survey</w:t>
       </w:r>
     </w:p>
     <w:p>
@@ -2914,23 +2762,7 @@
           <w14:numForm w14:val="lining"/>
           <w14:numSpacing w14:val="tabular"/>
         </w:rPr>
-        <w:t>6</w:t>
-      </w:r>
-      <w:r>
-        <w:rPr>
-          <w:rFonts w:ascii="Palatino Linotype" w:hAnsi="Palatino Linotype" w:cs="Times New Roman (Headings CS)"/>
-          <w:b/>
-          <w:caps/>
-          <w:color w:val="auto"/>
-          <w:spacing w:val="13"/>
-          <w:kern w:val="16"/>
-          <w:sz w:val="22"/>
-          <w:szCs w:val="48"/>
-          <w:lang w:eastAsia="en-US"/>
-          <w14:numForm w14:val="lining"/>
-          <w14:numSpacing w14:val="tabular"/>
-        </w:rPr>
-        <w:t xml:space="preserve"> </w:t>
+        <w:t xml:space="preserve">6 </w:t>
       </w:r>
       <w:proofErr w:type="gramStart"/>
       <w:r>
@@ -2986,78 +2818,35 @@
           <w14:numForm w14:val="oldStyle"/>
           <w14:numSpacing w14:val="proportional"/>
         </w:rPr>
-        <w:t>6</w:t>
-      </w:r>
-      <w:r>
-        <w:rPr>
-          <w:rFonts w:ascii="Palatino Linotype" w:hAnsi="Palatino Linotype" w:cs="Times New Roman (Headings CS)"/>
-          <w:b/>
-          <w:color w:val="000000"/>
-          <w:spacing w:val="2"/>
-          <w:kern w:val="16"/>
-          <w:sz w:val="22"/>
-          <w:szCs w:val="22"/>
-          <w:lang w:eastAsia="en-US"/>
-          <w14:numForm w14:val="oldStyle"/>
-          <w14:numSpacing w14:val="proportional"/>
-        </w:rPr>
-        <w:t xml:space="preserve">.1 </w:t>
-      </w:r>
-      <w:r>
-        <w:rPr>
-          <w:rFonts w:ascii="Palatino Linotype" w:hAnsi="Palatino Linotype" w:cs="Times New Roman (Headings CS)"/>
-          <w:b/>
-          <w:color w:val="000000"/>
-          <w:spacing w:val="2"/>
-          <w:kern w:val="16"/>
-          <w:sz w:val="22"/>
-          <w:szCs w:val="22"/>
-          <w:lang w:eastAsia="en-US"/>
-          <w14:numForm w14:val="oldStyle"/>
-          <w14:numSpacing w14:val="proportional"/>
-        </w:rPr>
-        <w:t>Interpretation of Perception Test Results</w:t>
-      </w:r>
-    </w:p>
-    <w:p>
-      <w:pPr>
-        <w:jc w:val="both"/>
-        <w:rPr>
-          <w:rFonts w:ascii="Palatino Linotype" w:eastAsia="Times New Roman" w:hAnsi="Palatino Linotype" w:cs="Times New Roman"/>
-          <w:spacing w:val="2"/>
-          <w:kern w:val="16"/>
-          <w:sz w:val="22"/>
-          <w:szCs w:val="22"/>
-          <w:lang w:eastAsia="en-US"/>
-          <w14:numForm w14:val="oldStyle"/>
-          <w14:numSpacing w14:val="proportional"/>
-        </w:rPr>
-      </w:pPr>
-      <w:r>
-        <w:rPr>
-          <w:rFonts w:ascii="Palatino Linotype" w:eastAsia="Times New Roman" w:hAnsi="Palatino Linotype" w:cs="Times New Roman"/>
-          <w:spacing w:val="2"/>
-          <w:kern w:val="16"/>
-          <w:sz w:val="22"/>
-          <w:szCs w:val="22"/>
-          <w:lang w:eastAsia="en-US"/>
-          <w14:numForm w14:val="oldStyle"/>
-          <w14:numSpacing w14:val="proportional"/>
-        </w:rPr>
-        <w:t xml:space="preserve">The </w:t>
-      </w:r>
-      <w:r>
-        <w:rPr>
-          <w:rFonts w:ascii="Palatino Linotype" w:eastAsia="Times New Roman" w:hAnsi="Palatino Linotype" w:cs="Times New Roman"/>
-          <w:spacing w:val="2"/>
-          <w:kern w:val="16"/>
-          <w:sz w:val="22"/>
-          <w:szCs w:val="22"/>
-          <w:lang w:eastAsia="en-US"/>
-          <w14:numForm w14:val="oldStyle"/>
-          <w14:numSpacing w14:val="proportional"/>
-        </w:rPr>
-        <w:t xml:space="preserve">10.3% improvement in mean tone perception accuracy is encouraging, though the absence of statistical significance (p = 0.087) prevents strong causal claims. The most likely explanation is insufficient power: with 13 paired participants, the study was underpowered to detect the moderate effect size suggested by the data, with an estimated 28 pairs needed for 80% power at </w:t>
+        <w:t>6.1 Interpretation of Perception Test Results</w:t>
+      </w:r>
+    </w:p>
+    <w:p>
+      <w:pPr>
+        <w:jc w:val="both"/>
+        <w:rPr>
+          <w:rFonts w:ascii="Palatino Linotype" w:eastAsia="Times New Roman" w:hAnsi="Palatino Linotype" w:cs="Times New Roman"/>
+          <w:spacing w:val="2"/>
+          <w:kern w:val="16"/>
+          <w:sz w:val="22"/>
+          <w:szCs w:val="22"/>
+          <w:lang w:eastAsia="en-US"/>
+          <w14:numForm w14:val="oldStyle"/>
+          <w14:numSpacing w14:val="proportional"/>
+        </w:rPr>
+      </w:pPr>
+      <w:r>
+        <w:rPr>
+          <w:rFonts w:ascii="Palatino Linotype" w:eastAsia="Times New Roman" w:hAnsi="Palatino Linotype" w:cs="Times New Roman"/>
+          <w:spacing w:val="2"/>
+          <w:kern w:val="16"/>
+          <w:sz w:val="22"/>
+          <w:szCs w:val="22"/>
+          <w:lang w:eastAsia="en-US"/>
+          <w14:numForm w14:val="oldStyle"/>
+          <w14:numSpacing w14:val="proportional"/>
+        </w:rPr>
+        <w:t xml:space="preserve">The 10.3% improvement in mean tone perception accuracy is encouraging, though the absence of statistical significance (p = 0.087) prevents strong causal claims. The most likely explanation is insufficient power: with 13 paired participants, the study was underpowered to detect the moderate effect size suggested by the data, with an estimated 28 pairs needed for 80% power at </w:t>
       </w:r>
       <w:r>
         <w:rPr>
@@ -3190,93 +2979,35 @@
           <w14:numForm w14:val="oldStyle"/>
           <w14:numSpacing w14:val="proportional"/>
         </w:rPr>
-        <w:t>6.</w:t>
-      </w:r>
-      <w:r>
-        <w:rPr>
-          <w:rFonts w:ascii="Palatino Linotype" w:hAnsi="Palatino Linotype" w:cs="Times New Roman (Headings CS)"/>
-          <w:b/>
-          <w:color w:val="000000"/>
-          <w:spacing w:val="2"/>
-          <w:kern w:val="16"/>
-          <w:sz w:val="22"/>
-          <w:szCs w:val="22"/>
-          <w:lang w:eastAsia="en-US"/>
-          <w14:numForm w14:val="oldStyle"/>
-          <w14:numSpacing w14:val="proportional"/>
-        </w:rPr>
-        <w:t>2</w:t>
-      </w:r>
-      <w:r>
-        <w:rPr>
-          <w:rFonts w:ascii="Palatino Linotype" w:hAnsi="Palatino Linotype" w:cs="Times New Roman (Headings CS)"/>
-          <w:b/>
-          <w:color w:val="000000"/>
-          <w:spacing w:val="2"/>
-          <w:kern w:val="16"/>
-          <w:sz w:val="22"/>
-          <w:szCs w:val="22"/>
-          <w:lang w:eastAsia="en-US"/>
-          <w14:numForm w14:val="oldStyle"/>
-          <w14:numSpacing w14:val="proportional"/>
-        </w:rPr>
-        <w:t xml:space="preserve"> Interpretation of </w:t>
-      </w:r>
-      <w:r>
-        <w:rPr>
-          <w:rFonts w:ascii="Palatino Linotype" w:hAnsi="Palatino Linotype" w:cs="Times New Roman (Headings CS)"/>
-          <w:b/>
-          <w:color w:val="000000"/>
-          <w:spacing w:val="2"/>
-          <w:kern w:val="16"/>
-          <w:sz w:val="22"/>
-          <w:szCs w:val="22"/>
-          <w:lang w:eastAsia="en-US"/>
-          <w14:numForm w14:val="oldStyle"/>
-          <w14:numSpacing w14:val="proportional"/>
-        </w:rPr>
-        <w:t>Usability Results</w:t>
-      </w:r>
-    </w:p>
-    <w:p>
-      <w:pPr>
-        <w:jc w:val="both"/>
-        <w:rPr>
-          <w:rFonts w:ascii="Palatino Linotype" w:eastAsia="Times New Roman" w:hAnsi="Palatino Linotype" w:cs="Times New Roman"/>
-          <w:spacing w:val="2"/>
-          <w:kern w:val="16"/>
-          <w:sz w:val="22"/>
-          <w:szCs w:val="22"/>
-          <w:lang w:eastAsia="en-US"/>
-          <w14:numForm w14:val="oldStyle"/>
-          <w14:numSpacing w14:val="proportional"/>
-        </w:rPr>
-      </w:pPr>
-      <w:r>
-        <w:rPr>
-          <w:rFonts w:ascii="Palatino Linotype" w:eastAsia="Times New Roman" w:hAnsi="Palatino Linotype" w:cs="Times New Roman"/>
-          <w:spacing w:val="2"/>
-          <w:kern w:val="16"/>
-          <w:sz w:val="22"/>
-          <w:szCs w:val="22"/>
-          <w:lang w:eastAsia="en-US"/>
-          <w14:numForm w14:val="oldStyle"/>
-          <w14:numSpacing w14:val="proportional"/>
-        </w:rPr>
-        <w:t>The</w:t>
-      </w:r>
-      <w:r>
-        <w:rPr>
-          <w:rFonts w:ascii="Palatino Linotype" w:eastAsia="Times New Roman" w:hAnsi="Palatino Linotype" w:cs="Times New Roman"/>
-          <w:spacing w:val="2"/>
-          <w:kern w:val="16"/>
-          <w:sz w:val="22"/>
-          <w:szCs w:val="22"/>
-          <w:lang w:eastAsia="en-US"/>
-          <w14:numForm w14:val="oldStyle"/>
-          <w14:numSpacing w14:val="proportional"/>
-        </w:rPr>
-        <w:t xml:space="preserve"> overall TAM mean of 3.96 out of 5 indicates that participants found the application both useful and accessible. The highest-rated items – willingness to recommend (4.19) and overall usefulness (4.12) – suggest the tool’s core value was recognized even after a brief session. The lower rating for whether the app helped participants better understand Mandarin tones (3.69) is unsurprising given the session’s brevity. The 3 native and heritage Mandarin speakers in the </w:t>
+        <w:t>6.2 Interpretation of Usability Results</w:t>
+      </w:r>
+    </w:p>
+    <w:p>
+      <w:pPr>
+        <w:jc w:val="both"/>
+        <w:rPr>
+          <w:rFonts w:ascii="Palatino Linotype" w:eastAsia="Times New Roman" w:hAnsi="Palatino Linotype" w:cs="Times New Roman"/>
+          <w:spacing w:val="2"/>
+          <w:kern w:val="16"/>
+          <w:sz w:val="22"/>
+          <w:szCs w:val="22"/>
+          <w:lang w:eastAsia="en-US"/>
+          <w14:numForm w14:val="oldStyle"/>
+          <w14:numSpacing w14:val="proportional"/>
+        </w:rPr>
+      </w:pPr>
+      <w:r>
+        <w:rPr>
+          <w:rFonts w:ascii="Palatino Linotype" w:eastAsia="Times New Roman" w:hAnsi="Palatino Linotype" w:cs="Times New Roman"/>
+          <w:spacing w:val="2"/>
+          <w:kern w:val="16"/>
+          <w:sz w:val="22"/>
+          <w:szCs w:val="22"/>
+          <w:lang w:eastAsia="en-US"/>
+          <w14:numForm w14:val="oldStyle"/>
+          <w14:numSpacing w14:val="proportional"/>
+        </w:rPr>
+        <w:t xml:space="preserve">The overall TAM mean of 3.96 out of 5 indicates that participants found the application both useful and accessible. The highest-rated items – willingness to recommend (4.19) and overall usefulness (4.12) – suggest the tool’s core value was recognized even after a brief session. The lower rating for whether the app helped participants better understand Mandarin tones (3.69) is unsurprising given the session’s brevity. The 3 native and heritage Mandarin speakers in the </w:t>
       </w:r>
       <w:r>
         <w:rPr>
@@ -3328,93 +3059,35 @@
           <w14:numForm w14:val="oldStyle"/>
           <w14:numSpacing w14:val="proportional"/>
         </w:rPr>
-        <w:t>6.</w:t>
-      </w:r>
-      <w:r>
-        <w:rPr>
-          <w:rFonts w:ascii="Palatino Linotype" w:hAnsi="Palatino Linotype" w:cs="Times New Roman (Headings CS)"/>
-          <w:b/>
-          <w:color w:val="000000"/>
-          <w:spacing w:val="2"/>
-          <w:kern w:val="16"/>
-          <w:sz w:val="22"/>
-          <w:szCs w:val="22"/>
-          <w:lang w:eastAsia="en-US"/>
-          <w14:numForm w14:val="oldStyle"/>
-          <w14:numSpacing w14:val="proportional"/>
-        </w:rPr>
-        <w:t>3</w:t>
-      </w:r>
-      <w:r>
-        <w:rPr>
-          <w:rFonts w:ascii="Palatino Linotype" w:hAnsi="Palatino Linotype" w:cs="Times New Roman (Headings CS)"/>
-          <w:b/>
-          <w:color w:val="000000"/>
-          <w:spacing w:val="2"/>
-          <w:kern w:val="16"/>
-          <w:sz w:val="22"/>
-          <w:szCs w:val="22"/>
-          <w:lang w:eastAsia="en-US"/>
-          <w14:numForm w14:val="oldStyle"/>
-          <w14:numSpacing w14:val="proportional"/>
-        </w:rPr>
-        <w:t xml:space="preserve"> </w:t>
-      </w:r>
-      <w:r>
-        <w:rPr>
-          <w:rFonts w:ascii="Palatino Linotype" w:hAnsi="Palatino Linotype" w:cs="Times New Roman (Headings CS)"/>
-          <w:b/>
-          <w:color w:val="000000"/>
-          <w:spacing w:val="2"/>
-          <w:kern w:val="16"/>
-          <w:sz w:val="22"/>
-          <w:szCs w:val="22"/>
-          <w:lang w:eastAsia="en-US"/>
-          <w14:numForm w14:val="oldStyle"/>
-          <w14:numSpacing w14:val="proportional"/>
-        </w:rPr>
-        <w:t>Limitations and Future Directions</w:t>
-      </w:r>
-    </w:p>
-    <w:p>
-      <w:pPr>
-        <w:jc w:val="both"/>
-        <w:rPr>
-          <w:rFonts w:ascii="Palatino Linotype" w:eastAsia="Times New Roman" w:hAnsi="Palatino Linotype" w:cs="Times New Roman"/>
-          <w:spacing w:val="2"/>
-          <w:kern w:val="16"/>
-          <w:sz w:val="22"/>
-          <w:szCs w:val="22"/>
-          <w:lang w:eastAsia="en-US"/>
-          <w14:numForm w14:val="oldStyle"/>
-          <w14:numSpacing w14:val="proportional"/>
-        </w:rPr>
-      </w:pPr>
-      <w:r>
-        <w:rPr>
-          <w:rFonts w:ascii="Palatino Linotype" w:eastAsia="Times New Roman" w:hAnsi="Palatino Linotype" w:cs="Times New Roman"/>
-          <w:spacing w:val="2"/>
-          <w:kern w:val="16"/>
-          <w:sz w:val="22"/>
-          <w:szCs w:val="22"/>
-          <w:lang w:eastAsia="en-US"/>
-          <w14:numForm w14:val="oldStyle"/>
-          <w14:numSpacing w14:val="proportional"/>
-        </w:rPr>
-        <w:t xml:space="preserve">The </w:t>
-      </w:r>
-      <w:r>
-        <w:rPr>
-          <w:rFonts w:ascii="Palatino Linotype" w:eastAsia="Times New Roman" w:hAnsi="Palatino Linotype" w:cs="Times New Roman"/>
-          <w:spacing w:val="2"/>
-          <w:kern w:val="16"/>
-          <w:sz w:val="22"/>
-          <w:szCs w:val="22"/>
-          <w:lang w:eastAsia="en-US"/>
-          <w14:numForm w14:val="oldStyle"/>
-          <w14:numSpacing w14:val="proportional"/>
-        </w:rPr>
-        <w:t>study used a convenience sample with no control group, making it difficult to fully dissociate observed gains from test-retest learning effects or form difficulty differences. No delayed post-test was administered</w:t>
+        <w:t>6.3 Limitations and Future Directions</w:t>
+      </w:r>
+    </w:p>
+    <w:p>
+      <w:pPr>
+        <w:jc w:val="both"/>
+        <w:rPr>
+          <w:rFonts w:ascii="Palatino Linotype" w:eastAsia="Times New Roman" w:hAnsi="Palatino Linotype" w:cs="Times New Roman"/>
+          <w:spacing w:val="2"/>
+          <w:kern w:val="16"/>
+          <w:sz w:val="22"/>
+          <w:szCs w:val="22"/>
+          <w:lang w:eastAsia="en-US"/>
+          <w14:numForm w14:val="oldStyle"/>
+          <w14:numSpacing w14:val="proportional"/>
+        </w:rPr>
+      </w:pPr>
+      <w:r>
+        <w:rPr>
+          <w:rFonts w:ascii="Palatino Linotype" w:eastAsia="Times New Roman" w:hAnsi="Palatino Linotype" w:cs="Times New Roman"/>
+          <w:spacing w:val="2"/>
+          <w:kern w:val="16"/>
+          <w:sz w:val="22"/>
+          <w:szCs w:val="22"/>
+          <w:lang w:eastAsia="en-US"/>
+          <w14:numForm w14:val="oldStyle"/>
+          <w14:numSpacing w14:val="proportional"/>
+        </w:rPr>
+        <w:t>The study used a convenience sample with no control group, making it difficult to fully dissociate observed gains from test-retest learning effects or form difficulty differences. No delayed post-test was administered</w:t>
       </w:r>
       <w:r>
         <w:rPr>
@@ -3467,8 +3140,9 @@
           <w14:numForm w14:val="lining"/>
           <w14:numSpacing w14:val="tabular"/>
         </w:rPr>
-        <w:t>7</w:t>
-      </w:r>
+        <w:t xml:space="preserve">7 </w:t>
+      </w:r>
+      <w:proofErr w:type="gramStart"/>
       <w:r>
         <w:rPr>
           <w:rFonts w:ascii="Palatino Linotype" w:hAnsi="Palatino Linotype" w:cs="Times New Roman (Headings CS)"/>
@@ -3483,23 +3157,6 @@
           <w14:numForm w14:val="lining"/>
           <w14:numSpacing w14:val="tabular"/>
         </w:rPr>
-        <w:t xml:space="preserve"> </w:t>
-      </w:r>
-      <w:proofErr w:type="gramStart"/>
-      <w:r>
-        <w:rPr>
-          <w:rFonts w:ascii="Palatino Linotype" w:hAnsi="Palatino Linotype" w:cs="Times New Roman (Headings CS)"/>
-          <w:b/>
-          <w:caps/>
-          <w:color w:val="auto"/>
-          <w:spacing w:val="13"/>
-          <w:kern w:val="16"/>
-          <w:sz w:val="22"/>
-          <w:szCs w:val="48"/>
-          <w:lang w:eastAsia="en-US"/>
-          <w14:numForm w14:val="lining"/>
-          <w14:numSpacing w14:val="tabular"/>
-        </w:rPr>
         <w:t>CONCLUSION</w:t>
       </w:r>
       <w:proofErr w:type="gramEnd"/>
@@ -4158,18 +3815,7 @@
           <w:color w:val="auto"/>
         </w:rPr>
         <w:lastRenderedPageBreak/>
-        <w:t xml:space="preserve">7 </w:t>
-      </w:r>
-      <w:r>
-        <w:rPr>
-          <w:rFonts w:ascii="Palatino Linotype" w:hAnsi="Palatino Linotype"/>
-          <w:b/>
-          <w:bCs/>
-          <w:i w:val="0"/>
-          <w:iCs w:val="0"/>
-          <w:color w:val="auto"/>
-        </w:rPr>
-        <w:t>REFERENCES</w:t>
+        <w:t>7 REFERENCES</w:t>
       </w:r>
     </w:p>
     <w:p>
@@ -5527,10 +5173,135 @@
         <w:t xml:space="preserve"> [Doctoral thesis]. LOT Publications.</w:t>
       </w:r>
     </w:p>
+    <w:p>
+      <w:pPr>
+        <w:spacing w:before="240" w:after="240" w:line="276" w:lineRule="auto"/>
+        <w:jc w:val="both"/>
+        <w:rPr>
+          <w:rFonts w:ascii="Palatino Linotype" w:hAnsi="Palatino Linotype"/>
+          <w:b/>
+          <w:bCs/>
+        </w:rPr>
+      </w:pPr>
+      <w:r>
+        <w:rPr>
+          <w:rFonts w:ascii="Palatino Linotype" w:hAnsi="Palatino Linotype"/>
+          <w:b/>
+          <w:bCs/>
+        </w:rPr>
+        <w:t xml:space="preserve">7 </w:t>
+      </w:r>
+      <w:r>
+        <w:rPr>
+          <w:rFonts w:ascii="Palatino Linotype" w:hAnsi="Palatino Linotype"/>
+          <w:b/>
+          <w:bCs/>
+        </w:rPr>
+        <w:t>APPENDICES</w:t>
+      </w:r>
+    </w:p>
+    <w:p>
+      <w:pPr>
+        <w:spacing w:before="240" w:after="240" w:line="276" w:lineRule="auto"/>
+        <w:jc w:val="both"/>
+        <w:rPr>
+          <w:rFonts w:ascii="Palatino Linotype" w:hAnsi="Palatino Linotype"/>
+          <w:color w:val="1155CC"/>
+          <w:u w:val="single"/>
+        </w:rPr>
+      </w:pPr>
+      <w:r>
+        <w:rPr>
+          <w:rFonts w:ascii="Palatino Linotype" w:hAnsi="Palatino Linotype" w:cs="Times New Roman (Headings CS)"/>
+          <w:b/>
+          <w:color w:val="000000"/>
+          <w:spacing w:val="2"/>
+          <w:kern w:val="16"/>
+          <w:sz w:val="22"/>
+          <w:szCs w:val="22"/>
+          <w:lang w:eastAsia="en-US"/>
+          <w14:numForm w14:val="oldStyle"/>
+          <w14:numSpacing w14:val="proportional"/>
+        </w:rPr>
+        <w:t>7</w:t>
+      </w:r>
+      <w:r>
+        <w:rPr>
+          <w:rFonts w:ascii="Palatino Linotype" w:hAnsi="Palatino Linotype" w:cs="Times New Roman (Headings CS)"/>
+          <w:b/>
+          <w:color w:val="000000"/>
+          <w:spacing w:val="2"/>
+          <w:kern w:val="16"/>
+          <w:sz w:val="22"/>
+          <w:szCs w:val="22"/>
+          <w:lang w:eastAsia="en-US"/>
+          <w14:numForm w14:val="oldStyle"/>
+          <w14:numSpacing w14:val="proportional"/>
+        </w:rPr>
+        <w:t>.1 In</w:t>
+      </w:r>
+      <w:r>
+        <w:rPr>
+          <w:rFonts w:ascii="Palatino Linotype" w:hAnsi="Palatino Linotype" w:cs="Times New Roman (Headings CS)"/>
+          <w:b/>
+          <w:color w:val="000000"/>
+          <w:spacing w:val="2"/>
+          <w:kern w:val="16"/>
+          <w:sz w:val="22"/>
+          <w:szCs w:val="22"/>
+          <w:lang w:eastAsia="en-US"/>
+          <w14:numForm w14:val="oldStyle"/>
+          <w14:numSpacing w14:val="proportional"/>
+        </w:rPr>
+        <w:t>ference Pipeline Flowchart</w:t>
+      </w:r>
+    </w:p>
+    <w:p>
+      <w:pPr>
+        <w:jc w:val="center"/>
+      </w:pPr>
+      <w:r>
+        <w:drawing>
+          <wp:inline distT="0" distB="0" distL="0" distR="0" wp14:anchorId="03211AFF" wp14:editId="4B90E901">
+            <wp:extent cx="3987800" cy="5993224"/>
+            <wp:effectExtent l="0" t="0" r="0" b="1270"/>
+            <wp:docPr id="823943116" name="Picture 1"/>
+            <wp:cNvGraphicFramePr>
+              <a:graphicFrameLocks xmlns:a="http://schemas.openxmlformats.org/drawingml/2006/main" noChangeAspect="1"/>
+            </wp:cNvGraphicFramePr>
+            <a:graphic xmlns:a="http://schemas.openxmlformats.org/drawingml/2006/main">
+              <a:graphicData uri="http://schemas.openxmlformats.org/drawingml/2006/picture">
+                <pic:pic xmlns:pic="http://schemas.openxmlformats.org/drawingml/2006/picture">
+                  <pic:nvPicPr>
+                    <pic:cNvPr id="823943116" name=""/>
+                    <pic:cNvPicPr/>
+                  </pic:nvPicPr>
+                  <pic:blipFill>
+                    <a:blip r:embed="rId40"/>
+                    <a:stretch>
+                      <a:fillRect/>
+                    </a:stretch>
+                  </pic:blipFill>
+                  <pic:spPr>
+                    <a:xfrm>
+                      <a:off x="0" y="0"/>
+                      <a:ext cx="4003891" cy="6017406"/>
+                    </a:xfrm>
+                    <a:prstGeom prst="rect">
+                      <a:avLst/>
+                    </a:prstGeom>
+                  </pic:spPr>
+                </pic:pic>
+              </a:graphicData>
+            </a:graphic>
+          </wp:inline>
+        </w:drawing>
+      </w:r>
+    </w:p>
     <w:p/>
     <w:sectPr>
-      <w:footerReference w:type="even" r:id="rId40"/>
-      <w:footerReference w:type="default" r:id="rId41"/>
+      <w:footerReference w:type="even" r:id="rId41"/>
+      <w:footerReference w:type="default" r:id="rId42"/>
       <w:pgSz w:w="12240" w:h="15840"/>
       <w:pgMar w:top="1440" w:right="2160" w:bottom="2160" w:left="2160" w:header="720" w:footer="1498" w:gutter="0"/>
       <w:cols w:space="720"/>

</xml_diff>